<commit_message>
Instrukcja weryfikatorow: sekcje dla osob z niepelnosprawnoscia - A1_Brak zgody na prace 8h, w nocy (plan), w nocy (czas), na nadgodziny (opis, konfiguracja, komunikat, scenariusze)
Co-Authored-By: Claude Opus 5.5 <noreply@anthropic.com>
Claude-Session: https://claude.ai/code/session_018SWEtN1iMr88RMmUUHSCbE
</commit_message>
<xml_diff>
--- a/Weryfikatory czasu pracy/Instrukcja_Weryfikatory.docx
+++ b/Weryfikatory czasu pracy/Instrukcja_Weryfikatory.docx
@@ -8321,6 +8321,3949 @@
         </w:rPr>
       </w:pPr>
     </w:p>
+    <w:p>
+      <w:pPr>
+        <w:pStyle w:val="Nagwek1"/>
+        <w:jc w:val="center"/>
+        <w:rPr>
+          <w:rFonts w:ascii="Calibri" w:hAnsi="Calibri" w:cs="Calibri"/>
+        </w:rPr>
+      </w:pPr>
+      <w:bookmarkStart w:id="6" w:name="_Toc242432900"/>
+      <w:r>
+        <w:rPr>
+          <w:rFonts w:ascii="Calibri" w:hAnsi="Calibri" w:cs="Calibri"/>
+        </w:rPr>
+        <w:t xml:space="preserve">Weryfikator A1_Brak zgody na pracę 8h</w:t>
+      </w:r>
+      <w:bookmarkEnd w:id="6"/>
+    </w:p>
+    <w:p>
+      <w:pPr>
+        <w:rPr>
+          <w:rFonts w:ascii="Calibri" w:hAnsi="Calibri" w:cs="Calibri"/>
+        </w:rPr>
+      </w:pPr>
+    </w:p>
+    <w:p>
+      <w:pPr>
+        <w:jc w:val="both"/>
+        <w:rPr>
+          <w:rFonts w:ascii="Calibri" w:hAnsi="Calibri" w:cs="Calibri"/>
+        </w:rPr>
+      </w:pPr>
+      <w:r>
+        <w:rPr>
+          <w:rFonts w:ascii="Calibri" w:hAnsi="Calibri" w:cs="Calibri"/>
+        </w:rPr>
+        <w:t xml:space="preserve">Weryfikator pilnuje, aby pracownikowi z orzeczonym stopniem niepełnosprawności umiarkowanym lub znacznym, który nie ma na etacie zaznaczonego pola „Zgoda na pracę 8h”, nie zaplanowano więcej niż 7:00 pracy w dniu. Zapis planu z dłuższym dniem jest blokowany.</w:t>
+      </w:r>
+    </w:p>
+    <w:p>
+      <w:pPr>
+        <w:jc w:val="both"/>
+        <w:rPr>
+          <w:rFonts w:ascii="Calibri" w:hAnsi="Calibri" w:cs="Calibri"/>
+        </w:rPr>
+      </w:pPr>
+      <w:r>
+        <w:rPr>
+          <w:rFonts w:ascii="Calibri" w:hAnsi="Calibri" w:cs="Calibri"/>
+        </w:rPr>
+        <w:t xml:space="preserve">Stopień niepełnosprawności ustalany jest dla każdego dnia osobno – z orzeczenia o niepełnosprawności (PFRON) albo o niezdolności do pracy (ZUS) obowiązującego w tym dniu; gdy obowiązują oba, brany jest wyższy stopień. Zgoda czytana jest z etatu w zapisie historii obowiązującym w danym dniu. Pracownicy ze stopniem lekkim i bez orzeczenia nie są sprawdzani.</w:t>
+      </w:r>
+    </w:p>
+    <w:p>
+      <w:pPr>
+        <w:jc w:val="both"/>
+        <w:rPr>
+          <w:rFonts w:ascii="Calibri" w:hAnsi="Calibri" w:cs="Calibri"/>
+        </w:rPr>
+      </w:pPr>
+      <w:r>
+        <w:rPr>
+          <w:rFonts w:ascii="Calibri" w:hAnsi="Calibri" w:cs="Calibri"/>
+        </w:rPr>
+        <w:t xml:space="preserve">Pracownicy bez zgody na pracę 8h powinni mieć na etacie kalendarz z normą dobową 7:00 (kalendarze z dopiskiem _N, np. „Podstawowy system_1_8:15_N”). Wtedy weryfikator „A1_Norma w okresie rozliczeniowym” liczy normę okresu z 7 godzin na dzień, a „A1_Norma dobowa” pilnuje limitu 7:00. Na kalendarzu z normą 8:00 oba weryfikatory wykluczałyby się (norma okresu każe wydłużyć dzień do 8:00, ten weryfikator blokuje więcej niż 7:00).</w:t>
+      </w:r>
+    </w:p>
+    <w:p>
+      <w:pPr>
+        <w:rPr>
+          <w:rFonts w:ascii="Calibri" w:hAnsi="Calibri" w:cs="Calibri"/>
+        </w:rPr>
+      </w:pPr>
+    </w:p>
+    <w:p>
+      <w:pPr>
+        <w:jc w:val="both"/>
+        <w:rPr>
+          <w:rFonts w:ascii="Calibri" w:hAnsi="Calibri" w:cs="Calibri"/>
+        </w:rPr>
+      </w:pPr>
+      <w:r>
+        <w:rPr>
+          <w:rFonts w:ascii="Calibri" w:hAnsi="Calibri" w:cs="Calibri"/>
+        </w:rPr>
+        <w:t xml:space="preserve">Weryfikator uruchamia się w momencie zmian dokonywanych na:</w:t>
+      </w:r>
+    </w:p>
+    <w:p>
+      <w:pPr>
+        <w:jc w:val="both"/>
+        <w:rPr>
+          <w:rFonts w:ascii="Calibri" w:hAnsi="Calibri" w:cs="Calibri"/>
+        </w:rPr>
+      </w:pPr>
+      <w:r>
+        <w:rPr>
+          <w:rFonts w:ascii="Calibri" w:hAnsi="Calibri" w:cs="Calibri"/>
+        </w:rPr>
+        <w:t xml:space="preserve">- Kalendarz/Norma czasu pracy w wersji okienkowej</w:t>
+      </w:r>
+    </w:p>
+    <w:p>
+      <w:pPr>
+        <w:jc w:val="both"/>
+        <w:rPr>
+          <w:rFonts w:ascii="Calibri" w:hAnsi="Calibri" w:cs="Calibri"/>
+        </w:rPr>
+      </w:pPr>
+      <w:r>
+        <w:rPr>
+          <w:rFonts w:ascii="Calibri" w:hAnsi="Calibri" w:cs="Calibri"/>
+        </w:rPr>
+        <w:t xml:space="preserve">- Kalendarz/Norma czasu pracy w pulpicie Kierownika</w:t>
+      </w:r>
+    </w:p>
+    <w:p>
+      <w:pPr>
+        <w:jc w:val="both"/>
+        <w:rPr>
+          <w:rFonts w:ascii="Calibri" w:hAnsi="Calibri" w:cs="Calibri"/>
+        </w:rPr>
+      </w:pPr>
+      <w:r>
+        <w:rPr>
+          <w:rFonts w:ascii="Calibri" w:hAnsi="Calibri" w:cs="Calibri"/>
+        </w:rPr>
+        <w:t xml:space="preserve">- na Zestawieniu czasu pracy w pulpicie Kierownika</w:t>
+      </w:r>
+    </w:p>
+    <w:p>
+      <w:pPr>
+        <w:rPr>
+          <w:rFonts w:ascii="Calibri" w:hAnsi="Calibri" w:cs="Calibri"/>
+        </w:rPr>
+      </w:pPr>
+    </w:p>
+    <w:p>
+      <w:pPr>
+        <w:pStyle w:val="Akapitzlist"/>
+        <w:numPr>
+          <w:ilvl w:val="0"/>
+          <w:numId w:val="11"/>
+        </w:numPr>
+        <w:ind w:left="360"/>
+        <w:rPr>
+          <w:rFonts w:ascii="Calibri" w:hAnsi="Calibri" w:cs="Calibri"/>
+          <w:sz w:val="28"/>
+          <w:szCs w:val="28"/>
+        </w:rPr>
+      </w:pPr>
+      <w:r>
+        <w:rPr>
+          <w:rFonts w:ascii="Calibri" w:hAnsi="Calibri" w:cs="Calibri"/>
+          <w:sz w:val="28"/>
+          <w:szCs w:val="28"/>
+        </w:rPr>
+        <w:t xml:space="preserve">Konfiguracja</w:t>
+      </w:r>
+    </w:p>
+    <w:p>
+      <w:pPr>
+        <w:jc w:val="both"/>
+        <w:rPr>
+          <w:rFonts w:ascii="Calibri" w:hAnsi="Calibri" w:cs="Calibri"/>
+        </w:rPr>
+      </w:pPr>
+      <w:r>
+        <w:rPr>
+          <w:rFonts w:ascii="Calibri" w:hAnsi="Calibri" w:cs="Calibri"/>
+        </w:rPr>
+        <w:t xml:space="preserve">Algorytm weryfikatora zapisany jest w konfiguracji systemu Narzędzia/Opcje/Systemowe/Dodatkowy kod do kompilacji – plik o nazwie A1WeryfikatoryKalendarza. Wywołanie algorytmu odbywa się w Definicji weryfikatorów kalendarza „A1_Brak zgody na pracę 8h” (rodzaj: Dzień planu).</w:t>
+      </w:r>
+    </w:p>
+    <w:p>
+      <w:pPr>
+        <w:jc w:val="both"/>
+        <w:rPr>
+          <w:rFonts w:ascii="Calibri" w:hAnsi="Calibri" w:cs="Calibri"/>
+        </w:rPr>
+      </w:pPr>
+      <w:r>
+        <w:rPr>
+          <w:rFonts w:ascii="Calibri" w:hAnsi="Calibri" w:cs="Calibri"/>
+        </w:rPr>
+        <w:t xml:space="preserve">Weryfikator można włączyć na dowolnej definicji Kalendarza w zakładce Weryfikatory. Na bazie testowej podpięty jako Błąd do kalendarzy „3 miesięczny”, „Podstawowy system_1_8:16” oraz do kalendarzy klienta (w tym wersji z dopiskiem _N dla osób z niepełnosprawnością).</w:t>
+      </w:r>
+    </w:p>
+    <w:p>
+      <w:pPr>
+        <w:jc w:val="both"/>
+        <w:rPr>
+          <w:rFonts w:ascii="Calibri" w:hAnsi="Calibri" w:cs="Calibri"/>
+        </w:rPr>
+      </w:pPr>
+      <w:r>
+        <w:rPr>
+          <w:rFonts w:ascii="Calibri" w:hAnsi="Calibri" w:cs="Calibri"/>
+        </w:rPr>
+        <w:t xml:space="preserve">Komunikat:</w:t>
+      </w:r>
+    </w:p>
+    <w:p>
+      <w:pPr>
+        <w:jc w:val="both"/>
+        <w:rPr>
+          <w:rFonts w:ascii="Calibri" w:hAnsi="Calibri" w:cs="Calibri"/>
+        </w:rPr>
+      </w:pPr>
+      <w:r>
+        <w:rPr>
+          <w:rFonts w:ascii="Calibri" w:hAnsi="Calibri" w:cs="Calibri"/>
+        </w:rPr>
+        <w:t xml:space="preserve">Dla dnia (data) zaplanowano czas (plan), a pracownik bez zgody na pracę 8h (stopień niepełnosprawności (stopień)) może pracować maksymalnie 7:00 - (pracownik)</w:t>
+      </w:r>
+    </w:p>
+    <w:p>
+      <w:pPr>
+        <w:rPr>
+          <w:rFonts w:ascii="Calibri" w:hAnsi="Calibri" w:cs="Calibri"/>
+        </w:rPr>
+      </w:pPr>
+    </w:p>
+    <w:p>
+      <w:pPr>
+        <w:pStyle w:val="Akapitzlist"/>
+        <w:numPr>
+          <w:ilvl w:val="0"/>
+          <w:numId w:val="11"/>
+        </w:numPr>
+        <w:ind w:left="360"/>
+        <w:rPr>
+          <w:rFonts w:ascii="Calibri" w:hAnsi="Calibri" w:cs="Calibri"/>
+          <w:sz w:val="28"/>
+          <w:szCs w:val="28"/>
+        </w:rPr>
+      </w:pPr>
+      <w:r>
+        <w:rPr>
+          <w:rFonts w:ascii="Calibri" w:hAnsi="Calibri" w:cs="Calibri"/>
+          <w:sz w:val="28"/>
+          <w:szCs w:val="28"/>
+        </w:rPr>
+        <w:t xml:space="preserve">Scenariusze testowe</w:t>
+      </w:r>
+    </w:p>
+    <w:tbl>
+      <w:tblPr>
+        <w:tblStyle w:val="Tabela-Siatka"/>
+        <w:tblW w:w="9647" w:type="dxa"/>
+        <w:tblLook w:val="04A0" w:firstRow="1" w:lastRow="0" w:firstColumn="1" w:lastColumn="0" w:noHBand="0" w:noVBand="1"/>
+      </w:tblPr>
+      <w:tblGrid>
+        <w:gridCol w:w="561"/>
+        <w:gridCol w:w="3798"/>
+        <w:gridCol w:w="3527"/>
+        <w:gridCol w:w="1761"/>
+      </w:tblGrid>
+      <w:tr>
+        <w:tc>
+          <w:tcPr>
+            <w:tcW w:w="561" w:type="dxa"/>
+          </w:tcPr>
+          <w:p>
+            <w:pPr>
+              <w:rPr>
+                <w:rFonts w:ascii="Calibri" w:hAnsi="Calibri" w:cs="Calibri"/>
+              </w:rPr>
+            </w:pPr>
+            <w:proofErr w:type="spellStart"/>
+            <w:r>
+              <w:rPr>
+                <w:rFonts w:ascii="Calibri" w:hAnsi="Calibri" w:cs="Calibri"/>
+              </w:rPr>
+              <w:t>Lp</w:t>
+            </w:r>
+            <w:proofErr w:type="spellEnd"/>
+          </w:p>
+        </w:tc>
+        <w:tc>
+          <w:tcPr>
+            <w:tcW w:w="3798" w:type="dxa"/>
+          </w:tcPr>
+          <w:p>
+            <w:pPr>
+              <w:rPr>
+                <w:rFonts w:ascii="Calibri" w:hAnsi="Calibri" w:cs="Calibri"/>
+              </w:rPr>
+            </w:pPr>
+            <w:r>
+              <w:rPr>
+                <w:rFonts w:ascii="Calibri" w:hAnsi="Calibri" w:cs="Calibri"/>
+              </w:rPr>
+              <w:t>Scenariusz</w:t>
+            </w:r>
+          </w:p>
+        </w:tc>
+        <w:tc>
+          <w:tcPr>
+            <w:tcW w:w="3527" w:type="dxa"/>
+          </w:tcPr>
+          <w:p>
+            <w:pPr>
+              <w:rPr>
+                <w:rFonts w:ascii="Calibri" w:hAnsi="Calibri" w:cs="Calibri"/>
+              </w:rPr>
+            </w:pPr>
+            <w:r>
+              <w:rPr>
+                <w:rFonts w:ascii="Calibri" w:hAnsi="Calibri" w:cs="Calibri"/>
+              </w:rPr>
+              <w:t>Dane wejściowe</w:t>
+            </w:r>
+          </w:p>
+        </w:tc>
+        <w:tc>
+          <w:tcPr>
+            <w:tcW w:w="1761" w:type="dxa"/>
+          </w:tcPr>
+          <w:p>
+            <w:pPr>
+              <w:rPr>
+                <w:rFonts w:ascii="Calibri" w:hAnsi="Calibri" w:cs="Calibri"/>
+              </w:rPr>
+            </w:pPr>
+            <w:r>
+              <w:rPr>
+                <w:rFonts w:ascii="Calibri" w:hAnsi="Calibri" w:cs="Calibri"/>
+              </w:rPr>
+              <w:t>Oczekiwany wynik</w:t>
+            </w:r>
+          </w:p>
+        </w:tc>
+      </w:tr>
+      <w:tr>
+        <w:tc>
+          <w:tcPr>
+            <w:tcW w:w="561" w:type="dxa"/>
+          </w:tcPr>
+          <w:p>
+            <w:pPr>
+              <w:rPr>
+                <w:rFonts w:ascii="Calibri" w:hAnsi="Calibri" w:cs="Calibri"/>
+              </w:rPr>
+            </w:pPr>
+            <w:r>
+              <w:rPr>
+                <w:rFonts w:ascii="Calibri" w:hAnsi="Calibri" w:cs="Calibri"/>
+              </w:rPr>
+              <w:t xml:space="preserve">1</w:t>
+            </w:r>
+          </w:p>
+        </w:tc>
+        <w:tc>
+          <w:tcPr>
+            <w:tcW w:w="3798" w:type="dxa"/>
+          </w:tcPr>
+          <w:p>
+            <w:pPr>
+              <w:rPr>
+                <w:rFonts w:ascii="Calibri" w:hAnsi="Calibri" w:cs="Calibri"/>
+              </w:rPr>
+            </w:pPr>
+            <w:r>
+              <w:rPr>
+                <w:rFonts w:ascii="Calibri" w:hAnsi="Calibri" w:cs="Calibri"/>
+              </w:rPr>
+              <w:t xml:space="preserve">Umiarkowany, bez zgody, plan 8:00</w:t>
+            </w:r>
+          </w:p>
+        </w:tc>
+        <w:tc>
+          <w:tcPr>
+            <w:tcW w:w="3527" w:type="dxa"/>
+          </w:tcPr>
+          <w:p>
+            <w:pPr>
+              <w:rPr>
+                <w:rFonts w:ascii="Calibri" w:hAnsi="Calibri" w:cs="Calibri"/>
+              </w:rPr>
+            </w:pPr>
+            <w:r>
+              <w:rPr>
+                <w:rFonts w:ascii="Calibri" w:hAnsi="Calibri" w:cs="Calibri"/>
+              </w:rPr>
+              <w:t xml:space="preserve">Orzeczenie PFRON – umiarkowany; „Zgoda na pracę 8h” niezaznaczona.</w:t>
+            </w:r>
+          </w:p>
+          <w:p>
+            <w:pPr>
+              <w:rPr>
+                <w:rFonts w:ascii="Calibri" w:hAnsi="Calibri" w:cs="Calibri"/>
+              </w:rPr>
+            </w:pPr>
+            <w:r>
+              <w:rPr>
+                <w:rFonts w:ascii="Calibri" w:hAnsi="Calibri" w:cs="Calibri"/>
+              </w:rPr>
+              <w:t xml:space="preserve">Kalendarz: Podstawowy system_1_8:15_N (norma 7:00, pora nocna 22:00–6:00).</w:t>
+            </w:r>
+          </w:p>
+          <w:p>
+            <w:pPr>
+              <w:rPr>
+                <w:rFonts w:ascii="Calibri" w:hAnsi="Calibri" w:cs="Calibri"/>
+              </w:rPr>
+            </w:pPr>
+            <w:r>
+              <w:rPr>
+                <w:rFonts w:ascii="Calibri" w:hAnsi="Calibri" w:cs="Calibri"/>
+              </w:rPr>
+              <w:t xml:space="preserve">Plan 02.11.2026: 8:00</w:t>
+            </w:r>
+          </w:p>
+        </w:tc>
+        <w:tc>
+          <w:tcPr>
+            <w:tcW w:w="1761" w:type="dxa"/>
+          </w:tcPr>
+          <w:p>
+            <w:pPr>
+              <w:rPr>
+                <w:rFonts w:ascii="Calibri" w:hAnsi="Calibri" w:cs="Calibri"/>
+              </w:rPr>
+            </w:pPr>
+            <w:r>
+              <w:rPr>
+                <w:rFonts w:ascii="Calibri" w:hAnsi="Calibri" w:cs="Calibri"/>
+              </w:rPr>
+              <w:t xml:space="preserve">Błąd – zapis zablokowany</w:t>
+            </w:r>
+          </w:p>
+        </w:tc>
+      </w:tr>
+      <w:tr>
+        <w:tc>
+          <w:tcPr>
+            <w:tcW w:w="561" w:type="dxa"/>
+          </w:tcPr>
+          <w:p>
+            <w:pPr>
+              <w:rPr>
+                <w:rFonts w:ascii="Calibri" w:hAnsi="Calibri" w:cs="Calibri"/>
+              </w:rPr>
+            </w:pPr>
+            <w:r>
+              <w:rPr>
+                <w:rFonts w:ascii="Calibri" w:hAnsi="Calibri" w:cs="Calibri"/>
+              </w:rPr>
+              <w:t xml:space="preserve">2</w:t>
+            </w:r>
+          </w:p>
+        </w:tc>
+        <w:tc>
+          <w:tcPr>
+            <w:tcW w:w="3798" w:type="dxa"/>
+          </w:tcPr>
+          <w:p>
+            <w:pPr>
+              <w:rPr>
+                <w:rFonts w:ascii="Calibri" w:hAnsi="Calibri" w:cs="Calibri"/>
+              </w:rPr>
+            </w:pPr>
+            <w:r>
+              <w:rPr>
+                <w:rFonts w:ascii="Calibri" w:hAnsi="Calibri" w:cs="Calibri"/>
+              </w:rPr>
+              <w:t xml:space="preserve">Umiarkowany, bez zgody, plan 7:00</w:t>
+            </w:r>
+          </w:p>
+        </w:tc>
+        <w:tc>
+          <w:tcPr>
+            <w:tcW w:w="3527" w:type="dxa"/>
+          </w:tcPr>
+          <w:p>
+            <w:pPr>
+              <w:rPr>
+                <w:rFonts w:ascii="Calibri" w:hAnsi="Calibri" w:cs="Calibri"/>
+              </w:rPr>
+            </w:pPr>
+            <w:r>
+              <w:rPr>
+                <w:rFonts w:ascii="Calibri" w:hAnsi="Calibri" w:cs="Calibri"/>
+              </w:rPr>
+              <w:t xml:space="preserve">Jak w pkt 1.</w:t>
+            </w:r>
+          </w:p>
+          <w:p>
+            <w:pPr>
+              <w:rPr>
+                <w:rFonts w:ascii="Calibri" w:hAnsi="Calibri" w:cs="Calibri"/>
+              </w:rPr>
+            </w:pPr>
+            <w:r>
+              <w:rPr>
+                <w:rFonts w:ascii="Calibri" w:hAnsi="Calibri" w:cs="Calibri"/>
+              </w:rPr>
+              <w:t xml:space="preserve">Plan 02.11.2026: 7:00</w:t>
+            </w:r>
+          </w:p>
+        </w:tc>
+        <w:tc>
+          <w:tcPr>
+            <w:tcW w:w="1761" w:type="dxa"/>
+          </w:tcPr>
+          <w:p>
+            <w:pPr>
+              <w:rPr>
+                <w:rFonts w:ascii="Calibri" w:hAnsi="Calibri" w:cs="Calibri"/>
+              </w:rPr>
+            </w:pPr>
+            <w:r>
+              <w:rPr>
+                <w:rFonts w:ascii="Calibri" w:hAnsi="Calibri" w:cs="Calibri"/>
+              </w:rPr>
+              <w:t xml:space="preserve">Brak błędu (granica dozwolona)</w:t>
+            </w:r>
+          </w:p>
+        </w:tc>
+      </w:tr>
+      <w:tr>
+        <w:tc>
+          <w:tcPr>
+            <w:tcW w:w="561" w:type="dxa"/>
+          </w:tcPr>
+          <w:p>
+            <w:pPr>
+              <w:rPr>
+                <w:rFonts w:ascii="Calibri" w:hAnsi="Calibri" w:cs="Calibri"/>
+              </w:rPr>
+            </w:pPr>
+            <w:r>
+              <w:rPr>
+                <w:rFonts w:ascii="Calibri" w:hAnsi="Calibri" w:cs="Calibri"/>
+              </w:rPr>
+              <w:t xml:space="preserve">3</w:t>
+            </w:r>
+          </w:p>
+        </w:tc>
+        <w:tc>
+          <w:tcPr>
+            <w:tcW w:w="3798" w:type="dxa"/>
+          </w:tcPr>
+          <w:p>
+            <w:pPr>
+              <w:rPr>
+                <w:rFonts w:ascii="Calibri" w:hAnsi="Calibri" w:cs="Calibri"/>
+              </w:rPr>
+            </w:pPr>
+            <w:r>
+              <w:rPr>
+                <w:rFonts w:ascii="Calibri" w:hAnsi="Calibri" w:cs="Calibri"/>
+              </w:rPr>
+              <w:t xml:space="preserve">Znaczny, bez zgody, plan 7:30</w:t>
+            </w:r>
+          </w:p>
+        </w:tc>
+        <w:tc>
+          <w:tcPr>
+            <w:tcW w:w="3527" w:type="dxa"/>
+          </w:tcPr>
+          <w:p>
+            <w:pPr>
+              <w:rPr>
+                <w:rFonts w:ascii="Calibri" w:hAnsi="Calibri" w:cs="Calibri"/>
+              </w:rPr>
+            </w:pPr>
+            <w:r>
+              <w:rPr>
+                <w:rFonts w:ascii="Calibri" w:hAnsi="Calibri" w:cs="Calibri"/>
+              </w:rPr>
+              <w:t xml:space="preserve">Orzeczenie PFRON – znaczny; zgoda niezaznaczona.</w:t>
+            </w:r>
+          </w:p>
+          <w:p>
+            <w:pPr>
+              <w:rPr>
+                <w:rFonts w:ascii="Calibri" w:hAnsi="Calibri" w:cs="Calibri"/>
+              </w:rPr>
+            </w:pPr>
+            <w:r>
+              <w:rPr>
+                <w:rFonts w:ascii="Calibri" w:hAnsi="Calibri" w:cs="Calibri"/>
+              </w:rPr>
+              <w:t xml:space="preserve">Kalendarz: Podstawowy system_1_8:15_N (norma 7:00, pora nocna 22:00–6:00).</w:t>
+            </w:r>
+          </w:p>
+          <w:p>
+            <w:pPr>
+              <w:rPr>
+                <w:rFonts w:ascii="Calibri" w:hAnsi="Calibri" w:cs="Calibri"/>
+              </w:rPr>
+            </w:pPr>
+            <w:r>
+              <w:rPr>
+                <w:rFonts w:ascii="Calibri" w:hAnsi="Calibri" w:cs="Calibri"/>
+              </w:rPr>
+              <w:t xml:space="preserve">Plan 02.11.2026: 7:30</w:t>
+            </w:r>
+          </w:p>
+        </w:tc>
+        <w:tc>
+          <w:tcPr>
+            <w:tcW w:w="1761" w:type="dxa"/>
+          </w:tcPr>
+          <w:p>
+            <w:pPr>
+              <w:rPr>
+                <w:rFonts w:ascii="Calibri" w:hAnsi="Calibri" w:cs="Calibri"/>
+              </w:rPr>
+            </w:pPr>
+            <w:r>
+              <w:rPr>
+                <w:rFonts w:ascii="Calibri" w:hAnsi="Calibri" w:cs="Calibri"/>
+              </w:rPr>
+              <w:t xml:space="preserve">Błąd – zapis zablokowany</w:t>
+            </w:r>
+          </w:p>
+        </w:tc>
+      </w:tr>
+      <w:tr>
+        <w:tc>
+          <w:tcPr>
+            <w:tcW w:w="561" w:type="dxa"/>
+          </w:tcPr>
+          <w:p>
+            <w:pPr>
+              <w:rPr>
+                <w:rFonts w:ascii="Calibri" w:hAnsi="Calibri" w:cs="Calibri"/>
+              </w:rPr>
+            </w:pPr>
+            <w:r>
+              <w:rPr>
+                <w:rFonts w:ascii="Calibri" w:hAnsi="Calibri" w:cs="Calibri"/>
+              </w:rPr>
+              <w:t xml:space="preserve">4</w:t>
+            </w:r>
+          </w:p>
+        </w:tc>
+        <w:tc>
+          <w:tcPr>
+            <w:tcW w:w="3798" w:type="dxa"/>
+          </w:tcPr>
+          <w:p>
+            <w:pPr>
+              <w:rPr>
+                <w:rFonts w:ascii="Calibri" w:hAnsi="Calibri" w:cs="Calibri"/>
+              </w:rPr>
+            </w:pPr>
+            <w:r>
+              <w:rPr>
+                <w:rFonts w:ascii="Calibri" w:hAnsi="Calibri" w:cs="Calibri"/>
+              </w:rPr>
+              <w:t xml:space="preserve">Umiarkowany, ze zgodą na pracę 8h</w:t>
+            </w:r>
+          </w:p>
+        </w:tc>
+        <w:tc>
+          <w:tcPr>
+            <w:tcW w:w="3527" w:type="dxa"/>
+          </w:tcPr>
+          <w:p>
+            <w:pPr>
+              <w:rPr>
+                <w:rFonts w:ascii="Calibri" w:hAnsi="Calibri" w:cs="Calibri"/>
+              </w:rPr>
+            </w:pPr>
+            <w:r>
+              <w:rPr>
+                <w:rFonts w:ascii="Calibri" w:hAnsi="Calibri" w:cs="Calibri"/>
+              </w:rPr>
+              <w:t xml:space="preserve">Orzeczenie PFRON – umiarkowany; „Zgoda na pracę 8h” zaznaczona.</w:t>
+            </w:r>
+          </w:p>
+          <w:p>
+            <w:pPr>
+              <w:rPr>
+                <w:rFonts w:ascii="Calibri" w:hAnsi="Calibri" w:cs="Calibri"/>
+              </w:rPr>
+            </w:pPr>
+            <w:r>
+              <w:rPr>
+                <w:rFonts w:ascii="Calibri" w:hAnsi="Calibri" w:cs="Calibri"/>
+              </w:rPr>
+              <w:t xml:space="preserve">Kalendarz: Podstawowy system_1_8:16_N (norma 8:00, pora nocna 22:00–6:00).</w:t>
+            </w:r>
+          </w:p>
+          <w:p>
+            <w:pPr>
+              <w:rPr>
+                <w:rFonts w:ascii="Calibri" w:hAnsi="Calibri" w:cs="Calibri"/>
+              </w:rPr>
+            </w:pPr>
+            <w:r>
+              <w:rPr>
+                <w:rFonts w:ascii="Calibri" w:hAnsi="Calibri" w:cs="Calibri"/>
+              </w:rPr>
+              <w:t xml:space="preserve">Plan 02.11.2026: 8:00</w:t>
+            </w:r>
+          </w:p>
+        </w:tc>
+        <w:tc>
+          <w:tcPr>
+            <w:tcW w:w="1761" w:type="dxa"/>
+          </w:tcPr>
+          <w:p>
+            <w:pPr>
+              <w:rPr>
+                <w:rFonts w:ascii="Calibri" w:hAnsi="Calibri" w:cs="Calibri"/>
+              </w:rPr>
+            </w:pPr>
+            <w:r>
+              <w:rPr>
+                <w:rFonts w:ascii="Calibri" w:hAnsi="Calibri" w:cs="Calibri"/>
+              </w:rPr>
+              <w:t xml:space="preserve">Brak błędu</w:t>
+            </w:r>
+          </w:p>
+        </w:tc>
+      </w:tr>
+      <w:tr>
+        <w:tc>
+          <w:tcPr>
+            <w:tcW w:w="561" w:type="dxa"/>
+          </w:tcPr>
+          <w:p>
+            <w:pPr>
+              <w:rPr>
+                <w:rFonts w:ascii="Calibri" w:hAnsi="Calibri" w:cs="Calibri"/>
+              </w:rPr>
+            </w:pPr>
+            <w:r>
+              <w:rPr>
+                <w:rFonts w:ascii="Calibri" w:hAnsi="Calibri" w:cs="Calibri"/>
+              </w:rPr>
+              <w:t xml:space="preserve">5</w:t>
+            </w:r>
+          </w:p>
+        </w:tc>
+        <w:tc>
+          <w:tcPr>
+            <w:tcW w:w="3798" w:type="dxa"/>
+          </w:tcPr>
+          <w:p>
+            <w:pPr>
+              <w:rPr>
+                <w:rFonts w:ascii="Calibri" w:hAnsi="Calibri" w:cs="Calibri"/>
+              </w:rPr>
+            </w:pPr>
+            <w:r>
+              <w:rPr>
+                <w:rFonts w:ascii="Calibri" w:hAnsi="Calibri" w:cs="Calibri"/>
+              </w:rPr>
+              <w:t xml:space="preserve">Stopień lekki, bez zgody</w:t>
+            </w:r>
+          </w:p>
+        </w:tc>
+        <w:tc>
+          <w:tcPr>
+            <w:tcW w:w="3527" w:type="dxa"/>
+          </w:tcPr>
+          <w:p>
+            <w:pPr>
+              <w:rPr>
+                <w:rFonts w:ascii="Calibri" w:hAnsi="Calibri" w:cs="Calibri"/>
+              </w:rPr>
+            </w:pPr>
+            <w:r>
+              <w:rPr>
+                <w:rFonts w:ascii="Calibri" w:hAnsi="Calibri" w:cs="Calibri"/>
+              </w:rPr>
+              <w:t xml:space="preserve">Orzeczenie PFRON – lekki; zgoda niezaznaczona.</w:t>
+            </w:r>
+          </w:p>
+          <w:p>
+            <w:pPr>
+              <w:rPr>
+                <w:rFonts w:ascii="Calibri" w:hAnsi="Calibri" w:cs="Calibri"/>
+              </w:rPr>
+            </w:pPr>
+            <w:r>
+              <w:rPr>
+                <w:rFonts w:ascii="Calibri" w:hAnsi="Calibri" w:cs="Calibri"/>
+              </w:rPr>
+              <w:t xml:space="preserve">Kalendarz: Podstawowy system_1_8:16_N (norma 8:00, pora nocna 22:00–6:00).</w:t>
+            </w:r>
+          </w:p>
+          <w:p>
+            <w:pPr>
+              <w:rPr>
+                <w:rFonts w:ascii="Calibri" w:hAnsi="Calibri" w:cs="Calibri"/>
+              </w:rPr>
+            </w:pPr>
+            <w:r>
+              <w:rPr>
+                <w:rFonts w:ascii="Calibri" w:hAnsi="Calibri" w:cs="Calibri"/>
+              </w:rPr>
+              <w:t xml:space="preserve">Plan 02.11.2026: 8:00</w:t>
+            </w:r>
+          </w:p>
+        </w:tc>
+        <w:tc>
+          <w:tcPr>
+            <w:tcW w:w="1761" w:type="dxa"/>
+          </w:tcPr>
+          <w:p>
+            <w:pPr>
+              <w:rPr>
+                <w:rFonts w:ascii="Calibri" w:hAnsi="Calibri" w:cs="Calibri"/>
+              </w:rPr>
+            </w:pPr>
+            <w:r>
+              <w:rPr>
+                <w:rFonts w:ascii="Calibri" w:hAnsi="Calibri" w:cs="Calibri"/>
+              </w:rPr>
+              <w:t xml:space="preserve">Brak błędu – stopień lekki nie jest objęty limitem 7:00</w:t>
+            </w:r>
+          </w:p>
+        </w:tc>
+      </w:tr>
+      <w:tr>
+        <w:tc>
+          <w:tcPr>
+            <w:tcW w:w="561" w:type="dxa"/>
+          </w:tcPr>
+          <w:p>
+            <w:pPr>
+              <w:rPr>
+                <w:rFonts w:ascii="Calibri" w:hAnsi="Calibri" w:cs="Calibri"/>
+              </w:rPr>
+            </w:pPr>
+            <w:r>
+              <w:rPr>
+                <w:rFonts w:ascii="Calibri" w:hAnsi="Calibri" w:cs="Calibri"/>
+              </w:rPr>
+              <w:t xml:space="preserve">6</w:t>
+            </w:r>
+          </w:p>
+        </w:tc>
+        <w:tc>
+          <w:tcPr>
+            <w:tcW w:w="3798" w:type="dxa"/>
+          </w:tcPr>
+          <w:p>
+            <w:pPr>
+              <w:rPr>
+                <w:rFonts w:ascii="Calibri" w:hAnsi="Calibri" w:cs="Calibri"/>
+              </w:rPr>
+            </w:pPr>
+            <w:r>
+              <w:rPr>
+                <w:rFonts w:ascii="Calibri" w:hAnsi="Calibri" w:cs="Calibri"/>
+              </w:rPr>
+              <w:t xml:space="preserve">Bez orzeczenia</w:t>
+            </w:r>
+          </w:p>
+        </w:tc>
+        <w:tc>
+          <w:tcPr>
+            <w:tcW w:w="3527" w:type="dxa"/>
+          </w:tcPr>
+          <w:p>
+            <w:pPr>
+              <w:rPr>
+                <w:rFonts w:ascii="Calibri" w:hAnsi="Calibri" w:cs="Calibri"/>
+              </w:rPr>
+            </w:pPr>
+            <w:r>
+              <w:rPr>
+                <w:rFonts w:ascii="Calibri" w:hAnsi="Calibri" w:cs="Calibri"/>
+              </w:rPr>
+              <w:t xml:space="preserve">Brak orzeczeń; zgoda niezaznaczona.</w:t>
+            </w:r>
+          </w:p>
+          <w:p>
+            <w:pPr>
+              <w:rPr>
+                <w:rFonts w:ascii="Calibri" w:hAnsi="Calibri" w:cs="Calibri"/>
+              </w:rPr>
+            </w:pPr>
+            <w:r>
+              <w:rPr>
+                <w:rFonts w:ascii="Calibri" w:hAnsi="Calibri" w:cs="Calibri"/>
+              </w:rPr>
+              <w:t xml:space="preserve">Kalendarz: Podstawowy system_1_8:16_N (norma 8:00, pora nocna 22:00–6:00).</w:t>
+            </w:r>
+          </w:p>
+          <w:p>
+            <w:pPr>
+              <w:rPr>
+                <w:rFonts w:ascii="Calibri" w:hAnsi="Calibri" w:cs="Calibri"/>
+              </w:rPr>
+            </w:pPr>
+            <w:r>
+              <w:rPr>
+                <w:rFonts w:ascii="Calibri" w:hAnsi="Calibri" w:cs="Calibri"/>
+              </w:rPr>
+              <w:t xml:space="preserve">Plan 02.11.2026: 8:00</w:t>
+            </w:r>
+          </w:p>
+        </w:tc>
+        <w:tc>
+          <w:tcPr>
+            <w:tcW w:w="1761" w:type="dxa"/>
+          </w:tcPr>
+          <w:p>
+            <w:pPr>
+              <w:rPr>
+                <w:rFonts w:ascii="Calibri" w:hAnsi="Calibri" w:cs="Calibri"/>
+              </w:rPr>
+            </w:pPr>
+            <w:r>
+              <w:rPr>
+                <w:rFonts w:ascii="Calibri" w:hAnsi="Calibri" w:cs="Calibri"/>
+              </w:rPr>
+              <w:t xml:space="preserve">Brak błędu</w:t>
+            </w:r>
+          </w:p>
+        </w:tc>
+      </w:tr>
+      <w:tr>
+        <w:tc>
+          <w:tcPr>
+            <w:tcW w:w="561" w:type="dxa"/>
+          </w:tcPr>
+          <w:p>
+            <w:pPr>
+              <w:rPr>
+                <w:rFonts w:ascii="Calibri" w:hAnsi="Calibri" w:cs="Calibri"/>
+              </w:rPr>
+            </w:pPr>
+            <w:r>
+              <w:rPr>
+                <w:rFonts w:ascii="Calibri" w:hAnsi="Calibri" w:cs="Calibri"/>
+              </w:rPr>
+              <w:t xml:space="preserve">7</w:t>
+            </w:r>
+          </w:p>
+        </w:tc>
+        <w:tc>
+          <w:tcPr>
+            <w:tcW w:w="3798" w:type="dxa"/>
+          </w:tcPr>
+          <w:p>
+            <w:pPr>
+              <w:rPr>
+                <w:rFonts w:ascii="Calibri" w:hAnsi="Calibri" w:cs="Calibri"/>
+              </w:rPr>
+            </w:pPr>
+            <w:r>
+              <w:rPr>
+                <w:rFonts w:ascii="Calibri" w:hAnsi="Calibri" w:cs="Calibri"/>
+              </w:rPr>
+              <w:t xml:space="preserve">Orzeczenie ZUS zamiast PFRON</w:t>
+            </w:r>
+          </w:p>
+        </w:tc>
+        <w:tc>
+          <w:tcPr>
+            <w:tcW w:w="3527" w:type="dxa"/>
+          </w:tcPr>
+          <w:p>
+            <w:pPr>
+              <w:rPr>
+                <w:rFonts w:ascii="Calibri" w:hAnsi="Calibri" w:cs="Calibri"/>
+              </w:rPr>
+            </w:pPr>
+            <w:r>
+              <w:rPr>
+                <w:rFonts w:ascii="Calibri" w:hAnsi="Calibri" w:cs="Calibri"/>
+              </w:rPr>
+              <w:t xml:space="preserve">Orzeczenie ZUS – całkowita niezdolność do pracy (odpowiada stopniowi umiarkowanemu), brak orzeczenia PFRON; zgoda niezaznaczona.</w:t>
+            </w:r>
+          </w:p>
+          <w:p>
+            <w:pPr>
+              <w:rPr>
+                <w:rFonts w:ascii="Calibri" w:hAnsi="Calibri" w:cs="Calibri"/>
+              </w:rPr>
+            </w:pPr>
+            <w:r>
+              <w:rPr>
+                <w:rFonts w:ascii="Calibri" w:hAnsi="Calibri" w:cs="Calibri"/>
+              </w:rPr>
+              <w:t xml:space="preserve">Kalendarz: Podstawowy system_1_8:15_N (norma 7:00, pora nocna 22:00–6:00).</w:t>
+            </w:r>
+          </w:p>
+          <w:p>
+            <w:pPr>
+              <w:rPr>
+                <w:rFonts w:ascii="Calibri" w:hAnsi="Calibri" w:cs="Calibri"/>
+              </w:rPr>
+            </w:pPr>
+            <w:r>
+              <w:rPr>
+                <w:rFonts w:ascii="Calibri" w:hAnsi="Calibri" w:cs="Calibri"/>
+              </w:rPr>
+              <w:t xml:space="preserve">Plan 02.11.2026: 8:00</w:t>
+            </w:r>
+          </w:p>
+        </w:tc>
+        <w:tc>
+          <w:tcPr>
+            <w:tcW w:w="1761" w:type="dxa"/>
+          </w:tcPr>
+          <w:p>
+            <w:pPr>
+              <w:rPr>
+                <w:rFonts w:ascii="Calibri" w:hAnsi="Calibri" w:cs="Calibri"/>
+              </w:rPr>
+            </w:pPr>
+            <w:r>
+              <w:rPr>
+                <w:rFonts w:ascii="Calibri" w:hAnsi="Calibri" w:cs="Calibri"/>
+              </w:rPr>
+              <w:t xml:space="preserve">Błąd – stopień z orzeczenia ZUS też się liczy</w:t>
+            </w:r>
+          </w:p>
+        </w:tc>
+      </w:tr>
+      <w:tr>
+        <w:tc>
+          <w:tcPr>
+            <w:tcW w:w="561" w:type="dxa"/>
+          </w:tcPr>
+          <w:p>
+            <w:pPr>
+              <w:rPr>
+                <w:rFonts w:ascii="Calibri" w:hAnsi="Calibri" w:cs="Calibri"/>
+              </w:rPr>
+            </w:pPr>
+            <w:r>
+              <w:rPr>
+                <w:rFonts w:ascii="Calibri" w:hAnsi="Calibri" w:cs="Calibri"/>
+              </w:rPr>
+              <w:t xml:space="preserve">8</w:t>
+            </w:r>
+          </w:p>
+        </w:tc>
+        <w:tc>
+          <w:tcPr>
+            <w:tcW w:w="3798" w:type="dxa"/>
+          </w:tcPr>
+          <w:p>
+            <w:pPr>
+              <w:rPr>
+                <w:rFonts w:ascii="Calibri" w:hAnsi="Calibri" w:cs="Calibri"/>
+              </w:rPr>
+            </w:pPr>
+            <w:r>
+              <w:rPr>
+                <w:rFonts w:ascii="Calibri" w:hAnsi="Calibri" w:cs="Calibri"/>
+              </w:rPr>
+              <w:t xml:space="preserve">Zmiana stopnia w miesiącu – dzień przed zmianą</w:t>
+            </w:r>
+          </w:p>
+        </w:tc>
+        <w:tc>
+          <w:tcPr>
+            <w:tcW w:w="3527" w:type="dxa"/>
+          </w:tcPr>
+          <w:p>
+            <w:pPr>
+              <w:rPr>
+                <w:rFonts w:ascii="Calibri" w:hAnsi="Calibri" w:cs="Calibri"/>
+              </w:rPr>
+            </w:pPr>
+            <w:r>
+              <w:rPr>
+                <w:rFonts w:ascii="Calibri" w:hAnsi="Calibri" w:cs="Calibri"/>
+              </w:rPr>
+              <w:t xml:space="preserve">Orzeczenia PFRON: umiarkowany 01.01–15.11.2026, lekki 16.11–31.12.2026; zgoda niezaznaczona.</w:t>
+            </w:r>
+          </w:p>
+          <w:p>
+            <w:pPr>
+              <w:rPr>
+                <w:rFonts w:ascii="Calibri" w:hAnsi="Calibri" w:cs="Calibri"/>
+              </w:rPr>
+            </w:pPr>
+            <w:r>
+              <w:rPr>
+                <w:rFonts w:ascii="Calibri" w:hAnsi="Calibri" w:cs="Calibri"/>
+              </w:rPr>
+              <w:t xml:space="preserve">Plan 13.11.2026: 8:00</w:t>
+            </w:r>
+          </w:p>
+        </w:tc>
+        <w:tc>
+          <w:tcPr>
+            <w:tcW w:w="1761" w:type="dxa"/>
+          </w:tcPr>
+          <w:p>
+            <w:pPr>
+              <w:rPr>
+                <w:rFonts w:ascii="Calibri" w:hAnsi="Calibri" w:cs="Calibri"/>
+              </w:rPr>
+            </w:pPr>
+            <w:r>
+              <w:rPr>
+                <w:rFonts w:ascii="Calibri" w:hAnsi="Calibri" w:cs="Calibri"/>
+              </w:rPr>
+              <w:t xml:space="preserve">Błąd – 13.11 obowiązuje stopień umiarkowany</w:t>
+            </w:r>
+          </w:p>
+        </w:tc>
+      </w:tr>
+      <w:tr>
+        <w:tc>
+          <w:tcPr>
+            <w:tcW w:w="561" w:type="dxa"/>
+          </w:tcPr>
+          <w:p>
+            <w:pPr>
+              <w:rPr>
+                <w:rFonts w:ascii="Calibri" w:hAnsi="Calibri" w:cs="Calibri"/>
+              </w:rPr>
+            </w:pPr>
+            <w:r>
+              <w:rPr>
+                <w:rFonts w:ascii="Calibri" w:hAnsi="Calibri" w:cs="Calibri"/>
+              </w:rPr>
+              <w:t xml:space="preserve">9</w:t>
+            </w:r>
+          </w:p>
+        </w:tc>
+        <w:tc>
+          <w:tcPr>
+            <w:tcW w:w="3798" w:type="dxa"/>
+          </w:tcPr>
+          <w:p>
+            <w:pPr>
+              <w:rPr>
+                <w:rFonts w:ascii="Calibri" w:hAnsi="Calibri" w:cs="Calibri"/>
+              </w:rPr>
+            </w:pPr>
+            <w:r>
+              <w:rPr>
+                <w:rFonts w:ascii="Calibri" w:hAnsi="Calibri" w:cs="Calibri"/>
+              </w:rPr>
+              <w:t xml:space="preserve">Zmiana stopnia w miesiącu – dzień po zmianie</w:t>
+            </w:r>
+          </w:p>
+        </w:tc>
+        <w:tc>
+          <w:tcPr>
+            <w:tcW w:w="3527" w:type="dxa"/>
+          </w:tcPr>
+          <w:p>
+            <w:pPr>
+              <w:rPr>
+                <w:rFonts w:ascii="Calibri" w:hAnsi="Calibri" w:cs="Calibri"/>
+              </w:rPr>
+            </w:pPr>
+            <w:r>
+              <w:rPr>
+                <w:rFonts w:ascii="Calibri" w:hAnsi="Calibri" w:cs="Calibri"/>
+              </w:rPr>
+              <w:t xml:space="preserve">Jak w pkt 8.</w:t>
+            </w:r>
+          </w:p>
+          <w:p>
+            <w:pPr>
+              <w:rPr>
+                <w:rFonts w:ascii="Calibri" w:hAnsi="Calibri" w:cs="Calibri"/>
+              </w:rPr>
+            </w:pPr>
+            <w:r>
+              <w:rPr>
+                <w:rFonts w:ascii="Calibri" w:hAnsi="Calibri" w:cs="Calibri"/>
+              </w:rPr>
+              <w:t xml:space="preserve">Plan 16.11.2026: 8:00</w:t>
+            </w:r>
+          </w:p>
+        </w:tc>
+        <w:tc>
+          <w:tcPr>
+            <w:tcW w:w="1761" w:type="dxa"/>
+          </w:tcPr>
+          <w:p>
+            <w:pPr>
+              <w:rPr>
+                <w:rFonts w:ascii="Calibri" w:hAnsi="Calibri" w:cs="Calibri"/>
+              </w:rPr>
+            </w:pPr>
+            <w:r>
+              <w:rPr>
+                <w:rFonts w:ascii="Calibri" w:hAnsi="Calibri" w:cs="Calibri"/>
+              </w:rPr>
+              <w:t xml:space="preserve">Brak błędu tego weryfikatora – od 16.11 stopień lekki</w:t>
+            </w:r>
+          </w:p>
+        </w:tc>
+      </w:tr>
+      <w:tr>
+        <w:tc>
+          <w:tcPr>
+            <w:tcW w:w="561" w:type="dxa"/>
+          </w:tcPr>
+          <w:p>
+            <w:pPr>
+              <w:rPr>
+                <w:rFonts w:ascii="Calibri" w:hAnsi="Calibri" w:cs="Calibri"/>
+              </w:rPr>
+            </w:pPr>
+            <w:r>
+              <w:rPr>
+                <w:rFonts w:ascii="Calibri" w:hAnsi="Calibri" w:cs="Calibri"/>
+              </w:rPr>
+              <w:t xml:space="preserve">10</w:t>
+            </w:r>
+          </w:p>
+        </w:tc>
+        <w:tc>
+          <w:tcPr>
+            <w:tcW w:w="3798" w:type="dxa"/>
+          </w:tcPr>
+          <w:p>
+            <w:pPr>
+              <w:rPr>
+                <w:rFonts w:ascii="Calibri" w:hAnsi="Calibri" w:cs="Calibri"/>
+              </w:rPr>
+            </w:pPr>
+            <w:r>
+              <w:rPr>
+                <w:rFonts w:ascii="Calibri" w:hAnsi="Calibri" w:cs="Calibri"/>
+              </w:rPr>
+              <w:t xml:space="preserve">System równoważny</w:t>
+            </w:r>
+          </w:p>
+        </w:tc>
+        <w:tc>
+          <w:tcPr>
+            <w:tcW w:w="3527" w:type="dxa"/>
+          </w:tcPr>
+          <w:p>
+            <w:pPr>
+              <w:rPr>
+                <w:rFonts w:ascii="Calibri" w:hAnsi="Calibri" w:cs="Calibri"/>
+              </w:rPr>
+            </w:pPr>
+            <w:r>
+              <w:rPr>
+                <w:rFonts w:ascii="Calibri" w:hAnsi="Calibri" w:cs="Calibri"/>
+              </w:rPr>
+              <w:t xml:space="preserve">Orzeczenie PFRON – umiarkowany; zgoda niezaznaczona.</w:t>
+            </w:r>
+          </w:p>
+          <w:p>
+            <w:pPr>
+              <w:rPr>
+                <w:rFonts w:ascii="Calibri" w:hAnsi="Calibri" w:cs="Calibri"/>
+              </w:rPr>
+            </w:pPr>
+            <w:r>
+              <w:rPr>
+                <w:rFonts w:ascii="Calibri" w:hAnsi="Calibri" w:cs="Calibri"/>
+              </w:rPr>
+              <w:t xml:space="preserve">Kalendarz: Równoważny system_3_8:15_N.</w:t>
+            </w:r>
+          </w:p>
+          <w:p>
+            <w:pPr>
+              <w:rPr>
+                <w:rFonts w:ascii="Calibri" w:hAnsi="Calibri" w:cs="Calibri"/>
+              </w:rPr>
+            </w:pPr>
+            <w:r>
+              <w:rPr>
+                <w:rFonts w:ascii="Calibri" w:hAnsi="Calibri" w:cs="Calibri"/>
+              </w:rPr>
+              <w:t xml:space="preserve">Plan 02.11.2026: 8:00</w:t>
+            </w:r>
+          </w:p>
+        </w:tc>
+        <w:tc>
+          <w:tcPr>
+            <w:tcW w:w="1761" w:type="dxa"/>
+          </w:tcPr>
+          <w:p>
+            <w:pPr>
+              <w:rPr>
+                <w:rFonts w:ascii="Calibri" w:hAnsi="Calibri" w:cs="Calibri"/>
+              </w:rPr>
+            </w:pPr>
+            <w:r>
+              <w:rPr>
+                <w:rFonts w:ascii="Calibri" w:hAnsi="Calibri" w:cs="Calibri"/>
+              </w:rPr>
+              <w:t xml:space="preserve">Błąd – zapis zablokowany</w:t>
+            </w:r>
+          </w:p>
+        </w:tc>
+      </w:tr>
+    </w:tbl>
+    <w:p>
+      <w:pPr>
+        <w:rPr>
+          <w:rFonts w:ascii="Calibri" w:hAnsi="Calibri" w:cs="Calibri"/>
+        </w:rPr>
+      </w:pPr>
+    </w:p>
+    <w:p>
+      <w:pPr>
+        <w:rPr>
+          <w:rFonts w:ascii="Calibri" w:hAnsi="Calibri" w:cs="Calibri"/>
+        </w:rPr>
+      </w:pPr>
+    </w:p>
+    <w:p>
+      <w:pPr>
+        <w:pStyle w:val="Nagwek1"/>
+        <w:jc w:val="center"/>
+        <w:rPr>
+          <w:rFonts w:ascii="Calibri" w:hAnsi="Calibri" w:cs="Calibri"/>
+        </w:rPr>
+      </w:pPr>
+      <w:bookmarkStart w:id="7" w:name="_Toc242432901"/>
+      <w:r>
+        <w:rPr>
+          <w:rFonts w:ascii="Calibri" w:hAnsi="Calibri" w:cs="Calibri"/>
+        </w:rPr>
+        <w:t xml:space="preserve">Weryfikator A1_Brak zgody na pracę w nocy (plan)</w:t>
+      </w:r>
+      <w:bookmarkEnd w:id="7"/>
+    </w:p>
+    <w:p>
+      <w:pPr>
+        <w:rPr>
+          <w:rFonts w:ascii="Calibri" w:hAnsi="Calibri" w:cs="Calibri"/>
+        </w:rPr>
+      </w:pPr>
+    </w:p>
+    <w:p>
+      <w:pPr>
+        <w:jc w:val="both"/>
+        <w:rPr>
+          <w:rFonts w:ascii="Calibri" w:hAnsi="Calibri" w:cs="Calibri"/>
+        </w:rPr>
+      </w:pPr>
+      <w:r>
+        <w:rPr>
+          <w:rFonts w:ascii="Calibri" w:hAnsi="Calibri" w:cs="Calibri"/>
+        </w:rPr>
+        <w:t xml:space="preserve">Weryfikator pilnuje, aby pracownikowi z niepełnosprawnością, który nie ma na etacie zaznaczonego pola „Zgoda na pracę w porze nocnej”, nie zaplanowano pracy w porze nocnej. Zapis planu z pracą w porze nocnej jest blokowany.</w:t>
+      </w:r>
+    </w:p>
+    <w:p>
+      <w:pPr>
+        <w:jc w:val="both"/>
+        <w:rPr>
+          <w:rFonts w:ascii="Calibri" w:hAnsi="Calibri" w:cs="Calibri"/>
+        </w:rPr>
+      </w:pPr>
+      <w:r>
+        <w:rPr>
+          <w:rFonts w:ascii="Calibri" w:hAnsi="Calibri" w:cs="Calibri"/>
+        </w:rPr>
+        <w:t xml:space="preserve">Weryfikator dotyczy każdego stopnia niepełnosprawności (lekkiego, umiarkowanego i znacznego) – pole zgody jest dostępne na etacie przy każdym orzeczeniu. Stopień niepełnosprawności ustalany jest dla każdego dnia osobno – z orzeczenia o niepełnosprawności (PFRON) albo o niezdolności do pracy (ZUS) obowiązującego w tym dniu; gdy obowiązują oba, brany jest wyższy stopień. Zgoda czytana jest z etatu w zapisie historii obowiązującym w danym dniu.</w:t>
+      </w:r>
+    </w:p>
+    <w:p>
+      <w:pPr>
+        <w:jc w:val="both"/>
+        <w:rPr>
+          <w:rFonts w:ascii="Calibri" w:hAnsi="Calibri" w:cs="Calibri"/>
+        </w:rPr>
+      </w:pPr>
+      <w:r>
+        <w:rPr>
+          <w:rFonts w:ascii="Calibri" w:hAnsi="Calibri" w:cs="Calibri"/>
+        </w:rPr>
+        <w:t xml:space="preserve">Pora nocna pobierana jest z kalendarza etatu pracownika (ustawienia pory nocnej kalendarza, a gdy są standardowe – z konfiguracji). W kalendarzach klienta z dopiskiem _N jest to 22:00–6:00. Sprawdzane są strefy planu wliczane do czasu pracy oraz strefa „Praca w godzinach nocnych”. Zgłaszany jest każdy czas w porze nocnej, także częściowy – wieczorem po 22:00 i rano przed 6:00.</w:t>
+      </w:r>
+    </w:p>
+    <w:p>
+      <w:pPr>
+        <w:rPr>
+          <w:rFonts w:ascii="Calibri" w:hAnsi="Calibri" w:cs="Calibri"/>
+        </w:rPr>
+      </w:pPr>
+    </w:p>
+    <w:p>
+      <w:pPr>
+        <w:jc w:val="both"/>
+        <w:rPr>
+          <w:rFonts w:ascii="Calibri" w:hAnsi="Calibri" w:cs="Calibri"/>
+        </w:rPr>
+      </w:pPr>
+      <w:r>
+        <w:rPr>
+          <w:rFonts w:ascii="Calibri" w:hAnsi="Calibri" w:cs="Calibri"/>
+        </w:rPr>
+        <w:t xml:space="preserve">Weryfikator uruchamia się w momencie zmian dokonywanych na:</w:t>
+      </w:r>
+    </w:p>
+    <w:p>
+      <w:pPr>
+        <w:jc w:val="both"/>
+        <w:rPr>
+          <w:rFonts w:ascii="Calibri" w:hAnsi="Calibri" w:cs="Calibri"/>
+        </w:rPr>
+      </w:pPr>
+      <w:r>
+        <w:rPr>
+          <w:rFonts w:ascii="Calibri" w:hAnsi="Calibri" w:cs="Calibri"/>
+        </w:rPr>
+        <w:t xml:space="preserve">- Kalendarz/Norma czasu pracy w wersji okienkowej</w:t>
+      </w:r>
+    </w:p>
+    <w:p>
+      <w:pPr>
+        <w:jc w:val="both"/>
+        <w:rPr>
+          <w:rFonts w:ascii="Calibri" w:hAnsi="Calibri" w:cs="Calibri"/>
+        </w:rPr>
+      </w:pPr>
+      <w:r>
+        <w:rPr>
+          <w:rFonts w:ascii="Calibri" w:hAnsi="Calibri" w:cs="Calibri"/>
+        </w:rPr>
+        <w:t xml:space="preserve">- Kalendarz/Norma czasu pracy w pulpicie Kierownika</w:t>
+      </w:r>
+    </w:p>
+    <w:p>
+      <w:pPr>
+        <w:jc w:val="both"/>
+        <w:rPr>
+          <w:rFonts w:ascii="Calibri" w:hAnsi="Calibri" w:cs="Calibri"/>
+        </w:rPr>
+      </w:pPr>
+      <w:r>
+        <w:rPr>
+          <w:rFonts w:ascii="Calibri" w:hAnsi="Calibri" w:cs="Calibri"/>
+        </w:rPr>
+        <w:t xml:space="preserve">- na Zestawieniu czasu pracy w pulpicie Kierownika</w:t>
+      </w:r>
+    </w:p>
+    <w:p>
+      <w:pPr>
+        <w:rPr>
+          <w:rFonts w:ascii="Calibri" w:hAnsi="Calibri" w:cs="Calibri"/>
+        </w:rPr>
+      </w:pPr>
+    </w:p>
+    <w:p>
+      <w:pPr>
+        <w:pStyle w:val="Akapitzlist"/>
+        <w:numPr>
+          <w:ilvl w:val="0"/>
+          <w:numId w:val="12"/>
+        </w:numPr>
+        <w:ind w:left="360"/>
+        <w:rPr>
+          <w:rFonts w:ascii="Calibri" w:hAnsi="Calibri" w:cs="Calibri"/>
+          <w:sz w:val="28"/>
+          <w:szCs w:val="28"/>
+        </w:rPr>
+      </w:pPr>
+      <w:r>
+        <w:rPr>
+          <w:rFonts w:ascii="Calibri" w:hAnsi="Calibri" w:cs="Calibri"/>
+          <w:sz w:val="28"/>
+          <w:szCs w:val="28"/>
+        </w:rPr>
+        <w:t xml:space="preserve">Konfiguracja</w:t>
+      </w:r>
+    </w:p>
+    <w:p>
+      <w:pPr>
+        <w:jc w:val="both"/>
+        <w:rPr>
+          <w:rFonts w:ascii="Calibri" w:hAnsi="Calibri" w:cs="Calibri"/>
+        </w:rPr>
+      </w:pPr>
+      <w:r>
+        <w:rPr>
+          <w:rFonts w:ascii="Calibri" w:hAnsi="Calibri" w:cs="Calibri"/>
+        </w:rPr>
+        <w:t xml:space="preserve">Algorytm weryfikatora zapisany jest w konfiguracji systemu Narzędzia/Opcje/Systemowe/Dodatkowy kod do kompilacji – plik o nazwie A1WeryfikatoryKalendarza. Wywołanie algorytmu odbywa się w Definicji weryfikatorów kalendarza „A1_Brak zgody na pracę w nocy (plan)” (rodzaj: Dzień planu).</w:t>
+      </w:r>
+    </w:p>
+    <w:p>
+      <w:pPr>
+        <w:jc w:val="both"/>
+        <w:rPr>
+          <w:rFonts w:ascii="Calibri" w:hAnsi="Calibri" w:cs="Calibri"/>
+        </w:rPr>
+      </w:pPr>
+      <w:r>
+        <w:rPr>
+          <w:rFonts w:ascii="Calibri" w:hAnsi="Calibri" w:cs="Calibri"/>
+        </w:rPr>
+        <w:t xml:space="preserve">Weryfikator można włączyć na dowolnej definicji Kalendarza w zakładce Weryfikatory. Na bazie testowej podpięty jako Błąd do kalendarzy „3 miesięczny”, „Podstawowy system_1_8:16” oraz do kalendarzy klienta (w tym wersji z dopiskiem _N dla osób z niepełnosprawnością).</w:t>
+      </w:r>
+    </w:p>
+    <w:p>
+      <w:pPr>
+        <w:jc w:val="both"/>
+        <w:rPr>
+          <w:rFonts w:ascii="Calibri" w:hAnsi="Calibri" w:cs="Calibri"/>
+        </w:rPr>
+      </w:pPr>
+      <w:r>
+        <w:rPr>
+          <w:rFonts w:ascii="Calibri" w:hAnsi="Calibri" w:cs="Calibri"/>
+        </w:rPr>
+        <w:t xml:space="preserve">Komunikat:</w:t>
+      </w:r>
+    </w:p>
+    <w:p>
+      <w:pPr>
+        <w:jc w:val="both"/>
+        <w:rPr>
+          <w:rFonts w:ascii="Calibri" w:hAnsi="Calibri" w:cs="Calibri"/>
+        </w:rPr>
+      </w:pPr>
+      <w:r>
+        <w:rPr>
+          <w:rFonts w:ascii="Calibri" w:hAnsi="Calibri" w:cs="Calibri"/>
+        </w:rPr>
+        <w:t xml:space="preserve">Dla dnia (data) zaplanowano pracę w porze nocnej (czas w porze nocnej), a pracownik z niepełnosprawnością (stopień (stopień)) nie ma na etacie zgody na pracę w porze nocnej - (pracownik)</w:t>
+      </w:r>
+    </w:p>
+    <w:p>
+      <w:pPr>
+        <w:rPr>
+          <w:rFonts w:ascii="Calibri" w:hAnsi="Calibri" w:cs="Calibri"/>
+        </w:rPr>
+      </w:pPr>
+    </w:p>
+    <w:p>
+      <w:pPr>
+        <w:pStyle w:val="Akapitzlist"/>
+        <w:numPr>
+          <w:ilvl w:val="0"/>
+          <w:numId w:val="12"/>
+        </w:numPr>
+        <w:ind w:left="360"/>
+        <w:rPr>
+          <w:rFonts w:ascii="Calibri" w:hAnsi="Calibri" w:cs="Calibri"/>
+          <w:sz w:val="28"/>
+          <w:szCs w:val="28"/>
+        </w:rPr>
+      </w:pPr>
+      <w:r>
+        <w:rPr>
+          <w:rFonts w:ascii="Calibri" w:hAnsi="Calibri" w:cs="Calibri"/>
+          <w:sz w:val="28"/>
+          <w:szCs w:val="28"/>
+        </w:rPr>
+        <w:t xml:space="preserve">Scenariusze testowe</w:t>
+      </w:r>
+    </w:p>
+    <w:tbl>
+      <w:tblPr>
+        <w:tblStyle w:val="Tabela-Siatka"/>
+        <w:tblW w:w="9647" w:type="dxa"/>
+        <w:tblLook w:val="04A0" w:firstRow="1" w:lastRow="0" w:firstColumn="1" w:lastColumn="0" w:noHBand="0" w:noVBand="1"/>
+      </w:tblPr>
+      <w:tblGrid>
+        <w:gridCol w:w="561"/>
+        <w:gridCol w:w="3798"/>
+        <w:gridCol w:w="3527"/>
+        <w:gridCol w:w="1761"/>
+      </w:tblGrid>
+      <w:tr>
+        <w:tc>
+          <w:tcPr>
+            <w:tcW w:w="561" w:type="dxa"/>
+          </w:tcPr>
+          <w:p>
+            <w:pPr>
+              <w:rPr>
+                <w:rFonts w:ascii="Calibri" w:hAnsi="Calibri" w:cs="Calibri"/>
+              </w:rPr>
+            </w:pPr>
+            <w:proofErr w:type="spellStart"/>
+            <w:r>
+              <w:rPr>
+                <w:rFonts w:ascii="Calibri" w:hAnsi="Calibri" w:cs="Calibri"/>
+              </w:rPr>
+              <w:t>Lp</w:t>
+            </w:r>
+            <w:proofErr w:type="spellEnd"/>
+          </w:p>
+        </w:tc>
+        <w:tc>
+          <w:tcPr>
+            <w:tcW w:w="3798" w:type="dxa"/>
+          </w:tcPr>
+          <w:p>
+            <w:pPr>
+              <w:rPr>
+                <w:rFonts w:ascii="Calibri" w:hAnsi="Calibri" w:cs="Calibri"/>
+              </w:rPr>
+            </w:pPr>
+            <w:r>
+              <w:rPr>
+                <w:rFonts w:ascii="Calibri" w:hAnsi="Calibri" w:cs="Calibri"/>
+              </w:rPr>
+              <w:t>Scenariusz</w:t>
+            </w:r>
+          </w:p>
+        </w:tc>
+        <w:tc>
+          <w:tcPr>
+            <w:tcW w:w="3527" w:type="dxa"/>
+          </w:tcPr>
+          <w:p>
+            <w:pPr>
+              <w:rPr>
+                <w:rFonts w:ascii="Calibri" w:hAnsi="Calibri" w:cs="Calibri"/>
+              </w:rPr>
+            </w:pPr>
+            <w:r>
+              <w:rPr>
+                <w:rFonts w:ascii="Calibri" w:hAnsi="Calibri" w:cs="Calibri"/>
+              </w:rPr>
+              <w:t>Dane wejściowe</w:t>
+            </w:r>
+          </w:p>
+        </w:tc>
+        <w:tc>
+          <w:tcPr>
+            <w:tcW w:w="1761" w:type="dxa"/>
+          </w:tcPr>
+          <w:p>
+            <w:pPr>
+              <w:rPr>
+                <w:rFonts w:ascii="Calibri" w:hAnsi="Calibri" w:cs="Calibri"/>
+              </w:rPr>
+            </w:pPr>
+            <w:r>
+              <w:rPr>
+                <w:rFonts w:ascii="Calibri" w:hAnsi="Calibri" w:cs="Calibri"/>
+              </w:rPr>
+              <w:t>Oczekiwany wynik</w:t>
+            </w:r>
+          </w:p>
+        </w:tc>
+      </w:tr>
+      <w:tr>
+        <w:tc>
+          <w:tcPr>
+            <w:tcW w:w="561" w:type="dxa"/>
+          </w:tcPr>
+          <w:p>
+            <w:pPr>
+              <w:rPr>
+                <w:rFonts w:ascii="Calibri" w:hAnsi="Calibri" w:cs="Calibri"/>
+              </w:rPr>
+            </w:pPr>
+            <w:r>
+              <w:rPr>
+                <w:rFonts w:ascii="Calibri" w:hAnsi="Calibri" w:cs="Calibri"/>
+              </w:rPr>
+              <w:t xml:space="preserve">1</w:t>
+            </w:r>
+          </w:p>
+        </w:tc>
+        <w:tc>
+          <w:tcPr>
+            <w:tcW w:w="3798" w:type="dxa"/>
+          </w:tcPr>
+          <w:p>
+            <w:pPr>
+              <w:rPr>
+                <w:rFonts w:ascii="Calibri" w:hAnsi="Calibri" w:cs="Calibri"/>
+              </w:rPr>
+            </w:pPr>
+            <w:r>
+              <w:rPr>
+                <w:rFonts w:ascii="Calibri" w:hAnsi="Calibri" w:cs="Calibri"/>
+              </w:rPr>
+              <w:t xml:space="preserve">Plan w nocy – umiarkowany, bez zgody</w:t>
+            </w:r>
+          </w:p>
+        </w:tc>
+        <w:tc>
+          <w:tcPr>
+            <w:tcW w:w="3527" w:type="dxa"/>
+          </w:tcPr>
+          <w:p>
+            <w:pPr>
+              <w:rPr>
+                <w:rFonts w:ascii="Calibri" w:hAnsi="Calibri" w:cs="Calibri"/>
+              </w:rPr>
+            </w:pPr>
+            <w:r>
+              <w:rPr>
+                <w:rFonts w:ascii="Calibri" w:hAnsi="Calibri" w:cs="Calibri"/>
+              </w:rPr>
+              <w:t xml:space="preserve">Orzeczenie PFRON – umiarkowany; zgoda na pracę w porze nocnej niezaznaczona.</w:t>
+            </w:r>
+          </w:p>
+          <w:p>
+            <w:pPr>
+              <w:rPr>
+                <w:rFonts w:ascii="Calibri" w:hAnsi="Calibri" w:cs="Calibri"/>
+              </w:rPr>
+            </w:pPr>
+            <w:r>
+              <w:rPr>
+                <w:rFonts w:ascii="Calibri" w:hAnsi="Calibri" w:cs="Calibri"/>
+              </w:rPr>
+              <w:t xml:space="preserve">Kalendarz: Podstawowy system_1_8:15_N (norma 7:00, pora nocna 22:00–6:00).</w:t>
+            </w:r>
+          </w:p>
+          <w:p>
+            <w:pPr>
+              <w:rPr>
+                <w:rFonts w:ascii="Calibri" w:hAnsi="Calibri" w:cs="Calibri"/>
+              </w:rPr>
+            </w:pPr>
+            <w:r>
+              <w:rPr>
+                <w:rFonts w:ascii="Calibri" w:hAnsi="Calibri" w:cs="Calibri"/>
+              </w:rPr>
+              <w:t xml:space="preserve">Plan 02.11.2026: 22:00–4:00 (6:00)</w:t>
+            </w:r>
+          </w:p>
+        </w:tc>
+        <w:tc>
+          <w:tcPr>
+            <w:tcW w:w="1761" w:type="dxa"/>
+          </w:tcPr>
+          <w:p>
+            <w:pPr>
+              <w:rPr>
+                <w:rFonts w:ascii="Calibri" w:hAnsi="Calibri" w:cs="Calibri"/>
+              </w:rPr>
+            </w:pPr>
+            <w:r>
+              <w:rPr>
+                <w:rFonts w:ascii="Calibri" w:hAnsi="Calibri" w:cs="Calibri"/>
+              </w:rPr>
+              <w:t xml:space="preserve">Błąd – zapis zablokowany (w porze nocnej 6:00)</w:t>
+            </w:r>
+          </w:p>
+        </w:tc>
+      </w:tr>
+      <w:tr>
+        <w:tc>
+          <w:tcPr>
+            <w:tcW w:w="561" w:type="dxa"/>
+          </w:tcPr>
+          <w:p>
+            <w:pPr>
+              <w:rPr>
+                <w:rFonts w:ascii="Calibri" w:hAnsi="Calibri" w:cs="Calibri"/>
+              </w:rPr>
+            </w:pPr>
+            <w:r>
+              <w:rPr>
+                <w:rFonts w:ascii="Calibri" w:hAnsi="Calibri" w:cs="Calibri"/>
+              </w:rPr>
+              <w:t xml:space="preserve">2</w:t>
+            </w:r>
+          </w:p>
+        </w:tc>
+        <w:tc>
+          <w:tcPr>
+            <w:tcW w:w="3798" w:type="dxa"/>
+          </w:tcPr>
+          <w:p>
+            <w:pPr>
+              <w:rPr>
+                <w:rFonts w:ascii="Calibri" w:hAnsi="Calibri" w:cs="Calibri"/>
+              </w:rPr>
+            </w:pPr>
+            <w:r>
+              <w:rPr>
+                <w:rFonts w:ascii="Calibri" w:hAnsi="Calibri" w:cs="Calibri"/>
+              </w:rPr>
+              <w:t xml:space="preserve">Plan kończy się z początkiem pory nocnej</w:t>
+            </w:r>
+          </w:p>
+        </w:tc>
+        <w:tc>
+          <w:tcPr>
+            <w:tcW w:w="3527" w:type="dxa"/>
+          </w:tcPr>
+          <w:p>
+            <w:pPr>
+              <w:rPr>
+                <w:rFonts w:ascii="Calibri" w:hAnsi="Calibri" w:cs="Calibri"/>
+              </w:rPr>
+            </w:pPr>
+            <w:r>
+              <w:rPr>
+                <w:rFonts w:ascii="Calibri" w:hAnsi="Calibri" w:cs="Calibri"/>
+              </w:rPr>
+              <w:t xml:space="preserve">Jak w pkt 1.</w:t>
+            </w:r>
+          </w:p>
+          <w:p>
+            <w:pPr>
+              <w:rPr>
+                <w:rFonts w:ascii="Calibri" w:hAnsi="Calibri" w:cs="Calibri"/>
+              </w:rPr>
+            </w:pPr>
+            <w:r>
+              <w:rPr>
+                <w:rFonts w:ascii="Calibri" w:hAnsi="Calibri" w:cs="Calibri"/>
+              </w:rPr>
+              <w:t xml:space="preserve">Plan 02.11.2026: 16:00–22:00</w:t>
+            </w:r>
+          </w:p>
+        </w:tc>
+        <w:tc>
+          <w:tcPr>
+            <w:tcW w:w="1761" w:type="dxa"/>
+          </w:tcPr>
+          <w:p>
+            <w:pPr>
+              <w:rPr>
+                <w:rFonts w:ascii="Calibri" w:hAnsi="Calibri" w:cs="Calibri"/>
+              </w:rPr>
+            </w:pPr>
+            <w:r>
+              <w:rPr>
+                <w:rFonts w:ascii="Calibri" w:hAnsi="Calibri" w:cs="Calibri"/>
+              </w:rPr>
+              <w:t xml:space="preserve">Brak błędu (granica dozwolona)</w:t>
+            </w:r>
+          </w:p>
+        </w:tc>
+      </w:tr>
+      <w:tr>
+        <w:tc>
+          <w:tcPr>
+            <w:tcW w:w="561" w:type="dxa"/>
+          </w:tcPr>
+          <w:p>
+            <w:pPr>
+              <w:rPr>
+                <w:rFonts w:ascii="Calibri" w:hAnsi="Calibri" w:cs="Calibri"/>
+              </w:rPr>
+            </w:pPr>
+            <w:r>
+              <w:rPr>
+                <w:rFonts w:ascii="Calibri" w:hAnsi="Calibri" w:cs="Calibri"/>
+              </w:rPr>
+              <w:t xml:space="preserve">3</w:t>
+            </w:r>
+          </w:p>
+        </w:tc>
+        <w:tc>
+          <w:tcPr>
+            <w:tcW w:w="3798" w:type="dxa"/>
+          </w:tcPr>
+          <w:p>
+            <w:pPr>
+              <w:rPr>
+                <w:rFonts w:ascii="Calibri" w:hAnsi="Calibri" w:cs="Calibri"/>
+              </w:rPr>
+            </w:pPr>
+            <w:r>
+              <w:rPr>
+                <w:rFonts w:ascii="Calibri" w:hAnsi="Calibri" w:cs="Calibri"/>
+              </w:rPr>
+              <w:t xml:space="preserve">Plan częściowo w porze nocnej – wieczór</w:t>
+            </w:r>
+          </w:p>
+        </w:tc>
+        <w:tc>
+          <w:tcPr>
+            <w:tcW w:w="3527" w:type="dxa"/>
+          </w:tcPr>
+          <w:p>
+            <w:pPr>
+              <w:rPr>
+                <w:rFonts w:ascii="Calibri" w:hAnsi="Calibri" w:cs="Calibri"/>
+              </w:rPr>
+            </w:pPr>
+            <w:r>
+              <w:rPr>
+                <w:rFonts w:ascii="Calibri" w:hAnsi="Calibri" w:cs="Calibri"/>
+              </w:rPr>
+              <w:t xml:space="preserve">Jak w pkt 1.</w:t>
+            </w:r>
+          </w:p>
+          <w:p>
+            <w:pPr>
+              <w:rPr>
+                <w:rFonts w:ascii="Calibri" w:hAnsi="Calibri" w:cs="Calibri"/>
+              </w:rPr>
+            </w:pPr>
+            <w:r>
+              <w:rPr>
+                <w:rFonts w:ascii="Calibri" w:hAnsi="Calibri" w:cs="Calibri"/>
+              </w:rPr>
+              <w:t xml:space="preserve">Plan 02.11.2026: 16:30–22:30</w:t>
+            </w:r>
+          </w:p>
+        </w:tc>
+        <w:tc>
+          <w:tcPr>
+            <w:tcW w:w="1761" w:type="dxa"/>
+          </w:tcPr>
+          <w:p>
+            <w:pPr>
+              <w:rPr>
+                <w:rFonts w:ascii="Calibri" w:hAnsi="Calibri" w:cs="Calibri"/>
+              </w:rPr>
+            </w:pPr>
+            <w:r>
+              <w:rPr>
+                <w:rFonts w:ascii="Calibri" w:hAnsi="Calibri" w:cs="Calibri"/>
+              </w:rPr>
+              <w:t xml:space="preserve">Błąd – w porze nocnej 0:30</w:t>
+            </w:r>
+          </w:p>
+        </w:tc>
+      </w:tr>
+      <w:tr>
+        <w:tc>
+          <w:tcPr>
+            <w:tcW w:w="561" w:type="dxa"/>
+          </w:tcPr>
+          <w:p>
+            <w:pPr>
+              <w:rPr>
+                <w:rFonts w:ascii="Calibri" w:hAnsi="Calibri" w:cs="Calibri"/>
+              </w:rPr>
+            </w:pPr>
+            <w:r>
+              <w:rPr>
+                <w:rFonts w:ascii="Calibri" w:hAnsi="Calibri" w:cs="Calibri"/>
+              </w:rPr>
+              <w:t xml:space="preserve">4</w:t>
+            </w:r>
+          </w:p>
+        </w:tc>
+        <w:tc>
+          <w:tcPr>
+            <w:tcW w:w="3798" w:type="dxa"/>
+          </w:tcPr>
+          <w:p>
+            <w:pPr>
+              <w:rPr>
+                <w:rFonts w:ascii="Calibri" w:hAnsi="Calibri" w:cs="Calibri"/>
+              </w:rPr>
+            </w:pPr>
+            <w:r>
+              <w:rPr>
+                <w:rFonts w:ascii="Calibri" w:hAnsi="Calibri" w:cs="Calibri"/>
+              </w:rPr>
+              <w:t xml:space="preserve">Plan częściowo w porze nocnej – rano</w:t>
+            </w:r>
+          </w:p>
+        </w:tc>
+        <w:tc>
+          <w:tcPr>
+            <w:tcW w:w="3527" w:type="dxa"/>
+          </w:tcPr>
+          <w:p>
+            <w:pPr>
+              <w:rPr>
+                <w:rFonts w:ascii="Calibri" w:hAnsi="Calibri" w:cs="Calibri"/>
+              </w:rPr>
+            </w:pPr>
+            <w:r>
+              <w:rPr>
+                <w:rFonts w:ascii="Calibri" w:hAnsi="Calibri" w:cs="Calibri"/>
+              </w:rPr>
+              <w:t xml:space="preserve">Jak w pkt 1.</w:t>
+            </w:r>
+          </w:p>
+          <w:p>
+            <w:pPr>
+              <w:rPr>
+                <w:rFonts w:ascii="Calibri" w:hAnsi="Calibri" w:cs="Calibri"/>
+              </w:rPr>
+            </w:pPr>
+            <w:r>
+              <w:rPr>
+                <w:rFonts w:ascii="Calibri" w:hAnsi="Calibri" w:cs="Calibri"/>
+              </w:rPr>
+              <w:t xml:space="preserve">Plan 02.11.2026: 5:00–11:00</w:t>
+            </w:r>
+          </w:p>
+        </w:tc>
+        <w:tc>
+          <w:tcPr>
+            <w:tcW w:w="1761" w:type="dxa"/>
+          </w:tcPr>
+          <w:p>
+            <w:pPr>
+              <w:rPr>
+                <w:rFonts w:ascii="Calibri" w:hAnsi="Calibri" w:cs="Calibri"/>
+              </w:rPr>
+            </w:pPr>
+            <w:r>
+              <w:rPr>
+                <w:rFonts w:ascii="Calibri" w:hAnsi="Calibri" w:cs="Calibri"/>
+              </w:rPr>
+              <w:t xml:space="preserve">Błąd – w porze nocnej 1:00</w:t>
+            </w:r>
+          </w:p>
+        </w:tc>
+      </w:tr>
+      <w:tr>
+        <w:tc>
+          <w:tcPr>
+            <w:tcW w:w="561" w:type="dxa"/>
+          </w:tcPr>
+          <w:p>
+            <w:pPr>
+              <w:rPr>
+                <w:rFonts w:ascii="Calibri" w:hAnsi="Calibri" w:cs="Calibri"/>
+              </w:rPr>
+            </w:pPr>
+            <w:r>
+              <w:rPr>
+                <w:rFonts w:ascii="Calibri" w:hAnsi="Calibri" w:cs="Calibri"/>
+              </w:rPr>
+              <w:t xml:space="preserve">5</w:t>
+            </w:r>
+          </w:p>
+        </w:tc>
+        <w:tc>
+          <w:tcPr>
+            <w:tcW w:w="3798" w:type="dxa"/>
+          </w:tcPr>
+          <w:p>
+            <w:pPr>
+              <w:rPr>
+                <w:rFonts w:ascii="Calibri" w:hAnsi="Calibri" w:cs="Calibri"/>
+              </w:rPr>
+            </w:pPr>
+            <w:r>
+              <w:rPr>
+                <w:rFonts w:ascii="Calibri" w:hAnsi="Calibri" w:cs="Calibri"/>
+              </w:rPr>
+              <w:t xml:space="preserve">Stopień lekki, bez zgody</w:t>
+            </w:r>
+          </w:p>
+        </w:tc>
+        <w:tc>
+          <w:tcPr>
+            <w:tcW w:w="3527" w:type="dxa"/>
+          </w:tcPr>
+          <w:p>
+            <w:pPr>
+              <w:rPr>
+                <w:rFonts w:ascii="Calibri" w:hAnsi="Calibri" w:cs="Calibri"/>
+              </w:rPr>
+            </w:pPr>
+            <w:r>
+              <w:rPr>
+                <w:rFonts w:ascii="Calibri" w:hAnsi="Calibri" w:cs="Calibri"/>
+              </w:rPr>
+              <w:t xml:space="preserve">Orzeczenie PFRON – lekki; zgody niezaznaczone.</w:t>
+            </w:r>
+          </w:p>
+          <w:p>
+            <w:pPr>
+              <w:rPr>
+                <w:rFonts w:ascii="Calibri" w:hAnsi="Calibri" w:cs="Calibri"/>
+              </w:rPr>
+            </w:pPr>
+            <w:r>
+              <w:rPr>
+                <w:rFonts w:ascii="Calibri" w:hAnsi="Calibri" w:cs="Calibri"/>
+              </w:rPr>
+              <w:t xml:space="preserve">Kalendarz: Podstawowy system_1_8:16_N (norma 8:00, pora nocna 22:00–6:00).</w:t>
+            </w:r>
+          </w:p>
+          <w:p>
+            <w:pPr>
+              <w:rPr>
+                <w:rFonts w:ascii="Calibri" w:hAnsi="Calibri" w:cs="Calibri"/>
+              </w:rPr>
+            </w:pPr>
+            <w:r>
+              <w:rPr>
+                <w:rFonts w:ascii="Calibri" w:hAnsi="Calibri" w:cs="Calibri"/>
+              </w:rPr>
+              <w:t xml:space="preserve">Plan 02.11.2026: 22:00–6:00 (8:00)</w:t>
+            </w:r>
+          </w:p>
+        </w:tc>
+        <w:tc>
+          <w:tcPr>
+            <w:tcW w:w="1761" w:type="dxa"/>
+          </w:tcPr>
+          <w:p>
+            <w:pPr>
+              <w:rPr>
+                <w:rFonts w:ascii="Calibri" w:hAnsi="Calibri" w:cs="Calibri"/>
+              </w:rPr>
+            </w:pPr>
+            <w:r>
+              <w:rPr>
+                <w:rFonts w:ascii="Calibri" w:hAnsi="Calibri" w:cs="Calibri"/>
+              </w:rPr>
+              <w:t xml:space="preserve">Błąd – weryfikator obejmuje każdy stopień</w:t>
+            </w:r>
+          </w:p>
+        </w:tc>
+      </w:tr>
+      <w:tr>
+        <w:tc>
+          <w:tcPr>
+            <w:tcW w:w="561" w:type="dxa"/>
+          </w:tcPr>
+          <w:p>
+            <w:pPr>
+              <w:rPr>
+                <w:rFonts w:ascii="Calibri" w:hAnsi="Calibri" w:cs="Calibri"/>
+              </w:rPr>
+            </w:pPr>
+            <w:r>
+              <w:rPr>
+                <w:rFonts w:ascii="Calibri" w:hAnsi="Calibri" w:cs="Calibri"/>
+              </w:rPr>
+              <w:t xml:space="preserve">6</w:t>
+            </w:r>
+          </w:p>
+        </w:tc>
+        <w:tc>
+          <w:tcPr>
+            <w:tcW w:w="3798" w:type="dxa"/>
+          </w:tcPr>
+          <w:p>
+            <w:pPr>
+              <w:rPr>
+                <w:rFonts w:ascii="Calibri" w:hAnsi="Calibri" w:cs="Calibri"/>
+              </w:rPr>
+            </w:pPr>
+            <w:r>
+              <w:rPr>
+                <w:rFonts w:ascii="Calibri" w:hAnsi="Calibri" w:cs="Calibri"/>
+              </w:rPr>
+              <w:t xml:space="preserve">Bez orzeczenia</w:t>
+            </w:r>
+          </w:p>
+        </w:tc>
+        <w:tc>
+          <w:tcPr>
+            <w:tcW w:w="3527" w:type="dxa"/>
+          </w:tcPr>
+          <w:p>
+            <w:pPr>
+              <w:rPr>
+                <w:rFonts w:ascii="Calibri" w:hAnsi="Calibri" w:cs="Calibri"/>
+              </w:rPr>
+            </w:pPr>
+            <w:r>
+              <w:rPr>
+                <w:rFonts w:ascii="Calibri" w:hAnsi="Calibri" w:cs="Calibri"/>
+              </w:rPr>
+              <w:t xml:space="preserve">Brak orzeczeń.</w:t>
+            </w:r>
+          </w:p>
+          <w:p>
+            <w:pPr>
+              <w:rPr>
+                <w:rFonts w:ascii="Calibri" w:hAnsi="Calibri" w:cs="Calibri"/>
+              </w:rPr>
+            </w:pPr>
+            <w:r>
+              <w:rPr>
+                <w:rFonts w:ascii="Calibri" w:hAnsi="Calibri" w:cs="Calibri"/>
+              </w:rPr>
+              <w:t xml:space="preserve">Kalendarz: Podstawowy system_1_8:16_N (norma 8:00, pora nocna 22:00–6:00).</w:t>
+            </w:r>
+          </w:p>
+          <w:p>
+            <w:pPr>
+              <w:rPr>
+                <w:rFonts w:ascii="Calibri" w:hAnsi="Calibri" w:cs="Calibri"/>
+              </w:rPr>
+            </w:pPr>
+            <w:r>
+              <w:rPr>
+                <w:rFonts w:ascii="Calibri" w:hAnsi="Calibri" w:cs="Calibri"/>
+              </w:rPr>
+              <w:t xml:space="preserve">Plan 02.11.2026: 22:00–6:00</w:t>
+            </w:r>
+          </w:p>
+        </w:tc>
+        <w:tc>
+          <w:tcPr>
+            <w:tcW w:w="1761" w:type="dxa"/>
+          </w:tcPr>
+          <w:p>
+            <w:pPr>
+              <w:rPr>
+                <w:rFonts w:ascii="Calibri" w:hAnsi="Calibri" w:cs="Calibri"/>
+              </w:rPr>
+            </w:pPr>
+            <w:r>
+              <w:rPr>
+                <w:rFonts w:ascii="Calibri" w:hAnsi="Calibri" w:cs="Calibri"/>
+              </w:rPr>
+              <w:t xml:space="preserve">Brak błędu</w:t>
+            </w:r>
+          </w:p>
+        </w:tc>
+      </w:tr>
+      <w:tr>
+        <w:tc>
+          <w:tcPr>
+            <w:tcW w:w="561" w:type="dxa"/>
+          </w:tcPr>
+          <w:p>
+            <w:pPr>
+              <w:rPr>
+                <w:rFonts w:ascii="Calibri" w:hAnsi="Calibri" w:cs="Calibri"/>
+              </w:rPr>
+            </w:pPr>
+            <w:r>
+              <w:rPr>
+                <w:rFonts w:ascii="Calibri" w:hAnsi="Calibri" w:cs="Calibri"/>
+              </w:rPr>
+              <w:t xml:space="preserve">7</w:t>
+            </w:r>
+          </w:p>
+        </w:tc>
+        <w:tc>
+          <w:tcPr>
+            <w:tcW w:w="3798" w:type="dxa"/>
+          </w:tcPr>
+          <w:p>
+            <w:pPr>
+              <w:rPr>
+                <w:rFonts w:ascii="Calibri" w:hAnsi="Calibri" w:cs="Calibri"/>
+              </w:rPr>
+            </w:pPr>
+            <w:r>
+              <w:rPr>
+                <w:rFonts w:ascii="Calibri" w:hAnsi="Calibri" w:cs="Calibri"/>
+              </w:rPr>
+              <w:t xml:space="preserve">Ze zgodą na pracę w porze nocnej</w:t>
+            </w:r>
+          </w:p>
+        </w:tc>
+        <w:tc>
+          <w:tcPr>
+            <w:tcW w:w="3527" w:type="dxa"/>
+          </w:tcPr>
+          <w:p>
+            <w:pPr>
+              <w:rPr>
+                <w:rFonts w:ascii="Calibri" w:hAnsi="Calibri" w:cs="Calibri"/>
+              </w:rPr>
+            </w:pPr>
+            <w:r>
+              <w:rPr>
+                <w:rFonts w:ascii="Calibri" w:hAnsi="Calibri" w:cs="Calibri"/>
+              </w:rPr>
+              <w:t xml:space="preserve">Orzeczenie PFRON – umiarkowany; zgoda na pracę w porze nocnej zaznaczona.</w:t>
+            </w:r>
+          </w:p>
+          <w:p>
+            <w:pPr>
+              <w:rPr>
+                <w:rFonts w:ascii="Calibri" w:hAnsi="Calibri" w:cs="Calibri"/>
+              </w:rPr>
+            </w:pPr>
+            <w:r>
+              <w:rPr>
+                <w:rFonts w:ascii="Calibri" w:hAnsi="Calibri" w:cs="Calibri"/>
+              </w:rPr>
+              <w:t xml:space="preserve">Kalendarz: Podstawowy system_1_8:16_N (norma 8:00, pora nocna 22:00–6:00).</w:t>
+            </w:r>
+          </w:p>
+          <w:p>
+            <w:pPr>
+              <w:rPr>
+                <w:rFonts w:ascii="Calibri" w:hAnsi="Calibri" w:cs="Calibri"/>
+              </w:rPr>
+            </w:pPr>
+            <w:r>
+              <w:rPr>
+                <w:rFonts w:ascii="Calibri" w:hAnsi="Calibri" w:cs="Calibri"/>
+              </w:rPr>
+              <w:t xml:space="preserve">Plan 02.11.2026: 22:00–6:00</w:t>
+            </w:r>
+          </w:p>
+        </w:tc>
+        <w:tc>
+          <w:tcPr>
+            <w:tcW w:w="1761" w:type="dxa"/>
+          </w:tcPr>
+          <w:p>
+            <w:pPr>
+              <w:rPr>
+                <w:rFonts w:ascii="Calibri" w:hAnsi="Calibri" w:cs="Calibri"/>
+              </w:rPr>
+            </w:pPr>
+            <w:r>
+              <w:rPr>
+                <w:rFonts w:ascii="Calibri" w:hAnsi="Calibri" w:cs="Calibri"/>
+              </w:rPr>
+              <w:t xml:space="preserve">Brak błędu</w:t>
+            </w:r>
+          </w:p>
+        </w:tc>
+      </w:tr>
+    </w:tbl>
+    <w:p>
+      <w:pPr>
+        <w:rPr>
+          <w:rFonts w:ascii="Calibri" w:hAnsi="Calibri" w:cs="Calibri"/>
+        </w:rPr>
+      </w:pPr>
+    </w:p>
+    <w:p>
+      <w:pPr>
+        <w:rPr>
+          <w:rFonts w:ascii="Calibri" w:hAnsi="Calibri" w:cs="Calibri"/>
+        </w:rPr>
+      </w:pPr>
+    </w:p>
+    <w:p>
+      <w:pPr>
+        <w:pStyle w:val="Nagwek1"/>
+        <w:jc w:val="center"/>
+        <w:rPr>
+          <w:rFonts w:ascii="Calibri" w:hAnsi="Calibri" w:cs="Calibri"/>
+        </w:rPr>
+      </w:pPr>
+      <w:bookmarkStart w:id="8" w:name="_Toc242432902"/>
+      <w:r>
+        <w:rPr>
+          <w:rFonts w:ascii="Calibri" w:hAnsi="Calibri" w:cs="Calibri"/>
+        </w:rPr>
+        <w:t xml:space="preserve">Weryfikator A1_Brak zgody na pracę w nocy (czas)</w:t>
+      </w:r>
+      <w:bookmarkEnd w:id="8"/>
+    </w:p>
+    <w:p>
+      <w:pPr>
+        <w:rPr>
+          <w:rFonts w:ascii="Calibri" w:hAnsi="Calibri" w:cs="Calibri"/>
+        </w:rPr>
+      </w:pPr>
+    </w:p>
+    <w:p>
+      <w:pPr>
+        <w:jc w:val="both"/>
+        <w:rPr>
+          <w:rFonts w:ascii="Calibri" w:hAnsi="Calibri" w:cs="Calibri"/>
+        </w:rPr>
+      </w:pPr>
+      <w:r>
+        <w:rPr>
+          <w:rFonts w:ascii="Calibri" w:hAnsi="Calibri" w:cs="Calibri"/>
+        </w:rPr>
+        <w:t xml:space="preserve">Weryfikator ostrzega przełożonego, gdy w czasie pracy pracownika z niepełnosprawnością, który nie ma na etacie zaznaczonego pola „Zgoda na pracę w porze nocnej”, wpisano pracę w porze nocnej. Jest to ostrzeżenie – czas pracy można zapisać.</w:t>
+      </w:r>
+    </w:p>
+    <w:p>
+      <w:pPr>
+        <w:jc w:val="both"/>
+        <w:rPr>
+          <w:rFonts w:ascii="Calibri" w:hAnsi="Calibri" w:cs="Calibri"/>
+        </w:rPr>
+      </w:pPr>
+      <w:r>
+        <w:rPr>
+          <w:rFonts w:ascii="Calibri" w:hAnsi="Calibri" w:cs="Calibri"/>
+        </w:rPr>
+        <w:t xml:space="preserve">Stopień, zgoda i pora nocna ustalane są tak samo jak w weryfikatorze „A1_Brak zgody na pracę w nocy (plan)”: każdy stopień niepełnosprawności, orzeczenie PFRON albo ZUS obowiązujące w dniu, pora nocna z kalendarza etatu. Sprawdzane są strefy wliczane do czasu pracy (np. „Praca w normie”, „Praca poza normą”) oraz strefa „Praca w godzinach nocnych”.</w:t>
+      </w:r>
+    </w:p>
+    <w:p>
+      <w:pPr>
+        <w:rPr>
+          <w:rFonts w:ascii="Calibri" w:hAnsi="Calibri" w:cs="Calibri"/>
+        </w:rPr>
+      </w:pPr>
+    </w:p>
+    <w:p>
+      <w:pPr>
+        <w:jc w:val="both"/>
+        <w:rPr>
+          <w:rFonts w:ascii="Calibri" w:hAnsi="Calibri" w:cs="Calibri"/>
+        </w:rPr>
+      </w:pPr>
+      <w:r>
+        <w:rPr>
+          <w:rFonts w:ascii="Calibri" w:hAnsi="Calibri" w:cs="Calibri"/>
+        </w:rPr>
+        <w:t xml:space="preserve">Weryfikator uruchamia się przy zapisie dnia czasu pracy, także po dodaniu, zmianie lub usunięciu strefy:</w:t>
+      </w:r>
+    </w:p>
+    <w:p>
+      <w:pPr>
+        <w:jc w:val="both"/>
+        <w:rPr>
+          <w:rFonts w:ascii="Calibri" w:hAnsi="Calibri" w:cs="Calibri"/>
+        </w:rPr>
+      </w:pPr>
+      <w:r>
+        <w:rPr>
+          <w:rFonts w:ascii="Calibri" w:hAnsi="Calibri" w:cs="Calibri"/>
+        </w:rPr>
+        <w:t xml:space="preserve">- Kalendarz/Czas pracy w wersji okienkowej</w:t>
+      </w:r>
+    </w:p>
+    <w:p>
+      <w:pPr>
+        <w:jc w:val="both"/>
+        <w:rPr>
+          <w:rFonts w:ascii="Calibri" w:hAnsi="Calibri" w:cs="Calibri"/>
+        </w:rPr>
+      </w:pPr>
+      <w:r>
+        <w:rPr>
+          <w:rFonts w:ascii="Calibri" w:hAnsi="Calibri" w:cs="Calibri"/>
+        </w:rPr>
+        <w:t xml:space="preserve">- Czas pracy w pulpicie Kierownika</w:t>
+      </w:r>
+    </w:p>
+    <w:p>
+      <w:pPr>
+        <w:jc w:val="both"/>
+        <w:rPr>
+          <w:rFonts w:ascii="Calibri" w:hAnsi="Calibri" w:cs="Calibri"/>
+        </w:rPr>
+      </w:pPr>
+      <w:r>
+        <w:rPr>
+          <w:rFonts w:ascii="Calibri" w:hAnsi="Calibri" w:cs="Calibri"/>
+        </w:rPr>
+        <w:t xml:space="preserve">- import czasu pracy (np. z RCP)</w:t>
+      </w:r>
+    </w:p>
+    <w:p>
+      <w:pPr>
+        <w:rPr>
+          <w:rFonts w:ascii="Calibri" w:hAnsi="Calibri" w:cs="Calibri"/>
+        </w:rPr>
+      </w:pPr>
+    </w:p>
+    <w:p>
+      <w:pPr>
+        <w:pStyle w:val="Akapitzlist"/>
+        <w:numPr>
+          <w:ilvl w:val="0"/>
+          <w:numId w:val="13"/>
+        </w:numPr>
+        <w:ind w:left="360"/>
+        <w:rPr>
+          <w:rFonts w:ascii="Calibri" w:hAnsi="Calibri" w:cs="Calibri"/>
+          <w:sz w:val="28"/>
+          <w:szCs w:val="28"/>
+        </w:rPr>
+      </w:pPr>
+      <w:r>
+        <w:rPr>
+          <w:rFonts w:ascii="Calibri" w:hAnsi="Calibri" w:cs="Calibri"/>
+          <w:sz w:val="28"/>
+          <w:szCs w:val="28"/>
+        </w:rPr>
+        <w:t xml:space="preserve">Konfiguracja</w:t>
+      </w:r>
+    </w:p>
+    <w:p>
+      <w:pPr>
+        <w:jc w:val="both"/>
+        <w:rPr>
+          <w:rFonts w:ascii="Calibri" w:hAnsi="Calibri" w:cs="Calibri"/>
+        </w:rPr>
+      </w:pPr>
+      <w:r>
+        <w:rPr>
+          <w:rFonts w:ascii="Calibri" w:hAnsi="Calibri" w:cs="Calibri"/>
+        </w:rPr>
+        <w:t xml:space="preserve">Algorytm weryfikatora zapisany jest w konfiguracji systemu Narzędzia/Opcje/Systemowe/Dodatkowy kod do kompilacji – plik o nazwie A1WeryfikatoryKalendarza. Wywołanie algorytmu odbywa się w Definicji weryfikatorów kalendarza „A1_Brak zgody na pracę w nocy (czas)” (rodzaj: Dzień pracy).</w:t>
+      </w:r>
+    </w:p>
+    <w:p>
+      <w:pPr>
+        <w:jc w:val="both"/>
+        <w:rPr>
+          <w:rFonts w:ascii="Calibri" w:hAnsi="Calibri" w:cs="Calibri"/>
+        </w:rPr>
+      </w:pPr>
+      <w:r>
+        <w:rPr>
+          <w:rFonts w:ascii="Calibri" w:hAnsi="Calibri" w:cs="Calibri"/>
+        </w:rPr>
+        <w:t xml:space="preserve">Weryfikator można włączyć na dowolnej definicji Kalendarza w zakładce Weryfikatory. Na bazie testowej podpięty jako Ostrzeżenie do kalendarzy „3 miesięczny”, „Podstawowy system_1_8:16” oraz do kalendarzy klienta (w tym wersji z dopiskiem _N dla osób z niepełnosprawnością).</w:t>
+      </w:r>
+    </w:p>
+    <w:p>
+      <w:pPr>
+        <w:jc w:val="both"/>
+        <w:rPr>
+          <w:rFonts w:ascii="Calibri" w:hAnsi="Calibri" w:cs="Calibri"/>
+        </w:rPr>
+      </w:pPr>
+      <w:r>
+        <w:rPr>
+          <w:rFonts w:ascii="Calibri" w:hAnsi="Calibri" w:cs="Calibri"/>
+        </w:rPr>
+        <w:t xml:space="preserve">Komunikat:</w:t>
+      </w:r>
+    </w:p>
+    <w:p>
+      <w:pPr>
+        <w:jc w:val="both"/>
+        <w:rPr>
+          <w:rFonts w:ascii="Calibri" w:hAnsi="Calibri" w:cs="Calibri"/>
+        </w:rPr>
+      </w:pPr>
+      <w:r>
+        <w:rPr>
+          <w:rFonts w:ascii="Calibri" w:hAnsi="Calibri" w:cs="Calibri"/>
+        </w:rPr>
+        <w:t xml:space="preserve">Dla dnia (data) wpisano pracę w porze nocnej (czas w porze nocnej), a pracownik z niepełnosprawnością (stopień (stopień)) nie ma na etacie zgody na pracę w porze nocnej - (pracownik)</w:t>
+      </w:r>
+    </w:p>
+    <w:p>
+      <w:pPr>
+        <w:rPr>
+          <w:rFonts w:ascii="Calibri" w:hAnsi="Calibri" w:cs="Calibri"/>
+        </w:rPr>
+      </w:pPr>
+    </w:p>
+    <w:p>
+      <w:pPr>
+        <w:pStyle w:val="Akapitzlist"/>
+        <w:numPr>
+          <w:ilvl w:val="0"/>
+          <w:numId w:val="13"/>
+        </w:numPr>
+        <w:ind w:left="360"/>
+        <w:rPr>
+          <w:rFonts w:ascii="Calibri" w:hAnsi="Calibri" w:cs="Calibri"/>
+          <w:sz w:val="28"/>
+          <w:szCs w:val="28"/>
+        </w:rPr>
+      </w:pPr>
+      <w:r>
+        <w:rPr>
+          <w:rFonts w:ascii="Calibri" w:hAnsi="Calibri" w:cs="Calibri"/>
+          <w:sz w:val="28"/>
+          <w:szCs w:val="28"/>
+        </w:rPr>
+        <w:t xml:space="preserve">Scenariusze testowe</w:t>
+      </w:r>
+    </w:p>
+    <w:tbl>
+      <w:tblPr>
+        <w:tblStyle w:val="Tabela-Siatka"/>
+        <w:tblW w:w="9647" w:type="dxa"/>
+        <w:tblLook w:val="04A0" w:firstRow="1" w:lastRow="0" w:firstColumn="1" w:lastColumn="0" w:noHBand="0" w:noVBand="1"/>
+      </w:tblPr>
+      <w:tblGrid>
+        <w:gridCol w:w="561"/>
+        <w:gridCol w:w="3798"/>
+        <w:gridCol w:w="3527"/>
+        <w:gridCol w:w="1761"/>
+      </w:tblGrid>
+      <w:tr>
+        <w:tc>
+          <w:tcPr>
+            <w:tcW w:w="561" w:type="dxa"/>
+          </w:tcPr>
+          <w:p>
+            <w:pPr>
+              <w:rPr>
+                <w:rFonts w:ascii="Calibri" w:hAnsi="Calibri" w:cs="Calibri"/>
+              </w:rPr>
+            </w:pPr>
+            <w:proofErr w:type="spellStart"/>
+            <w:r>
+              <w:rPr>
+                <w:rFonts w:ascii="Calibri" w:hAnsi="Calibri" w:cs="Calibri"/>
+              </w:rPr>
+              <w:t>Lp</w:t>
+            </w:r>
+            <w:proofErr w:type="spellEnd"/>
+          </w:p>
+        </w:tc>
+        <w:tc>
+          <w:tcPr>
+            <w:tcW w:w="3798" w:type="dxa"/>
+          </w:tcPr>
+          <w:p>
+            <w:pPr>
+              <w:rPr>
+                <w:rFonts w:ascii="Calibri" w:hAnsi="Calibri" w:cs="Calibri"/>
+              </w:rPr>
+            </w:pPr>
+            <w:r>
+              <w:rPr>
+                <w:rFonts w:ascii="Calibri" w:hAnsi="Calibri" w:cs="Calibri"/>
+              </w:rPr>
+              <w:t>Scenariusz</w:t>
+            </w:r>
+          </w:p>
+        </w:tc>
+        <w:tc>
+          <w:tcPr>
+            <w:tcW w:w="3527" w:type="dxa"/>
+          </w:tcPr>
+          <w:p>
+            <w:pPr>
+              <w:rPr>
+                <w:rFonts w:ascii="Calibri" w:hAnsi="Calibri" w:cs="Calibri"/>
+              </w:rPr>
+            </w:pPr>
+            <w:r>
+              <w:rPr>
+                <w:rFonts w:ascii="Calibri" w:hAnsi="Calibri" w:cs="Calibri"/>
+              </w:rPr>
+              <w:t>Dane wejściowe</w:t>
+            </w:r>
+          </w:p>
+        </w:tc>
+        <w:tc>
+          <w:tcPr>
+            <w:tcW w:w="1761" w:type="dxa"/>
+          </w:tcPr>
+          <w:p>
+            <w:pPr>
+              <w:rPr>
+                <w:rFonts w:ascii="Calibri" w:hAnsi="Calibri" w:cs="Calibri"/>
+              </w:rPr>
+            </w:pPr>
+            <w:r>
+              <w:rPr>
+                <w:rFonts w:ascii="Calibri" w:hAnsi="Calibri" w:cs="Calibri"/>
+              </w:rPr>
+              <w:t>Oczekiwany wynik</w:t>
+            </w:r>
+          </w:p>
+        </w:tc>
+      </w:tr>
+      <w:tr>
+        <w:tc>
+          <w:tcPr>
+            <w:tcW w:w="561" w:type="dxa"/>
+          </w:tcPr>
+          <w:p>
+            <w:pPr>
+              <w:rPr>
+                <w:rFonts w:ascii="Calibri" w:hAnsi="Calibri" w:cs="Calibri"/>
+              </w:rPr>
+            </w:pPr>
+            <w:r>
+              <w:rPr>
+                <w:rFonts w:ascii="Calibri" w:hAnsi="Calibri" w:cs="Calibri"/>
+              </w:rPr>
+              <w:t xml:space="preserve">1</w:t>
+            </w:r>
+          </w:p>
+        </w:tc>
+        <w:tc>
+          <w:tcPr>
+            <w:tcW w:w="3798" w:type="dxa"/>
+          </w:tcPr>
+          <w:p>
+            <w:pPr>
+              <w:rPr>
+                <w:rFonts w:ascii="Calibri" w:hAnsi="Calibri" w:cs="Calibri"/>
+              </w:rPr>
+            </w:pPr>
+            <w:r>
+              <w:rPr>
+                <w:rFonts w:ascii="Calibri" w:hAnsi="Calibri" w:cs="Calibri"/>
+              </w:rPr>
+              <w:t xml:space="preserve">Praca w nocy – bez zgody</w:t>
+            </w:r>
+          </w:p>
+        </w:tc>
+        <w:tc>
+          <w:tcPr>
+            <w:tcW w:w="3527" w:type="dxa"/>
+          </w:tcPr>
+          <w:p>
+            <w:pPr>
+              <w:rPr>
+                <w:rFonts w:ascii="Calibri" w:hAnsi="Calibri" w:cs="Calibri"/>
+              </w:rPr>
+            </w:pPr>
+            <w:r>
+              <w:rPr>
+                <w:rFonts w:ascii="Calibri" w:hAnsi="Calibri" w:cs="Calibri"/>
+              </w:rPr>
+              <w:t xml:space="preserve">Orzeczenie PFRON – umiarkowany; zgoda na pracę w porze nocnej niezaznaczona.</w:t>
+            </w:r>
+          </w:p>
+          <w:p>
+            <w:pPr>
+              <w:rPr>
+                <w:rFonts w:ascii="Calibri" w:hAnsi="Calibri" w:cs="Calibri"/>
+              </w:rPr>
+            </w:pPr>
+            <w:r>
+              <w:rPr>
+                <w:rFonts w:ascii="Calibri" w:hAnsi="Calibri" w:cs="Calibri"/>
+              </w:rPr>
+              <w:t xml:space="preserve">Kalendarz: Podstawowy system_1_8:15_N (norma 7:00, pora nocna 22:00–6:00).</w:t>
+            </w:r>
+          </w:p>
+          <w:p>
+            <w:pPr>
+              <w:rPr>
+                <w:rFonts w:ascii="Calibri" w:hAnsi="Calibri" w:cs="Calibri"/>
+              </w:rPr>
+            </w:pPr>
+            <w:r>
+              <w:rPr>
+                <w:rFonts w:ascii="Calibri" w:hAnsi="Calibri" w:cs="Calibri"/>
+              </w:rPr>
+              <w:t xml:space="preserve">Czas pracy 02.11.2026: Praca w normie 22:00–4:00 (6:00)</w:t>
+            </w:r>
+          </w:p>
+        </w:tc>
+        <w:tc>
+          <w:tcPr>
+            <w:tcW w:w="1761" w:type="dxa"/>
+          </w:tcPr>
+          <w:p>
+            <w:pPr>
+              <w:rPr>
+                <w:rFonts w:ascii="Calibri" w:hAnsi="Calibri" w:cs="Calibri"/>
+              </w:rPr>
+            </w:pPr>
+            <w:r>
+              <w:rPr>
+                <w:rFonts w:ascii="Calibri" w:hAnsi="Calibri" w:cs="Calibri"/>
+              </w:rPr>
+              <w:t xml:space="preserve">Ostrzeżenie – zapis możliwy (w porze nocnej 6:00)</w:t>
+            </w:r>
+          </w:p>
+        </w:tc>
+      </w:tr>
+      <w:tr>
+        <w:tc>
+          <w:tcPr>
+            <w:tcW w:w="561" w:type="dxa"/>
+          </w:tcPr>
+          <w:p>
+            <w:pPr>
+              <w:rPr>
+                <w:rFonts w:ascii="Calibri" w:hAnsi="Calibri" w:cs="Calibri"/>
+              </w:rPr>
+            </w:pPr>
+            <w:r>
+              <w:rPr>
+                <w:rFonts w:ascii="Calibri" w:hAnsi="Calibri" w:cs="Calibri"/>
+              </w:rPr>
+              <w:t xml:space="preserve">2</w:t>
+            </w:r>
+          </w:p>
+        </w:tc>
+        <w:tc>
+          <w:tcPr>
+            <w:tcW w:w="3798" w:type="dxa"/>
+          </w:tcPr>
+          <w:p>
+            <w:pPr>
+              <w:rPr>
+                <w:rFonts w:ascii="Calibri" w:hAnsi="Calibri" w:cs="Calibri"/>
+              </w:rPr>
+            </w:pPr>
+            <w:r>
+              <w:rPr>
+                <w:rFonts w:ascii="Calibri" w:hAnsi="Calibri" w:cs="Calibri"/>
+              </w:rPr>
+              <w:t xml:space="preserve">Praca w nocy – ze zgodą</w:t>
+            </w:r>
+          </w:p>
+        </w:tc>
+        <w:tc>
+          <w:tcPr>
+            <w:tcW w:w="3527" w:type="dxa"/>
+          </w:tcPr>
+          <w:p>
+            <w:pPr>
+              <w:rPr>
+                <w:rFonts w:ascii="Calibri" w:hAnsi="Calibri" w:cs="Calibri"/>
+              </w:rPr>
+            </w:pPr>
+            <w:r>
+              <w:rPr>
+                <w:rFonts w:ascii="Calibri" w:hAnsi="Calibri" w:cs="Calibri"/>
+              </w:rPr>
+              <w:t xml:space="preserve">Orzeczenie PFRON – umiarkowany; zgody na pracę w porze nocnej i w nadgodzinach zaznaczone.</w:t>
+            </w:r>
+          </w:p>
+          <w:p>
+            <w:pPr>
+              <w:rPr>
+                <w:rFonts w:ascii="Calibri" w:hAnsi="Calibri" w:cs="Calibri"/>
+              </w:rPr>
+            </w:pPr>
+            <w:r>
+              <w:rPr>
+                <w:rFonts w:ascii="Calibri" w:hAnsi="Calibri" w:cs="Calibri"/>
+              </w:rPr>
+              <w:t xml:space="preserve">Kalendarz: Podstawowy system_1_8:16_N (norma 8:00, pora nocna 22:00–6:00).</w:t>
+            </w:r>
+          </w:p>
+          <w:p>
+            <w:pPr>
+              <w:rPr>
+                <w:rFonts w:ascii="Calibri" w:hAnsi="Calibri" w:cs="Calibri"/>
+              </w:rPr>
+            </w:pPr>
+            <w:r>
+              <w:rPr>
+                <w:rFonts w:ascii="Calibri" w:hAnsi="Calibri" w:cs="Calibri"/>
+              </w:rPr>
+              <w:t xml:space="preserve">Czas pracy 02.11.2026: Praca w normie 21:00–5:00, Praca poza normą 5:00–6:00</w:t>
+            </w:r>
+          </w:p>
+        </w:tc>
+        <w:tc>
+          <w:tcPr>
+            <w:tcW w:w="1761" w:type="dxa"/>
+          </w:tcPr>
+          <w:p>
+            <w:pPr>
+              <w:rPr>
+                <w:rFonts w:ascii="Calibri" w:hAnsi="Calibri" w:cs="Calibri"/>
+              </w:rPr>
+            </w:pPr>
+            <w:r>
+              <w:rPr>
+                <w:rFonts w:ascii="Calibri" w:hAnsi="Calibri" w:cs="Calibri"/>
+              </w:rPr>
+              <w:t xml:space="preserve">Brak ostrzeżenia</w:t>
+            </w:r>
+          </w:p>
+        </w:tc>
+      </w:tr>
+      <w:tr>
+        <w:tc>
+          <w:tcPr>
+            <w:tcW w:w="561" w:type="dxa"/>
+          </w:tcPr>
+          <w:p>
+            <w:pPr>
+              <w:rPr>
+                <w:rFonts w:ascii="Calibri" w:hAnsi="Calibri" w:cs="Calibri"/>
+              </w:rPr>
+            </w:pPr>
+            <w:r>
+              <w:rPr>
+                <w:rFonts w:ascii="Calibri" w:hAnsi="Calibri" w:cs="Calibri"/>
+              </w:rPr>
+              <w:t xml:space="preserve">3</w:t>
+            </w:r>
+          </w:p>
+        </w:tc>
+        <w:tc>
+          <w:tcPr>
+            <w:tcW w:w="3798" w:type="dxa"/>
+          </w:tcPr>
+          <w:p>
+            <w:pPr>
+              <w:rPr>
+                <w:rFonts w:ascii="Calibri" w:hAnsi="Calibri" w:cs="Calibri"/>
+              </w:rPr>
+            </w:pPr>
+            <w:r>
+              <w:rPr>
+                <w:rFonts w:ascii="Calibri" w:hAnsi="Calibri" w:cs="Calibri"/>
+              </w:rPr>
+              <w:t xml:space="preserve">Praca w nocy – bez orzeczenia</w:t>
+            </w:r>
+          </w:p>
+        </w:tc>
+        <w:tc>
+          <w:tcPr>
+            <w:tcW w:w="3527" w:type="dxa"/>
+          </w:tcPr>
+          <w:p>
+            <w:pPr>
+              <w:rPr>
+                <w:rFonts w:ascii="Calibri" w:hAnsi="Calibri" w:cs="Calibri"/>
+              </w:rPr>
+            </w:pPr>
+            <w:r>
+              <w:rPr>
+                <w:rFonts w:ascii="Calibri" w:hAnsi="Calibri" w:cs="Calibri"/>
+              </w:rPr>
+              <w:t xml:space="preserve">Brak orzeczeń.</w:t>
+            </w:r>
+          </w:p>
+          <w:p>
+            <w:pPr>
+              <w:rPr>
+                <w:rFonts w:ascii="Calibri" w:hAnsi="Calibri" w:cs="Calibri"/>
+              </w:rPr>
+            </w:pPr>
+            <w:r>
+              <w:rPr>
+                <w:rFonts w:ascii="Calibri" w:hAnsi="Calibri" w:cs="Calibri"/>
+              </w:rPr>
+              <w:t xml:space="preserve">Kalendarz: Podstawowy system_1_8:16_N (norma 8:00, pora nocna 22:00–6:00).</w:t>
+            </w:r>
+          </w:p>
+          <w:p>
+            <w:pPr>
+              <w:rPr>
+                <w:rFonts w:ascii="Calibri" w:hAnsi="Calibri" w:cs="Calibri"/>
+              </w:rPr>
+            </w:pPr>
+            <w:r>
+              <w:rPr>
+                <w:rFonts w:ascii="Calibri" w:hAnsi="Calibri" w:cs="Calibri"/>
+              </w:rPr>
+              <w:t xml:space="preserve">Czas pracy 02.11.2026: jak w pkt 2</w:t>
+            </w:r>
+          </w:p>
+        </w:tc>
+        <w:tc>
+          <w:tcPr>
+            <w:tcW w:w="1761" w:type="dxa"/>
+          </w:tcPr>
+          <w:p>
+            <w:pPr>
+              <w:rPr>
+                <w:rFonts w:ascii="Calibri" w:hAnsi="Calibri" w:cs="Calibri"/>
+              </w:rPr>
+            </w:pPr>
+            <w:r>
+              <w:rPr>
+                <w:rFonts w:ascii="Calibri" w:hAnsi="Calibri" w:cs="Calibri"/>
+              </w:rPr>
+              <w:t xml:space="preserve">Brak ostrzeżenia</w:t>
+            </w:r>
+          </w:p>
+        </w:tc>
+      </w:tr>
+    </w:tbl>
+    <w:p>
+      <w:pPr>
+        <w:rPr>
+          <w:rFonts w:ascii="Calibri" w:hAnsi="Calibri" w:cs="Calibri"/>
+        </w:rPr>
+      </w:pPr>
+    </w:p>
+    <w:p>
+      <w:pPr>
+        <w:rPr>
+          <w:rFonts w:ascii="Calibri" w:hAnsi="Calibri" w:cs="Calibri"/>
+        </w:rPr>
+      </w:pPr>
+    </w:p>
+    <w:p>
+      <w:pPr>
+        <w:pStyle w:val="Nagwek1"/>
+        <w:jc w:val="center"/>
+        <w:rPr>
+          <w:rFonts w:ascii="Calibri" w:hAnsi="Calibri" w:cs="Calibri"/>
+        </w:rPr>
+      </w:pPr>
+      <w:bookmarkStart w:id="9" w:name="_Toc242432903"/>
+      <w:r>
+        <w:rPr>
+          <w:rFonts w:ascii="Calibri" w:hAnsi="Calibri" w:cs="Calibri"/>
+        </w:rPr>
+        <w:t xml:space="preserve">Weryfikator A1_Brak zgody na nadgodziny</w:t>
+      </w:r>
+      <w:bookmarkEnd w:id="9"/>
+    </w:p>
+    <w:p>
+      <w:pPr>
+        <w:rPr>
+          <w:rFonts w:ascii="Calibri" w:hAnsi="Calibri" w:cs="Calibri"/>
+        </w:rPr>
+      </w:pPr>
+    </w:p>
+    <w:p>
+      <w:pPr>
+        <w:jc w:val="both"/>
+        <w:rPr>
+          <w:rFonts w:ascii="Calibri" w:hAnsi="Calibri" w:cs="Calibri"/>
+        </w:rPr>
+      </w:pPr>
+      <w:r>
+        <w:rPr>
+          <w:rFonts w:ascii="Calibri" w:hAnsi="Calibri" w:cs="Calibri"/>
+        </w:rPr>
+        <w:t xml:space="preserve">Weryfikator ostrzega przełożonego, gdy pracownikowi z niepełnosprawnością, który nie ma na etacie zaznaczonego pola „Zgoda na pracę w nadgodzinach”, wpisano w czasie pracy godziny nadliczbowe. Jest to ostrzeżenie – czas pracy można zapisać.</w:t>
+      </w:r>
+    </w:p>
+    <w:p>
+      <w:pPr>
+        <w:jc w:val="both"/>
+        <w:rPr>
+          <w:rFonts w:ascii="Calibri" w:hAnsi="Calibri" w:cs="Calibri"/>
+        </w:rPr>
+      </w:pPr>
+      <w:r>
+        <w:rPr>
+          <w:rFonts w:ascii="Calibri" w:hAnsi="Calibri" w:cs="Calibri"/>
+        </w:rPr>
+        <w:t xml:space="preserve">Nadgodziny ustalane są dla dnia: czas pracy (strefy wliczane do czasu pracy, np. „Praca w normie” i „Praca poza normą”) ponad limit dnia. Limitem jest większa z wartości:</w:t>
+      </w:r>
+    </w:p>
+    <w:p>
+      <w:pPr>
+        <w:jc w:val="both"/>
+        <w:rPr>
+          <w:rFonts w:ascii="Calibri" w:hAnsi="Calibri" w:cs="Calibri"/>
+        </w:rPr>
+      </w:pPr>
+      <w:r>
+        <w:rPr>
+          <w:rFonts w:ascii="Calibri" w:hAnsi="Calibri" w:cs="Calibri"/>
+        </w:rPr>
+        <w:t xml:space="preserve">- plan pracy na ten dzień,</w:t>
+      </w:r>
+    </w:p>
+    <w:p>
+      <w:pPr>
+        <w:jc w:val="both"/>
+        <w:rPr>
+          <w:rFonts w:ascii="Calibri" w:hAnsi="Calibri" w:cs="Calibri"/>
+        </w:rPr>
+      </w:pPr>
+      <w:r>
+        <w:rPr>
+          <w:rFonts w:ascii="Calibri" w:hAnsi="Calibri" w:cs="Calibri"/>
+        </w:rPr>
+        <w:t xml:space="preserve">- norma dobowa z etatu (na kalendarzach 8:15_N – 7:00, na 8:16_N – 8:00).</w:t>
+      </w:r>
+    </w:p>
+    <w:p>
+      <w:pPr>
+        <w:jc w:val="both"/>
+        <w:rPr>
+          <w:rFonts w:ascii="Calibri" w:hAnsi="Calibri" w:cs="Calibri"/>
+        </w:rPr>
+      </w:pPr>
+      <w:r>
+        <w:rPr>
+          <w:rFonts w:ascii="Calibri" w:hAnsi="Calibri" w:cs="Calibri"/>
+        </w:rPr>
+        <w:t xml:space="preserve">W dniu wolnym według planu każda praca jest traktowana jako nadgodziny.</w:t>
+      </w:r>
+    </w:p>
+    <w:p>
+      <w:pPr>
+        <w:jc w:val="both"/>
+        <w:rPr>
+          <w:rFonts w:ascii="Calibri" w:hAnsi="Calibri" w:cs="Calibri"/>
+        </w:rPr>
+      </w:pPr>
+      <w:r>
+        <w:rPr>
+          <w:rFonts w:ascii="Calibri" w:hAnsi="Calibri" w:cs="Calibri"/>
+        </w:rPr>
+        <w:t xml:space="preserve">Weryfikator dotyczy każdego stopnia niepełnosprawności. Stopień niepełnosprawności ustalany jest dla każdego dnia osobno – z orzeczenia o niepełnosprawności (PFRON) albo o niezdolności do pracy (ZUS) obowiązującego w tym dniu; gdy obowiązują oba, brany jest wyższy stopień. Zgoda czytana jest z etatu w zapisie historii obowiązującym w danym dniu.</w:t>
+      </w:r>
+    </w:p>
+    <w:p>
+      <w:pPr>
+        <w:rPr>
+          <w:rFonts w:ascii="Calibri" w:hAnsi="Calibri" w:cs="Calibri"/>
+        </w:rPr>
+      </w:pPr>
+    </w:p>
+    <w:p>
+      <w:pPr>
+        <w:jc w:val="both"/>
+        <w:rPr>
+          <w:rFonts w:ascii="Calibri" w:hAnsi="Calibri" w:cs="Calibri"/>
+        </w:rPr>
+      </w:pPr>
+      <w:r>
+        <w:rPr>
+          <w:rFonts w:ascii="Calibri" w:hAnsi="Calibri" w:cs="Calibri"/>
+        </w:rPr>
+        <w:t xml:space="preserve">Weryfikator uruchamia się przy zapisie dnia czasu pracy, także po dodaniu, zmianie lub usunięciu strefy:</w:t>
+      </w:r>
+    </w:p>
+    <w:p>
+      <w:pPr>
+        <w:jc w:val="both"/>
+        <w:rPr>
+          <w:rFonts w:ascii="Calibri" w:hAnsi="Calibri" w:cs="Calibri"/>
+        </w:rPr>
+      </w:pPr>
+      <w:r>
+        <w:rPr>
+          <w:rFonts w:ascii="Calibri" w:hAnsi="Calibri" w:cs="Calibri"/>
+        </w:rPr>
+        <w:t xml:space="preserve">- Kalendarz/Czas pracy w wersji okienkowej</w:t>
+      </w:r>
+    </w:p>
+    <w:p>
+      <w:pPr>
+        <w:jc w:val="both"/>
+        <w:rPr>
+          <w:rFonts w:ascii="Calibri" w:hAnsi="Calibri" w:cs="Calibri"/>
+        </w:rPr>
+      </w:pPr>
+      <w:r>
+        <w:rPr>
+          <w:rFonts w:ascii="Calibri" w:hAnsi="Calibri" w:cs="Calibri"/>
+        </w:rPr>
+        <w:t xml:space="preserve">- Czas pracy w pulpicie Kierownika</w:t>
+      </w:r>
+    </w:p>
+    <w:p>
+      <w:pPr>
+        <w:jc w:val="both"/>
+        <w:rPr>
+          <w:rFonts w:ascii="Calibri" w:hAnsi="Calibri" w:cs="Calibri"/>
+        </w:rPr>
+      </w:pPr>
+      <w:r>
+        <w:rPr>
+          <w:rFonts w:ascii="Calibri" w:hAnsi="Calibri" w:cs="Calibri"/>
+        </w:rPr>
+        <w:t xml:space="preserve">- import czasu pracy (np. z RCP)</w:t>
+      </w:r>
+    </w:p>
+    <w:p>
+      <w:pPr>
+        <w:rPr>
+          <w:rFonts w:ascii="Calibri" w:hAnsi="Calibri" w:cs="Calibri"/>
+        </w:rPr>
+      </w:pPr>
+    </w:p>
+    <w:p>
+      <w:pPr>
+        <w:pStyle w:val="Akapitzlist"/>
+        <w:numPr>
+          <w:ilvl w:val="0"/>
+          <w:numId w:val="14"/>
+        </w:numPr>
+        <w:ind w:left="360"/>
+        <w:rPr>
+          <w:rFonts w:ascii="Calibri" w:hAnsi="Calibri" w:cs="Calibri"/>
+          <w:sz w:val="28"/>
+          <w:szCs w:val="28"/>
+        </w:rPr>
+      </w:pPr>
+      <w:r>
+        <w:rPr>
+          <w:rFonts w:ascii="Calibri" w:hAnsi="Calibri" w:cs="Calibri"/>
+          <w:sz w:val="28"/>
+          <w:szCs w:val="28"/>
+        </w:rPr>
+        <w:t xml:space="preserve">Konfiguracja</w:t>
+      </w:r>
+    </w:p>
+    <w:p>
+      <w:pPr>
+        <w:jc w:val="both"/>
+        <w:rPr>
+          <w:rFonts w:ascii="Calibri" w:hAnsi="Calibri" w:cs="Calibri"/>
+        </w:rPr>
+      </w:pPr>
+      <w:r>
+        <w:rPr>
+          <w:rFonts w:ascii="Calibri" w:hAnsi="Calibri" w:cs="Calibri"/>
+        </w:rPr>
+        <w:t xml:space="preserve">Algorytm weryfikatora zapisany jest w konfiguracji systemu Narzędzia/Opcje/Systemowe/Dodatkowy kod do kompilacji – plik o nazwie A1WeryfikatoryKalendarza. Wywołanie algorytmu odbywa się w Definicji weryfikatorów kalendarza „A1_Brak zgody na nadgodziny” (rodzaj: Dzień pracy).</w:t>
+      </w:r>
+    </w:p>
+    <w:p>
+      <w:pPr>
+        <w:jc w:val="both"/>
+        <w:rPr>
+          <w:rFonts w:ascii="Calibri" w:hAnsi="Calibri" w:cs="Calibri"/>
+        </w:rPr>
+      </w:pPr>
+      <w:r>
+        <w:rPr>
+          <w:rFonts w:ascii="Calibri" w:hAnsi="Calibri" w:cs="Calibri"/>
+        </w:rPr>
+        <w:t xml:space="preserve">Weryfikator można włączyć na dowolnej definicji Kalendarza w zakładce Weryfikatory. Na bazie testowej podpięty jako Ostrzeżenie do kalendarzy „3 miesięczny”, „Podstawowy system_1_8:16” oraz do kalendarzy klienta (w tym wersji z dopiskiem _N dla osób z niepełnosprawnością).</w:t>
+      </w:r>
+    </w:p>
+    <w:p>
+      <w:pPr>
+        <w:jc w:val="both"/>
+        <w:rPr>
+          <w:rFonts w:ascii="Calibri" w:hAnsi="Calibri" w:cs="Calibri"/>
+        </w:rPr>
+      </w:pPr>
+      <w:r>
+        <w:rPr>
+          <w:rFonts w:ascii="Calibri" w:hAnsi="Calibri" w:cs="Calibri"/>
+        </w:rPr>
+        <w:t xml:space="preserve">Komunikat:</w:t>
+      </w:r>
+    </w:p>
+    <w:p>
+      <w:pPr>
+        <w:jc w:val="both"/>
+        <w:rPr>
+          <w:rFonts w:ascii="Calibri" w:hAnsi="Calibri" w:cs="Calibri"/>
+        </w:rPr>
+      </w:pPr>
+      <w:r>
+        <w:rPr>
+          <w:rFonts w:ascii="Calibri" w:hAnsi="Calibri" w:cs="Calibri"/>
+        </w:rPr>
+        <w:t xml:space="preserve">Dla dnia (data) wpisano pracę w godzinach nadliczbowych (nadgodziny; czas pracy (czas), limit dnia (limit)), a pracownik z niepełnosprawnością (stopień (stopień)) nie ma na etacie zgody na pracę w nadgodzinach - (pracownik)</w:t>
+      </w:r>
+    </w:p>
+    <w:p>
+      <w:pPr>
+        <w:jc w:val="both"/>
+        <w:rPr>
+          <w:rFonts w:ascii="Calibri" w:hAnsi="Calibri" w:cs="Calibri"/>
+        </w:rPr>
+      </w:pPr>
+      <w:r>
+        <w:rPr>
+          <w:rFonts w:ascii="Calibri" w:hAnsi="Calibri" w:cs="Calibri"/>
+        </w:rPr>
+        <w:t xml:space="preserve">Nadwyżkę ponad plan należy wpisywać jako „Praca poza normą” – „Praca w normie” ponad plan blokuje weryfikator „A1_Praca w normie nie ponad plan”.</w:t>
+      </w:r>
+    </w:p>
+    <w:p>
+      <w:pPr>
+        <w:rPr>
+          <w:rFonts w:ascii="Calibri" w:hAnsi="Calibri" w:cs="Calibri"/>
+        </w:rPr>
+      </w:pPr>
+    </w:p>
+    <w:p>
+      <w:pPr>
+        <w:pStyle w:val="Akapitzlist"/>
+        <w:numPr>
+          <w:ilvl w:val="0"/>
+          <w:numId w:val="14"/>
+        </w:numPr>
+        <w:ind w:left="360"/>
+        <w:rPr>
+          <w:rFonts w:ascii="Calibri" w:hAnsi="Calibri" w:cs="Calibri"/>
+          <w:sz w:val="28"/>
+          <w:szCs w:val="28"/>
+        </w:rPr>
+      </w:pPr>
+      <w:r>
+        <w:rPr>
+          <w:rFonts w:ascii="Calibri" w:hAnsi="Calibri" w:cs="Calibri"/>
+          <w:sz w:val="28"/>
+          <w:szCs w:val="28"/>
+        </w:rPr>
+        <w:t xml:space="preserve">Scenariusze testowe</w:t>
+      </w:r>
+    </w:p>
+    <w:tbl>
+      <w:tblPr>
+        <w:tblStyle w:val="Tabela-Siatka"/>
+        <w:tblW w:w="9647" w:type="dxa"/>
+        <w:tblLook w:val="04A0" w:firstRow="1" w:lastRow="0" w:firstColumn="1" w:lastColumn="0" w:noHBand="0" w:noVBand="1"/>
+      </w:tblPr>
+      <w:tblGrid>
+        <w:gridCol w:w="561"/>
+        <w:gridCol w:w="3798"/>
+        <w:gridCol w:w="3527"/>
+        <w:gridCol w:w="1761"/>
+      </w:tblGrid>
+      <w:tr>
+        <w:tc>
+          <w:tcPr>
+            <w:tcW w:w="561" w:type="dxa"/>
+          </w:tcPr>
+          <w:p>
+            <w:pPr>
+              <w:rPr>
+                <w:rFonts w:ascii="Calibri" w:hAnsi="Calibri" w:cs="Calibri"/>
+              </w:rPr>
+            </w:pPr>
+            <w:proofErr w:type="spellStart"/>
+            <w:r>
+              <w:rPr>
+                <w:rFonts w:ascii="Calibri" w:hAnsi="Calibri" w:cs="Calibri"/>
+              </w:rPr>
+              <w:t>Lp</w:t>
+            </w:r>
+            <w:proofErr w:type="spellEnd"/>
+          </w:p>
+        </w:tc>
+        <w:tc>
+          <w:tcPr>
+            <w:tcW w:w="3798" w:type="dxa"/>
+          </w:tcPr>
+          <w:p>
+            <w:pPr>
+              <w:rPr>
+                <w:rFonts w:ascii="Calibri" w:hAnsi="Calibri" w:cs="Calibri"/>
+              </w:rPr>
+            </w:pPr>
+            <w:r>
+              <w:rPr>
+                <w:rFonts w:ascii="Calibri" w:hAnsi="Calibri" w:cs="Calibri"/>
+              </w:rPr>
+              <w:t>Scenariusz</w:t>
+            </w:r>
+          </w:p>
+        </w:tc>
+        <w:tc>
+          <w:tcPr>
+            <w:tcW w:w="3527" w:type="dxa"/>
+          </w:tcPr>
+          <w:p>
+            <w:pPr>
+              <w:rPr>
+                <w:rFonts w:ascii="Calibri" w:hAnsi="Calibri" w:cs="Calibri"/>
+              </w:rPr>
+            </w:pPr>
+            <w:r>
+              <w:rPr>
+                <w:rFonts w:ascii="Calibri" w:hAnsi="Calibri" w:cs="Calibri"/>
+              </w:rPr>
+              <w:t>Dane wejściowe</w:t>
+            </w:r>
+          </w:p>
+        </w:tc>
+        <w:tc>
+          <w:tcPr>
+            <w:tcW w:w="1761" w:type="dxa"/>
+          </w:tcPr>
+          <w:p>
+            <w:pPr>
+              <w:rPr>
+                <w:rFonts w:ascii="Calibri" w:hAnsi="Calibri" w:cs="Calibri"/>
+              </w:rPr>
+            </w:pPr>
+            <w:r>
+              <w:rPr>
+                <w:rFonts w:ascii="Calibri" w:hAnsi="Calibri" w:cs="Calibri"/>
+              </w:rPr>
+              <w:t>Oczekiwany wynik</w:t>
+            </w:r>
+          </w:p>
+        </w:tc>
+      </w:tr>
+      <w:tr>
+        <w:tc>
+          <w:tcPr>
+            <w:tcW w:w="561" w:type="dxa"/>
+          </w:tcPr>
+          <w:p>
+            <w:pPr>
+              <w:rPr>
+                <w:rFonts w:ascii="Calibri" w:hAnsi="Calibri" w:cs="Calibri"/>
+              </w:rPr>
+            </w:pPr>
+            <w:r>
+              <w:rPr>
+                <w:rFonts w:ascii="Calibri" w:hAnsi="Calibri" w:cs="Calibri"/>
+              </w:rPr>
+              <w:t xml:space="preserve">1</w:t>
+            </w:r>
+          </w:p>
+        </w:tc>
+        <w:tc>
+          <w:tcPr>
+            <w:tcW w:w="3798" w:type="dxa"/>
+          </w:tcPr>
+          <w:p>
+            <w:pPr>
+              <w:rPr>
+                <w:rFonts w:ascii="Calibri" w:hAnsi="Calibri" w:cs="Calibri"/>
+              </w:rPr>
+            </w:pPr>
+            <w:r>
+              <w:rPr>
+                <w:rFonts w:ascii="Calibri" w:hAnsi="Calibri" w:cs="Calibri"/>
+              </w:rPr>
+              <w:t xml:space="preserve">Czas pracy równy normie dobowej</w:t>
+            </w:r>
+          </w:p>
+        </w:tc>
+        <w:tc>
+          <w:tcPr>
+            <w:tcW w:w="3527" w:type="dxa"/>
+          </w:tcPr>
+          <w:p>
+            <w:pPr>
+              <w:rPr>
+                <w:rFonts w:ascii="Calibri" w:hAnsi="Calibri" w:cs="Calibri"/>
+              </w:rPr>
+            </w:pPr>
+            <w:r>
+              <w:rPr>
+                <w:rFonts w:ascii="Calibri" w:hAnsi="Calibri" w:cs="Calibri"/>
+              </w:rPr>
+              <w:t xml:space="preserve">Orzeczenie PFRON – umiarkowany; zgody niezaznaczone.</w:t>
+            </w:r>
+          </w:p>
+          <w:p>
+            <w:pPr>
+              <w:rPr>
+                <w:rFonts w:ascii="Calibri" w:hAnsi="Calibri" w:cs="Calibri"/>
+              </w:rPr>
+            </w:pPr>
+            <w:r>
+              <w:rPr>
+                <w:rFonts w:ascii="Calibri" w:hAnsi="Calibri" w:cs="Calibri"/>
+              </w:rPr>
+              <w:t xml:space="preserve">Kalendarz: Podstawowy system_1_8:15_N (norma 7:00, pora nocna 22:00–6:00).</w:t>
+            </w:r>
+          </w:p>
+          <w:p>
+            <w:pPr>
+              <w:rPr>
+                <w:rFonts w:ascii="Calibri" w:hAnsi="Calibri" w:cs="Calibri"/>
+              </w:rPr>
+            </w:pPr>
+            <w:r>
+              <w:rPr>
+                <w:rFonts w:ascii="Calibri" w:hAnsi="Calibri" w:cs="Calibri"/>
+              </w:rPr>
+              <w:t xml:space="preserve">Plan 02.11.2026: 6:00. Czas pracy: Praca w normie 7:00–13:00, Praca poza normą 13:00–14:00 (razem 7:00)</w:t>
+            </w:r>
+          </w:p>
+        </w:tc>
+        <w:tc>
+          <w:tcPr>
+            <w:tcW w:w="1761" w:type="dxa"/>
+          </w:tcPr>
+          <w:p>
+            <w:pPr>
+              <w:rPr>
+                <w:rFonts w:ascii="Calibri" w:hAnsi="Calibri" w:cs="Calibri"/>
+              </w:rPr>
+            </w:pPr>
+            <w:r>
+              <w:rPr>
+                <w:rFonts w:ascii="Calibri" w:hAnsi="Calibri" w:cs="Calibri"/>
+              </w:rPr>
+              <w:t xml:space="preserve">Brak ostrzeżenia – limit dnia 7:00 (norma dobowa wyższa niż plan)</w:t>
+            </w:r>
+          </w:p>
+        </w:tc>
+      </w:tr>
+      <w:tr>
+        <w:tc>
+          <w:tcPr>
+            <w:tcW w:w="561" w:type="dxa"/>
+          </w:tcPr>
+          <w:p>
+            <w:pPr>
+              <w:rPr>
+                <w:rFonts w:ascii="Calibri" w:hAnsi="Calibri" w:cs="Calibri"/>
+              </w:rPr>
+            </w:pPr>
+            <w:r>
+              <w:rPr>
+                <w:rFonts w:ascii="Calibri" w:hAnsi="Calibri" w:cs="Calibri"/>
+              </w:rPr>
+              <w:t xml:space="preserve">2</w:t>
+            </w:r>
+          </w:p>
+        </w:tc>
+        <w:tc>
+          <w:tcPr>
+            <w:tcW w:w="3798" w:type="dxa"/>
+          </w:tcPr>
+          <w:p>
+            <w:pPr>
+              <w:rPr>
+                <w:rFonts w:ascii="Calibri" w:hAnsi="Calibri" w:cs="Calibri"/>
+              </w:rPr>
+            </w:pPr>
+            <w:r>
+              <w:rPr>
+                <w:rFonts w:ascii="Calibri" w:hAnsi="Calibri" w:cs="Calibri"/>
+              </w:rPr>
+              <w:t xml:space="preserve">Nadgodziny – bez zgody</w:t>
+            </w:r>
+          </w:p>
+        </w:tc>
+        <w:tc>
+          <w:tcPr>
+            <w:tcW w:w="3527" w:type="dxa"/>
+          </w:tcPr>
+          <w:p>
+            <w:pPr>
+              <w:rPr>
+                <w:rFonts w:ascii="Calibri" w:hAnsi="Calibri" w:cs="Calibri"/>
+              </w:rPr>
+            </w:pPr>
+            <w:r>
+              <w:rPr>
+                <w:rFonts w:ascii="Calibri" w:hAnsi="Calibri" w:cs="Calibri"/>
+              </w:rPr>
+              <w:t xml:space="preserve">Jak w pkt 1.</w:t>
+            </w:r>
+          </w:p>
+          <w:p>
+            <w:pPr>
+              <w:rPr>
+                <w:rFonts w:ascii="Calibri" w:hAnsi="Calibri" w:cs="Calibri"/>
+              </w:rPr>
+            </w:pPr>
+            <w:r>
+              <w:rPr>
+                <w:rFonts w:ascii="Calibri" w:hAnsi="Calibri" w:cs="Calibri"/>
+              </w:rPr>
+              <w:t xml:space="preserve">Czas pracy: Praca w normie 6:00, Praca poza normą 2:00 (razem 8:00)</w:t>
+            </w:r>
+          </w:p>
+        </w:tc>
+        <w:tc>
+          <w:tcPr>
+            <w:tcW w:w="1761" w:type="dxa"/>
+          </w:tcPr>
+          <w:p>
+            <w:pPr>
+              <w:rPr>
+                <w:rFonts w:ascii="Calibri" w:hAnsi="Calibri" w:cs="Calibri"/>
+              </w:rPr>
+            </w:pPr>
+            <w:r>
+              <w:rPr>
+                <w:rFonts w:ascii="Calibri" w:hAnsi="Calibri" w:cs="Calibri"/>
+              </w:rPr>
+              <w:t xml:space="preserve">Ostrzeżenie – zapis możliwy (nadgodziny 1:00)</w:t>
+            </w:r>
+          </w:p>
+        </w:tc>
+      </w:tr>
+      <w:tr>
+        <w:tc>
+          <w:tcPr>
+            <w:tcW w:w="561" w:type="dxa"/>
+          </w:tcPr>
+          <w:p>
+            <w:pPr>
+              <w:rPr>
+                <w:rFonts w:ascii="Calibri" w:hAnsi="Calibri" w:cs="Calibri"/>
+              </w:rPr>
+            </w:pPr>
+            <w:r>
+              <w:rPr>
+                <w:rFonts w:ascii="Calibri" w:hAnsi="Calibri" w:cs="Calibri"/>
+              </w:rPr>
+              <w:t xml:space="preserve">3</w:t>
+            </w:r>
+          </w:p>
+        </w:tc>
+        <w:tc>
+          <w:tcPr>
+            <w:tcW w:w="3798" w:type="dxa"/>
+          </w:tcPr>
+          <w:p>
+            <w:pPr>
+              <w:rPr>
+                <w:rFonts w:ascii="Calibri" w:hAnsi="Calibri" w:cs="Calibri"/>
+              </w:rPr>
+            </w:pPr>
+            <w:r>
+              <w:rPr>
+                <w:rFonts w:ascii="Calibri" w:hAnsi="Calibri" w:cs="Calibri"/>
+              </w:rPr>
+              <w:t xml:space="preserve">Praca w dniu wolnym – bez zgody</w:t>
+            </w:r>
+          </w:p>
+        </w:tc>
+        <w:tc>
+          <w:tcPr>
+            <w:tcW w:w="3527" w:type="dxa"/>
+          </w:tcPr>
+          <w:p>
+            <w:pPr>
+              <w:rPr>
+                <w:rFonts w:ascii="Calibri" w:hAnsi="Calibri" w:cs="Calibri"/>
+              </w:rPr>
+            </w:pPr>
+            <w:r>
+              <w:rPr>
+                <w:rFonts w:ascii="Calibri" w:hAnsi="Calibri" w:cs="Calibri"/>
+              </w:rPr>
+              <w:t xml:space="preserve">Orzeczenie PFRON – znaczny; zgody niezaznaczone.</w:t>
+            </w:r>
+          </w:p>
+          <w:p>
+            <w:pPr>
+              <w:rPr>
+                <w:rFonts w:ascii="Calibri" w:hAnsi="Calibri" w:cs="Calibri"/>
+              </w:rPr>
+            </w:pPr>
+            <w:r>
+              <w:rPr>
+                <w:rFonts w:ascii="Calibri" w:hAnsi="Calibri" w:cs="Calibri"/>
+              </w:rPr>
+              <w:t xml:space="preserve">Kalendarz: Podstawowy system_1_8:15_N (norma 7:00, pora nocna 22:00–6:00).</w:t>
+            </w:r>
+          </w:p>
+          <w:p>
+            <w:pPr>
+              <w:rPr>
+                <w:rFonts w:ascii="Calibri" w:hAnsi="Calibri" w:cs="Calibri"/>
+              </w:rPr>
+            </w:pPr>
+            <w:r>
+              <w:rPr>
+                <w:rFonts w:ascii="Calibri" w:hAnsi="Calibri" w:cs="Calibri"/>
+              </w:rPr>
+              <w:t xml:space="preserve">Sobota 07.11.2026 (wolny wg planu). Czas pracy: Praca poza normą 8:00–12:00</w:t>
+            </w:r>
+          </w:p>
+        </w:tc>
+        <w:tc>
+          <w:tcPr>
+            <w:tcW w:w="1761" w:type="dxa"/>
+          </w:tcPr>
+          <w:p>
+            <w:pPr>
+              <w:rPr>
+                <w:rFonts w:ascii="Calibri" w:hAnsi="Calibri" w:cs="Calibri"/>
+              </w:rPr>
+            </w:pPr>
+            <w:r>
+              <w:rPr>
+                <w:rFonts w:ascii="Calibri" w:hAnsi="Calibri" w:cs="Calibri"/>
+              </w:rPr>
+              <w:t xml:space="preserve">Ostrzeżenie – każda praca w dniu wolnym (nadgodziny 4:00)</w:t>
+            </w:r>
+          </w:p>
+        </w:tc>
+      </w:tr>
+      <w:tr>
+        <w:tc>
+          <w:tcPr>
+            <w:tcW w:w="561" w:type="dxa"/>
+          </w:tcPr>
+          <w:p>
+            <w:pPr>
+              <w:rPr>
+                <w:rFonts w:ascii="Calibri" w:hAnsi="Calibri" w:cs="Calibri"/>
+              </w:rPr>
+            </w:pPr>
+            <w:r>
+              <w:rPr>
+                <w:rFonts w:ascii="Calibri" w:hAnsi="Calibri" w:cs="Calibri"/>
+              </w:rPr>
+              <w:t xml:space="preserve">4</w:t>
+            </w:r>
+          </w:p>
+        </w:tc>
+        <w:tc>
+          <w:tcPr>
+            <w:tcW w:w="3798" w:type="dxa"/>
+          </w:tcPr>
+          <w:p>
+            <w:pPr>
+              <w:rPr>
+                <w:rFonts w:ascii="Calibri" w:hAnsi="Calibri" w:cs="Calibri"/>
+              </w:rPr>
+            </w:pPr>
+            <w:r>
+              <w:rPr>
+                <w:rFonts w:ascii="Calibri" w:hAnsi="Calibri" w:cs="Calibri"/>
+              </w:rPr>
+              <w:t xml:space="preserve">Nadgodziny – stopień lekki</w:t>
+            </w:r>
+          </w:p>
+        </w:tc>
+        <w:tc>
+          <w:tcPr>
+            <w:tcW w:w="3527" w:type="dxa"/>
+          </w:tcPr>
+          <w:p>
+            <w:pPr>
+              <w:rPr>
+                <w:rFonts w:ascii="Calibri" w:hAnsi="Calibri" w:cs="Calibri"/>
+              </w:rPr>
+            </w:pPr>
+            <w:r>
+              <w:rPr>
+                <w:rFonts w:ascii="Calibri" w:hAnsi="Calibri" w:cs="Calibri"/>
+              </w:rPr>
+              <w:t xml:space="preserve">Orzeczenie PFRON – lekki; zgody niezaznaczone.</w:t>
+            </w:r>
+          </w:p>
+          <w:p>
+            <w:pPr>
+              <w:rPr>
+                <w:rFonts w:ascii="Calibri" w:hAnsi="Calibri" w:cs="Calibri"/>
+              </w:rPr>
+            </w:pPr>
+            <w:r>
+              <w:rPr>
+                <w:rFonts w:ascii="Calibri" w:hAnsi="Calibri" w:cs="Calibri"/>
+              </w:rPr>
+              <w:t xml:space="preserve">Kalendarz: Podstawowy system_1_8:16_N (norma 8:00, pora nocna 22:00–6:00).</w:t>
+            </w:r>
+          </w:p>
+          <w:p>
+            <w:pPr>
+              <w:rPr>
+                <w:rFonts w:ascii="Calibri" w:hAnsi="Calibri" w:cs="Calibri"/>
+              </w:rPr>
+            </w:pPr>
+            <w:r>
+              <w:rPr>
+                <w:rFonts w:ascii="Calibri" w:hAnsi="Calibri" w:cs="Calibri"/>
+              </w:rPr>
+              <w:t xml:space="preserve">Plan 02.11.2026: 8:00. Czas pracy: Praca w normie 8:00, Praca poza normą 1:00</w:t>
+            </w:r>
+          </w:p>
+        </w:tc>
+        <w:tc>
+          <w:tcPr>
+            <w:tcW w:w="1761" w:type="dxa"/>
+          </w:tcPr>
+          <w:p>
+            <w:pPr>
+              <w:rPr>
+                <w:rFonts w:ascii="Calibri" w:hAnsi="Calibri" w:cs="Calibri"/>
+              </w:rPr>
+            </w:pPr>
+            <w:r>
+              <w:rPr>
+                <w:rFonts w:ascii="Calibri" w:hAnsi="Calibri" w:cs="Calibri"/>
+              </w:rPr>
+              <w:t xml:space="preserve">Ostrzeżenie (nadgodziny 1:00, limit 8:00)</w:t>
+            </w:r>
+          </w:p>
+        </w:tc>
+      </w:tr>
+      <w:tr>
+        <w:tc>
+          <w:tcPr>
+            <w:tcW w:w="561" w:type="dxa"/>
+          </w:tcPr>
+          <w:p>
+            <w:pPr>
+              <w:rPr>
+                <w:rFonts w:ascii="Calibri" w:hAnsi="Calibri" w:cs="Calibri"/>
+              </w:rPr>
+            </w:pPr>
+            <w:r>
+              <w:rPr>
+                <w:rFonts w:ascii="Calibri" w:hAnsi="Calibri" w:cs="Calibri"/>
+              </w:rPr>
+              <w:t xml:space="preserve">5</w:t>
+            </w:r>
+          </w:p>
+        </w:tc>
+        <w:tc>
+          <w:tcPr>
+            <w:tcW w:w="3798" w:type="dxa"/>
+          </w:tcPr>
+          <w:p>
+            <w:pPr>
+              <w:rPr>
+                <w:rFonts w:ascii="Calibri" w:hAnsi="Calibri" w:cs="Calibri"/>
+              </w:rPr>
+            </w:pPr>
+            <w:r>
+              <w:rPr>
+                <w:rFonts w:ascii="Calibri" w:hAnsi="Calibri" w:cs="Calibri"/>
+              </w:rPr>
+              <w:t xml:space="preserve">Nadgodziny – ze zgodą</w:t>
+            </w:r>
+          </w:p>
+        </w:tc>
+        <w:tc>
+          <w:tcPr>
+            <w:tcW w:w="3527" w:type="dxa"/>
+          </w:tcPr>
+          <w:p>
+            <w:pPr>
+              <w:rPr>
+                <w:rFonts w:ascii="Calibri" w:hAnsi="Calibri" w:cs="Calibri"/>
+              </w:rPr>
+            </w:pPr>
+            <w:r>
+              <w:rPr>
+                <w:rFonts w:ascii="Calibri" w:hAnsi="Calibri" w:cs="Calibri"/>
+              </w:rPr>
+              <w:t xml:space="preserve">Orzeczenie PFRON – umiarkowany; zgoda na pracę w nadgodzinach zaznaczona.</w:t>
+            </w:r>
+          </w:p>
+          <w:p>
+            <w:pPr>
+              <w:rPr>
+                <w:rFonts w:ascii="Calibri" w:hAnsi="Calibri" w:cs="Calibri"/>
+              </w:rPr>
+            </w:pPr>
+            <w:r>
+              <w:rPr>
+                <w:rFonts w:ascii="Calibri" w:hAnsi="Calibri" w:cs="Calibri"/>
+              </w:rPr>
+              <w:t xml:space="preserve">Kalendarz: Podstawowy system_1_8:16_N (norma 8:00, pora nocna 22:00–6:00).</w:t>
+            </w:r>
+          </w:p>
+          <w:p>
+            <w:pPr>
+              <w:rPr>
+                <w:rFonts w:ascii="Calibri" w:hAnsi="Calibri" w:cs="Calibri"/>
+              </w:rPr>
+            </w:pPr>
+            <w:r>
+              <w:rPr>
+                <w:rFonts w:ascii="Calibri" w:hAnsi="Calibri" w:cs="Calibri"/>
+              </w:rPr>
+              <w:t xml:space="preserve">Plan 02.11.2026: 8:00. Czas pracy: Praca w normie 8:00, Praca poza normą 1:00</w:t>
+            </w:r>
+          </w:p>
+        </w:tc>
+        <w:tc>
+          <w:tcPr>
+            <w:tcW w:w="1761" w:type="dxa"/>
+          </w:tcPr>
+          <w:p>
+            <w:pPr>
+              <w:rPr>
+                <w:rFonts w:ascii="Calibri" w:hAnsi="Calibri" w:cs="Calibri"/>
+              </w:rPr>
+            </w:pPr>
+            <w:r>
+              <w:rPr>
+                <w:rFonts w:ascii="Calibri" w:hAnsi="Calibri" w:cs="Calibri"/>
+              </w:rPr>
+              <w:t xml:space="preserve">Brak ostrzeżenia</w:t>
+            </w:r>
+          </w:p>
+        </w:tc>
+      </w:tr>
+      <w:tr>
+        <w:tc>
+          <w:tcPr>
+            <w:tcW w:w="561" w:type="dxa"/>
+          </w:tcPr>
+          <w:p>
+            <w:pPr>
+              <w:rPr>
+                <w:rFonts w:ascii="Calibri" w:hAnsi="Calibri" w:cs="Calibri"/>
+              </w:rPr>
+            </w:pPr>
+            <w:r>
+              <w:rPr>
+                <w:rFonts w:ascii="Calibri" w:hAnsi="Calibri" w:cs="Calibri"/>
+              </w:rPr>
+              <w:t xml:space="preserve">6</w:t>
+            </w:r>
+          </w:p>
+        </w:tc>
+        <w:tc>
+          <w:tcPr>
+            <w:tcW w:w="3798" w:type="dxa"/>
+          </w:tcPr>
+          <w:p>
+            <w:pPr>
+              <w:rPr>
+                <w:rFonts w:ascii="Calibri" w:hAnsi="Calibri" w:cs="Calibri"/>
+              </w:rPr>
+            </w:pPr>
+            <w:r>
+              <w:rPr>
+                <w:rFonts w:ascii="Calibri" w:hAnsi="Calibri" w:cs="Calibri"/>
+              </w:rPr>
+              <w:t xml:space="preserve">Nadgodziny – bez orzeczenia</w:t>
+            </w:r>
+          </w:p>
+        </w:tc>
+        <w:tc>
+          <w:tcPr>
+            <w:tcW w:w="3527" w:type="dxa"/>
+          </w:tcPr>
+          <w:p>
+            <w:pPr>
+              <w:rPr>
+                <w:rFonts w:ascii="Calibri" w:hAnsi="Calibri" w:cs="Calibri"/>
+              </w:rPr>
+            </w:pPr>
+            <w:r>
+              <w:rPr>
+                <w:rFonts w:ascii="Calibri" w:hAnsi="Calibri" w:cs="Calibri"/>
+              </w:rPr>
+              <w:t xml:space="preserve">Brak orzeczeń.</w:t>
+            </w:r>
+          </w:p>
+          <w:p>
+            <w:pPr>
+              <w:rPr>
+                <w:rFonts w:ascii="Calibri" w:hAnsi="Calibri" w:cs="Calibri"/>
+              </w:rPr>
+            </w:pPr>
+            <w:r>
+              <w:rPr>
+                <w:rFonts w:ascii="Calibri" w:hAnsi="Calibri" w:cs="Calibri"/>
+              </w:rPr>
+              <w:t xml:space="preserve">Kalendarz: Podstawowy system_1_8:16_N (norma 8:00, pora nocna 22:00–6:00).</w:t>
+            </w:r>
+          </w:p>
+          <w:p>
+            <w:pPr>
+              <w:rPr>
+                <w:rFonts w:ascii="Calibri" w:hAnsi="Calibri" w:cs="Calibri"/>
+              </w:rPr>
+            </w:pPr>
+            <w:r>
+              <w:rPr>
+                <w:rFonts w:ascii="Calibri" w:hAnsi="Calibri" w:cs="Calibri"/>
+              </w:rPr>
+              <w:t xml:space="preserve">Czas pracy jak w pkt 5</w:t>
+            </w:r>
+          </w:p>
+        </w:tc>
+        <w:tc>
+          <w:tcPr>
+            <w:tcW w:w="1761" w:type="dxa"/>
+          </w:tcPr>
+          <w:p>
+            <w:pPr>
+              <w:rPr>
+                <w:rFonts w:ascii="Calibri" w:hAnsi="Calibri" w:cs="Calibri"/>
+              </w:rPr>
+            </w:pPr>
+            <w:r>
+              <w:rPr>
+                <w:rFonts w:ascii="Calibri" w:hAnsi="Calibri" w:cs="Calibri"/>
+              </w:rPr>
+              <w:t xml:space="preserve">Brak ostrzeżenia</w:t>
+            </w:r>
+          </w:p>
+        </w:tc>
+      </w:tr>
+    </w:tbl>
+    <w:p>
+      <w:pPr>
+        <w:rPr>
+          <w:rFonts w:ascii="Calibri" w:hAnsi="Calibri" w:cs="Calibri"/>
+        </w:rPr>
+      </w:pPr>
+    </w:p>
+    <w:p>
+      <w:pPr>
+        <w:rPr>
+          <w:rFonts w:ascii="Calibri" w:hAnsi="Calibri" w:cs="Calibri"/>
+        </w:rPr>
+      </w:pPr>
+    </w:p>
     <w:sectPr>
       <w:pgSz w:w="11906" w:h="16838"/>
       <w:pgMar w:top="1417" w:right="1417" w:bottom="1417" w:left="1417" w:header="708" w:footer="708" w:gutter="0"/>
@@ -9024,6 +12967,30 @@
     </w:lvlOverride>
   </w:num>
   <w:num w:numId="10" w16cid:durableId="1890722997">
+    <w:abstractNumId w:val="3"/>
+    <w:lvlOverride w:ilvl="0">
+      <w:startOverride w:val="1"/>
+    </w:lvlOverride>
+  </w:num>
+  <w:num w:numId="11" w16cid:durableId="624797297">
+    <w:abstractNumId w:val="3"/>
+    <w:lvlOverride w:ilvl="0">
+      <w:startOverride w:val="1"/>
+    </w:lvlOverride>
+  </w:num>
+  <w:num w:numId="12" w16cid:durableId="1410220145">
+    <w:abstractNumId w:val="3"/>
+    <w:lvlOverride w:ilvl="0">
+      <w:startOverride w:val="1"/>
+    </w:lvlOverride>
+  </w:num>
+  <w:num w:numId="13" w16cid:durableId="359370797">
+    <w:abstractNumId w:val="3"/>
+    <w:lvlOverride w:ilvl="0">
+      <w:startOverride w:val="1"/>
+    </w:lvlOverride>
+  </w:num>
+  <w:num w:numId="14" w16cid:durableId="1419009480">
     <w:abstractNumId w:val="3"/>
     <w:lvlOverride w:ilvl="0">
       <w:startOverride w:val="1"/>

</xml_diff>

<commit_message>
Weryfikatory 3070/3071 (Al): test live 19.10.2026 - wszystkie scenariusze pozytywne; arkusz 'Norma tygodniowa 35-40h', sekcje w Instrukcja_Weryfikatory.docx (opis, konfiguracja, komunikaty, scenariusze); decyzja: Blad przy kalendarzu podstawowym
Co-Authored-By: Claude Opus 5.5 <noreply@anthropic.com>
Claude-Session: https://claude.ai/code/session_01JXMhWf2ag4PGnQHt13HR9W
</commit_message>
<xml_diff>
--- a/Weryfikatory czasu pracy/Instrukcja_Weryfikatory.docx
+++ b/Weryfikatory czasu pracy/Instrukcja_Weryfikatory.docx
@@ -12245,6 +12245,2064 @@
                 <w:rFonts w:ascii="Calibri" w:hAnsi="Calibri" w:cs="Calibri"/>
               </w:rPr>
               <w:t xml:space="preserve">Brak ostrzeżenia</w:t>
+            </w:r>
+          </w:p>
+        </w:tc>
+      </w:tr>
+    </w:tbl>
+    <w:p>
+      <w:pPr>
+        <w:rPr>
+          <w:rFonts w:ascii="Calibri" w:hAnsi="Calibri" w:cs="Calibri"/>
+        </w:rPr>
+      </w:pPr>
+    </w:p>
+    <w:p>
+      <w:pPr>
+        <w:rPr>
+          <w:rFonts w:ascii="Calibri" w:hAnsi="Calibri" w:cs="Calibri"/>
+        </w:rPr>
+      </w:pPr>
+    </w:p>
+    <w:p>
+      <w:pPr>
+        <w:pStyle w:val="Nagwek1"/>
+        <w:jc w:val="center"/>
+        <w:rPr>
+          <w:rFonts w:ascii="Calibri" w:hAnsi="Calibri" w:cs="Calibri"/>
+        </w:rPr>
+      </w:pPr>
+      <w:bookmarkStart w:id="10" w:name="_Toc242434900"/>
+      <w:r>
+        <w:rPr>
+          <w:rFonts w:ascii="Calibri" w:hAnsi="Calibri" w:cs="Calibri"/>
+        </w:rPr>
+        <w:t xml:space="preserve">Weryfikator A1_Norma tygodniowa niepełnosprawnych</w:t>
+      </w:r>
+      <w:bookmarkEnd w:id="10"/>
+    </w:p>
+    <w:p>
+      <w:pPr>
+        <w:rPr>
+          <w:rFonts w:ascii="Calibri" w:hAnsi="Calibri" w:cs="Calibri"/>
+        </w:rPr>
+      </w:pPr>
+    </w:p>
+    <w:p>
+      <w:pPr>
+        <w:jc w:val="both"/>
+        <w:rPr>
+          <w:rFonts w:ascii="Calibri" w:hAnsi="Calibri" w:cs="Calibri"/>
+        </w:rPr>
+      </w:pPr>
+      <w:r>
+        <w:rPr>
+          <w:rFonts w:ascii="Calibri" w:hAnsi="Calibri" w:cs="Calibri"/>
+        </w:rPr>
+        <w:t xml:space="preserve">Weryfikator pilnuje tygodniowej normy czasu pracy pracownika z orzeczonym stopniem niepełnosprawności. Zapis planu przekraczającego normę jest blokowany.</w:t>
+      </w:r>
+    </w:p>
+    <w:p>
+      <w:pPr>
+        <w:jc w:val="both"/>
+        <w:rPr>
+          <w:rFonts w:ascii="Calibri" w:hAnsi="Calibri" w:cs="Calibri"/>
+        </w:rPr>
+      </w:pPr>
+      <w:r>
+        <w:rPr>
+          <w:rFonts w:ascii="Calibri" w:hAnsi="Calibri" w:cs="Calibri"/>
+        </w:rPr>
+        <w:t xml:space="preserve">Norma pracownika:</w:t>
+      </w:r>
+    </w:p>
+    <w:p>
+      <w:pPr>
+        <w:jc w:val="both"/>
+        <w:rPr>
+          <w:rFonts w:ascii="Calibri" w:hAnsi="Calibri" w:cs="Calibri"/>
+        </w:rPr>
+      </w:pPr>
+      <w:r>
+        <w:rPr>
+          <w:rFonts w:ascii="Calibri" w:hAnsi="Calibri" w:cs="Calibri"/>
+        </w:rPr>
+        <w:t xml:space="preserve">- stopień umiarkowany lub znaczny bez zaznaczonego na etacie pola „Zgoda na pracę 8h” – 35 godzin tygodniowo (7 godzin na dobę),</w:t>
+      </w:r>
+    </w:p>
+    <w:p>
+      <w:pPr>
+        <w:jc w:val="both"/>
+        <w:rPr>
+          <w:rFonts w:ascii="Calibri" w:hAnsi="Calibri" w:cs="Calibri"/>
+        </w:rPr>
+      </w:pPr>
+      <w:r>
+        <w:rPr>
+          <w:rFonts w:ascii="Calibri" w:hAnsi="Calibri" w:cs="Calibri"/>
+        </w:rPr>
+        <w:t xml:space="preserve">- stopień lekki oraz stopień umiarkowany lub znaczny ze zgodą na pracę 8h – 40 godzin tygodniowo (8 godzin na dobę).</w:t>
+      </w:r>
+    </w:p>
+    <w:p>
+      <w:pPr>
+        <w:jc w:val="both"/>
+        <w:rPr>
+          <w:rFonts w:ascii="Calibri" w:hAnsi="Calibri" w:cs="Calibri"/>
+        </w:rPr>
+      </w:pPr>
+      <w:r>
+        <w:rPr>
+          <w:rFonts w:ascii="Calibri" w:hAnsi="Calibri" w:cs="Calibri"/>
+        </w:rPr>
+        <w:t xml:space="preserve">Stopień niepełnosprawności ustalany jest dla każdego dnia osobno – z orzeczenia o niepełnosprawności (PFRON) albo o niezdolności do pracy (ZUS) obowiązującego w tym dniu; gdy obowiązują oba, brany jest wyższy stopień. Zgoda czytana jest z etatu w zapisie historii obowiązującym w danym dniu. Pracownicy bez orzeczenia nie są sprawdzani.</w:t>
+      </w:r>
+    </w:p>
+    <w:p>
+      <w:pPr>
+        <w:jc w:val="both"/>
+        <w:rPr>
+          <w:rFonts w:ascii="Calibri" w:hAnsi="Calibri" w:cs="Calibri"/>
+        </w:rPr>
+      </w:pPr>
+      <w:r>
+        <w:rPr>
+          <w:rFonts w:ascii="Calibri" w:hAnsi="Calibri" w:cs="Calibri"/>
+        </w:rPr>
+        <w:t xml:space="preserve">Tydzień to 7 kolejnych dni liczonych od pierwszego dnia okresu rozliczeniowego (art. 128 § 3 pkt 1 Kodeksu pracy), a nie tydzień od poniedziałku do niedzieli. Przy okresie kilkumiesięcznym tygodnie biegną dalej przez kolejne miesiące, a ostatni tydzień okresu może być niepełny.</w:t>
+      </w:r>
+    </w:p>
+    <w:p>
+      <w:pPr>
+        <w:jc w:val="both"/>
+        <w:rPr>
+          <w:rFonts w:ascii="Calibri" w:hAnsi="Calibri" w:cs="Calibri"/>
+        </w:rPr>
+      </w:pPr>
+      <w:r>
+        <w:rPr>
+          <w:rFonts w:ascii="Calibri" w:hAnsi="Calibri" w:cs="Calibri"/>
+        </w:rPr>
+        <w:t xml:space="preserve">Sposób liczenia zależy od kalendarza na etacie:</w:t>
+      </w:r>
+    </w:p>
+    <w:p>
+      <w:pPr>
+        <w:jc w:val="both"/>
+        <w:rPr>
+          <w:rFonts w:ascii="Calibri" w:hAnsi="Calibri" w:cs="Calibri"/>
+        </w:rPr>
+      </w:pPr>
+      <w:r>
+        <w:rPr>
+          <w:rFonts w:ascii="Calibri" w:hAnsi="Calibri" w:cs="Calibri"/>
+        </w:rPr>
+        <w:t xml:space="preserve">- kalendarz z podstawowym czasem pracy (także zadaniowy) – sztywno: w każdym tygodniu plan nie może przekroczyć 35/40 godzin, a w całym okresie rozliczeniowym – wymiaru czasu pracy,</w:t>
+      </w:r>
+    </w:p>
+    <w:p>
+      <w:pPr>
+        <w:jc w:val="both"/>
+        <w:rPr>
+          <w:rFonts w:ascii="Calibri" w:hAnsi="Calibri" w:cs="Calibri"/>
+        </w:rPr>
+      </w:pPr>
+      <w:r>
+        <w:rPr>
+          <w:rFonts w:ascii="Calibri" w:hAnsi="Calibri" w:cs="Calibri"/>
+        </w:rPr>
+        <w:t xml:space="preserve">- kalendarz z równoważnym czasem pracy – średnio: w pojedynczym tygodniu plan może przekroczyć 35/40 godzin, ale w całym okresie rozliczeniowym nie może przekroczyć wymiaru.</w:t>
+      </w:r>
+    </w:p>
+    <w:p>
+      <w:pPr>
+        <w:jc w:val="both"/>
+        <w:rPr>
+          <w:rFonts w:ascii="Calibri" w:hAnsi="Calibri" w:cs="Calibri"/>
+        </w:rPr>
+      </w:pPr>
+      <w:r>
+        <w:rPr>
+          <w:rFonts w:ascii="Calibri" w:hAnsi="Calibri" w:cs="Calibri"/>
+        </w:rPr>
+        <w:t xml:space="preserve">Wymiar czasu pracy w okresie liczony jest jak w art. 130 Kodeksu pracy, z normą 35/7 albo 40/8: norma tygodniowa × liczba pełnych tygodni + norma dobowa × dni od poniedziałku do piątku w niepełnym tygodniu − norma dobowa × święta przypadające w dniu innym niż niedziela. Przykład: październik 2026 – 154 godziny (35h) albo 176 godzin (40h); wrzesień–listopad 2026 – 448 godzin (35h, z odliczeniem 11 listopada).</w:t>
+      </w:r>
+    </w:p>
+    <w:p>
+      <w:pPr>
+        <w:jc w:val="both"/>
+        <w:rPr>
+          <w:rFonts w:ascii="Calibri" w:hAnsi="Calibri" w:cs="Calibri"/>
+        </w:rPr>
+      </w:pPr>
+      <w:r>
+        <w:rPr>
+          <w:rFonts w:ascii="Calibri" w:hAnsi="Calibri" w:cs="Calibri"/>
+        </w:rPr>
+        <w:t xml:space="preserve">Gdy stopień zmienia się w trakcie okresu, norma ustalana jest dla każdego dnia osobno. W tygodniu, w którym następuje zmiana, norma tygodniowa jest średnią norm dni od poniedziałku do piątku.</w:t>
+      </w:r>
+    </w:p>
+    <w:p>
+      <w:pPr>
+        <w:jc w:val="both"/>
+        <w:rPr>
+          <w:rFonts w:ascii="Calibri" w:hAnsi="Calibri" w:cs="Calibri"/>
+        </w:rPr>
+      </w:pPr>
+      <w:r>
+        <w:rPr>
+          <w:rFonts w:ascii="Calibri" w:hAnsi="Calibri" w:cs="Calibri"/>
+        </w:rPr>
+        <w:t xml:space="preserve">Liczony jest czas planowany (plan pracy), a nie przepracowany. Weryfikator uruchamia się przy zmianie planu; zmiana kalendarza na etacie lub orzeczenia zostanie sprawdzona przy najbliższej edycji planu w danym miesiącu.</w:t>
+      </w:r>
+    </w:p>
+    <w:p>
+      <w:pPr>
+        <w:rPr>
+          <w:rFonts w:ascii="Calibri" w:hAnsi="Calibri" w:cs="Calibri"/>
+        </w:rPr>
+      </w:pPr>
+    </w:p>
+    <w:p>
+      <w:pPr>
+        <w:jc w:val="both"/>
+        <w:rPr>
+          <w:rFonts w:ascii="Calibri" w:hAnsi="Calibri" w:cs="Calibri"/>
+        </w:rPr>
+      </w:pPr>
+      <w:r>
+        <w:rPr>
+          <w:rFonts w:ascii="Calibri" w:hAnsi="Calibri" w:cs="Calibri"/>
+        </w:rPr>
+        <w:t xml:space="preserve">Weryfikator uruchamia się w momencie zmian dokonywanych na:</w:t>
+      </w:r>
+    </w:p>
+    <w:p>
+      <w:pPr>
+        <w:jc w:val="both"/>
+        <w:rPr>
+          <w:rFonts w:ascii="Calibri" w:hAnsi="Calibri" w:cs="Calibri"/>
+        </w:rPr>
+      </w:pPr>
+      <w:r>
+        <w:rPr>
+          <w:rFonts w:ascii="Calibri" w:hAnsi="Calibri" w:cs="Calibri"/>
+        </w:rPr>
+        <w:t xml:space="preserve">- Kalendarz/Norma czasu pracy w wersji okienkowej</w:t>
+      </w:r>
+    </w:p>
+    <w:p>
+      <w:pPr>
+        <w:jc w:val="both"/>
+        <w:rPr>
+          <w:rFonts w:ascii="Calibri" w:hAnsi="Calibri" w:cs="Calibri"/>
+        </w:rPr>
+      </w:pPr>
+      <w:r>
+        <w:rPr>
+          <w:rFonts w:ascii="Calibri" w:hAnsi="Calibri" w:cs="Calibri"/>
+        </w:rPr>
+        <w:t xml:space="preserve">- Kalendarz/Norma czasu pracy w pulpicie Kierownika</w:t>
+      </w:r>
+    </w:p>
+    <w:p>
+      <w:pPr>
+        <w:jc w:val="both"/>
+        <w:rPr>
+          <w:rFonts w:ascii="Calibri" w:hAnsi="Calibri" w:cs="Calibri"/>
+        </w:rPr>
+      </w:pPr>
+      <w:r>
+        <w:rPr>
+          <w:rFonts w:ascii="Calibri" w:hAnsi="Calibri" w:cs="Calibri"/>
+        </w:rPr>
+        <w:t xml:space="preserve">- na Zestawieniu czasu pracy w pulpicie Kierownika</w:t>
+      </w:r>
+    </w:p>
+    <w:p>
+      <w:pPr>
+        <w:rPr>
+          <w:rFonts w:ascii="Calibri" w:hAnsi="Calibri" w:cs="Calibri"/>
+        </w:rPr>
+      </w:pPr>
+    </w:p>
+    <w:p>
+      <w:pPr>
+        <w:pStyle w:val="Akapitzlist"/>
+        <w:numPr>
+          <w:ilvl w:val="0"/>
+          <w:numId w:val="15"/>
+        </w:numPr>
+        <w:ind w:left="360"/>
+        <w:rPr>
+          <w:rFonts w:ascii="Calibri" w:hAnsi="Calibri" w:cs="Calibri"/>
+          <w:sz w:val="28"/>
+          <w:szCs w:val="28"/>
+        </w:rPr>
+      </w:pPr>
+      <w:r>
+        <w:rPr>
+          <w:rFonts w:ascii="Calibri" w:hAnsi="Calibri" w:cs="Calibri"/>
+          <w:sz w:val="28"/>
+          <w:szCs w:val="28"/>
+        </w:rPr>
+        <w:t xml:space="preserve">Konfiguracja</w:t>
+      </w:r>
+    </w:p>
+    <w:p>
+      <w:pPr>
+        <w:jc w:val="both"/>
+        <w:rPr>
+          <w:rFonts w:ascii="Calibri" w:hAnsi="Calibri" w:cs="Calibri"/>
+        </w:rPr>
+      </w:pPr>
+      <w:r>
+        <w:rPr>
+          <w:rFonts w:ascii="Calibri" w:hAnsi="Calibri" w:cs="Calibri"/>
+        </w:rPr>
+        <w:t xml:space="preserve">Algorytm weryfikatora zapisany jest w konfiguracji systemu Narzędzia/Opcje/Systemowe/Dodatkowy kod do kompilacji – plik o nazwie A1WeryfikatoryKalendarza. Wywołanie algorytmu odbywa się w Definicji weryfikatorów kalendarza „A1_Norma tygodniowa niepełnosprawnych” (rodzaj: Plan pracy).</w:t>
+      </w:r>
+    </w:p>
+    <w:p>
+      <w:pPr>
+        <w:jc w:val="both"/>
+        <w:rPr>
+          <w:rFonts w:ascii="Calibri" w:hAnsi="Calibri" w:cs="Calibri"/>
+        </w:rPr>
+      </w:pPr>
+      <w:r>
+        <w:rPr>
+          <w:rFonts w:ascii="Calibri" w:hAnsi="Calibri" w:cs="Calibri"/>
+        </w:rPr>
+        <w:t xml:space="preserve">Weryfikator można włączyć na dowolnej definicji Kalendarza w zakładce Weryfikatory. Na bazie testowej podpięty jako Błąd do kalendarzy „3 miesięczny”, „Podstawowy system_1_8:16” oraz do kalendarzy klienta (w tym wersji z dopiskiem _N dla osób z niepełnosprawnością).</w:t>
+      </w:r>
+    </w:p>
+    <w:p>
+      <w:pPr>
+        <w:jc w:val="both"/>
+        <w:rPr>
+          <w:rFonts w:ascii="Calibri" w:hAnsi="Calibri" w:cs="Calibri"/>
+        </w:rPr>
+      </w:pPr>
+      <w:r>
+        <w:rPr>
+          <w:rFonts w:ascii="Calibri" w:hAnsi="Calibri" w:cs="Calibri"/>
+        </w:rPr>
+        <w:t xml:space="preserve">Poziom (Błąd albo Ostrzeżenie) można zmienić dla każdego kalendarza w zakładce Weryfikatory, bez zmian w algorytmie.</w:t>
+      </w:r>
+    </w:p>
+    <w:p>
+      <w:pPr>
+        <w:jc w:val="both"/>
+        <w:rPr>
+          <w:rFonts w:ascii="Calibri" w:hAnsi="Calibri" w:cs="Calibri"/>
+        </w:rPr>
+      </w:pPr>
+      <w:r>
+        <w:rPr>
+          <w:rFonts w:ascii="Calibri" w:hAnsi="Calibri" w:cs="Calibri"/>
+        </w:rPr>
+        <w:t xml:space="preserve">Komunikat:</w:t>
+      </w:r>
+    </w:p>
+    <w:p>
+      <w:pPr>
+        <w:jc w:val="both"/>
+        <w:rPr>
+          <w:rFonts w:ascii="Calibri" w:hAnsi="Calibri" w:cs="Calibri"/>
+        </w:rPr>
+      </w:pPr>
+      <w:r>
+        <w:rPr>
+          <w:rFonts w:ascii="Calibri" w:hAnsi="Calibri" w:cs="Calibri"/>
+        </w:rPr>
+        <w:t xml:space="preserve">Dla tygodnia: Przekroczono tygodniową normę (norma) osoby z niepełnosprawnością w tygodniu (od...do) okresu rozliczeniowego - zaplanowano (plan) - (pracownik)</w:t>
+      </w:r>
+    </w:p>
+    <w:p>
+      <w:pPr>
+        <w:jc w:val="both"/>
+        <w:rPr>
+          <w:rFonts w:ascii="Calibri" w:hAnsi="Calibri" w:cs="Calibri"/>
+        </w:rPr>
+      </w:pPr>
+      <w:r>
+        <w:rPr>
+          <w:rFonts w:ascii="Calibri" w:hAnsi="Calibri" w:cs="Calibri"/>
+        </w:rPr>
+        <w:t xml:space="preserve">Dla okresu: Zaplanowany czas pracy (plan) przekracza wymiar (wymiar) osoby z niepełnosprawnością o (nadwyżka) w okresie rozliczeniowym (okres) - (pracownik)</w:t>
+      </w:r>
+    </w:p>
+    <w:p>
+      <w:pPr>
+        <w:rPr>
+          <w:rFonts w:ascii="Calibri" w:hAnsi="Calibri" w:cs="Calibri"/>
+        </w:rPr>
+      </w:pPr>
+    </w:p>
+    <w:p>
+      <w:pPr>
+        <w:pStyle w:val="Akapitzlist"/>
+        <w:numPr>
+          <w:ilvl w:val="0"/>
+          <w:numId w:val="15"/>
+        </w:numPr>
+        <w:ind w:left="360"/>
+        <w:rPr>
+          <w:rFonts w:ascii="Calibri" w:hAnsi="Calibri" w:cs="Calibri"/>
+          <w:sz w:val="28"/>
+          <w:szCs w:val="28"/>
+        </w:rPr>
+      </w:pPr>
+      <w:r>
+        <w:rPr>
+          <w:rFonts w:ascii="Calibri" w:hAnsi="Calibri" w:cs="Calibri"/>
+          <w:sz w:val="28"/>
+          <w:szCs w:val="28"/>
+        </w:rPr>
+        <w:t xml:space="preserve">Scenariusze testowe</w:t>
+      </w:r>
+    </w:p>
+    <w:tbl>
+      <w:tblPr>
+        <w:tblStyle w:val="Tabela-Siatka"/>
+        <w:tblW w:w="9647" w:type="dxa"/>
+        <w:tblLook w:val="04A0" w:firstRow="1" w:lastRow="0" w:firstColumn="1" w:lastColumn="0" w:noHBand="0" w:noVBand="1"/>
+      </w:tblPr>
+      <w:tblGrid>
+        <w:gridCol w:w="561"/>
+        <w:gridCol w:w="3798"/>
+        <w:gridCol w:w="3527"/>
+        <w:gridCol w:w="1761"/>
+      </w:tblGrid>
+      <w:tr>
+        <w:tc>
+          <w:tcPr>
+            <w:tcW w:w="561" w:type="dxa"/>
+          </w:tcPr>
+          <w:p>
+            <w:pPr>
+              <w:rPr>
+                <w:rFonts w:ascii="Calibri" w:hAnsi="Calibri" w:cs="Calibri"/>
+              </w:rPr>
+            </w:pPr>
+            <w:proofErr w:type="spellStart"/>
+            <w:r>
+              <w:rPr>
+                <w:rFonts w:ascii="Calibri" w:hAnsi="Calibri" w:cs="Calibri"/>
+              </w:rPr>
+              <w:t>Lp</w:t>
+            </w:r>
+            <w:proofErr w:type="spellEnd"/>
+          </w:p>
+        </w:tc>
+        <w:tc>
+          <w:tcPr>
+            <w:tcW w:w="3798" w:type="dxa"/>
+          </w:tcPr>
+          <w:p>
+            <w:pPr>
+              <w:rPr>
+                <w:rFonts w:ascii="Calibri" w:hAnsi="Calibri" w:cs="Calibri"/>
+              </w:rPr>
+            </w:pPr>
+            <w:r>
+              <w:rPr>
+                <w:rFonts w:ascii="Calibri" w:hAnsi="Calibri" w:cs="Calibri"/>
+              </w:rPr>
+              <w:t>Scenariusz</w:t>
+            </w:r>
+          </w:p>
+        </w:tc>
+        <w:tc>
+          <w:tcPr>
+            <w:tcW w:w="3527" w:type="dxa"/>
+          </w:tcPr>
+          <w:p>
+            <w:pPr>
+              <w:rPr>
+                <w:rFonts w:ascii="Calibri" w:hAnsi="Calibri" w:cs="Calibri"/>
+              </w:rPr>
+            </w:pPr>
+            <w:r>
+              <w:rPr>
+                <w:rFonts w:ascii="Calibri" w:hAnsi="Calibri" w:cs="Calibri"/>
+              </w:rPr>
+              <w:t>Dane wejściowe</w:t>
+            </w:r>
+          </w:p>
+        </w:tc>
+        <w:tc>
+          <w:tcPr>
+            <w:tcW w:w="1761" w:type="dxa"/>
+          </w:tcPr>
+          <w:p>
+            <w:pPr>
+              <w:rPr>
+                <w:rFonts w:ascii="Calibri" w:hAnsi="Calibri" w:cs="Calibri"/>
+              </w:rPr>
+            </w:pPr>
+            <w:r>
+              <w:rPr>
+                <w:rFonts w:ascii="Calibri" w:hAnsi="Calibri" w:cs="Calibri"/>
+              </w:rPr>
+              <w:t>Oczekiwany wynik</w:t>
+            </w:r>
+          </w:p>
+        </w:tc>
+      </w:tr>
+      <w:tr>
+        <w:tc>
+          <w:tcPr>
+            <w:tcW w:w="561" w:type="dxa"/>
+          </w:tcPr>
+          <w:p>
+            <w:pPr>
+              <w:rPr>
+                <w:rFonts w:ascii="Calibri" w:hAnsi="Calibri" w:cs="Calibri"/>
+              </w:rPr>
+            </w:pPr>
+            <w:r>
+              <w:rPr>
+                <w:rFonts w:ascii="Calibri" w:hAnsi="Calibri" w:cs="Calibri"/>
+              </w:rPr>
+              <w:t xml:space="preserve">1</w:t>
+            </w:r>
+          </w:p>
+        </w:tc>
+        <w:tc>
+          <w:tcPr>
+            <w:tcW w:w="3798" w:type="dxa"/>
+          </w:tcPr>
+          <w:p>
+            <w:pPr>
+              <w:rPr>
+                <w:rFonts w:ascii="Calibri" w:hAnsi="Calibri" w:cs="Calibri"/>
+              </w:rPr>
+            </w:pPr>
+            <w:r>
+              <w:rPr>
+                <w:rFonts w:ascii="Calibri" w:hAnsi="Calibri" w:cs="Calibri"/>
+              </w:rPr>
+              <w:t xml:space="preserve">Podstawowy, 35h – każdy tydzień 35h</w:t>
+            </w:r>
+          </w:p>
+        </w:tc>
+        <w:tc>
+          <w:tcPr>
+            <w:tcW w:w="3527" w:type="dxa"/>
+          </w:tcPr>
+          <w:p>
+            <w:pPr>
+              <w:rPr>
+                <w:rFonts w:ascii="Calibri" w:hAnsi="Calibri" w:cs="Calibri"/>
+              </w:rPr>
+            </w:pPr>
+            <w:r>
+              <w:rPr>
+                <w:rFonts w:ascii="Calibri" w:hAnsi="Calibri" w:cs="Calibri"/>
+              </w:rPr>
+              <w:t xml:space="preserve">Orzeczenie PFRON – umiarkowany; „Zgoda na pracę 8h” niezaznaczona.</w:t>
+            </w:r>
+          </w:p>
+          <w:p>
+            <w:pPr>
+              <w:rPr>
+                <w:rFonts w:ascii="Calibri" w:hAnsi="Calibri" w:cs="Calibri"/>
+              </w:rPr>
+            </w:pPr>
+            <w:r>
+              <w:rPr>
+                <w:rFonts w:ascii="Calibri" w:hAnsi="Calibri" w:cs="Calibri"/>
+              </w:rPr>
+              <w:t xml:space="preserve">Kalendarz: Podstawowy system_1_8:15_N (norma 7:00, okres rozliczeniowy 1 miesiąc).</w:t>
+            </w:r>
+          </w:p>
+          <w:p>
+            <w:pPr>
+              <w:rPr>
+                <w:rFonts w:ascii="Calibri" w:hAnsi="Calibri" w:cs="Calibri"/>
+              </w:rPr>
+            </w:pPr>
+            <w:r>
+              <w:rPr>
+                <w:rFonts w:ascii="Calibri" w:hAnsi="Calibri" w:cs="Calibri"/>
+              </w:rPr>
+              <w:t xml:space="preserve">Plan październik 2026: pon–pt po 7:00 (razem 154:00)</w:t>
+            </w:r>
+          </w:p>
+        </w:tc>
+        <w:tc>
+          <w:tcPr>
+            <w:tcW w:w="1761" w:type="dxa"/>
+          </w:tcPr>
+          <w:p>
+            <w:pPr>
+              <w:rPr>
+                <w:rFonts w:ascii="Calibri" w:hAnsi="Calibri" w:cs="Calibri"/>
+              </w:rPr>
+            </w:pPr>
+            <w:r>
+              <w:rPr>
+                <w:rFonts w:ascii="Calibri" w:hAnsi="Calibri" w:cs="Calibri"/>
+              </w:rPr>
+              <w:t xml:space="preserve">Brak błędu</w:t>
+            </w:r>
+          </w:p>
+        </w:tc>
+      </w:tr>
+      <w:tr>
+        <w:tc>
+          <w:tcPr>
+            <w:tcW w:w="561" w:type="dxa"/>
+          </w:tcPr>
+          <w:p>
+            <w:pPr>
+              <w:rPr>
+                <w:rFonts w:ascii="Calibri" w:hAnsi="Calibri" w:cs="Calibri"/>
+              </w:rPr>
+            </w:pPr>
+            <w:r>
+              <w:rPr>
+                <w:rFonts w:ascii="Calibri" w:hAnsi="Calibri" w:cs="Calibri"/>
+              </w:rPr>
+              <w:t xml:space="preserve">2</w:t>
+            </w:r>
+          </w:p>
+        </w:tc>
+        <w:tc>
+          <w:tcPr>
+            <w:tcW w:w="3798" w:type="dxa"/>
+          </w:tcPr>
+          <w:p>
+            <w:pPr>
+              <w:rPr>
+                <w:rFonts w:ascii="Calibri" w:hAnsi="Calibri" w:cs="Calibri"/>
+              </w:rPr>
+            </w:pPr>
+            <w:r>
+              <w:rPr>
+                <w:rFonts w:ascii="Calibri" w:hAnsi="Calibri" w:cs="Calibri"/>
+              </w:rPr>
+              <w:t xml:space="preserve">Podstawowy, 35h – tydzień 36h</w:t>
+            </w:r>
+          </w:p>
+        </w:tc>
+        <w:tc>
+          <w:tcPr>
+            <w:tcW w:w="3527" w:type="dxa"/>
+          </w:tcPr>
+          <w:p>
+            <w:pPr>
+              <w:rPr>
+                <w:rFonts w:ascii="Calibri" w:hAnsi="Calibri" w:cs="Calibri"/>
+              </w:rPr>
+            </w:pPr>
+            <w:r>
+              <w:rPr>
+                <w:rFonts w:ascii="Calibri" w:hAnsi="Calibri" w:cs="Calibri"/>
+              </w:rPr>
+              <w:t xml:space="preserve">Jak w pkt 1.</w:t>
+            </w:r>
+          </w:p>
+          <w:p>
+            <w:pPr>
+              <w:rPr>
+                <w:rFonts w:ascii="Calibri" w:hAnsi="Calibri" w:cs="Calibri"/>
+              </w:rPr>
+            </w:pPr>
+            <w:r>
+              <w:rPr>
+                <w:rFonts w:ascii="Calibri" w:hAnsi="Calibri" w:cs="Calibri"/>
+              </w:rPr>
+              <w:t xml:space="preserve">Tydzień 08–14.10.2026 (czw–śr): 5 × 7:00 + sobota 10.10 1:00 = 36:00; okres razem 154:00</w:t>
+            </w:r>
+          </w:p>
+        </w:tc>
+        <w:tc>
+          <w:tcPr>
+            <w:tcW w:w="1761" w:type="dxa"/>
+          </w:tcPr>
+          <w:p>
+            <w:pPr>
+              <w:rPr>
+                <w:rFonts w:ascii="Calibri" w:hAnsi="Calibri" w:cs="Calibri"/>
+              </w:rPr>
+            </w:pPr>
+            <w:r>
+              <w:rPr>
+                <w:rFonts w:ascii="Calibri" w:hAnsi="Calibri" w:cs="Calibri"/>
+              </w:rPr>
+              <w:t xml:space="preserve">Błąd – zapis zablokowany (tydzień 8–14.10, zaplanowano 36:00)</w:t>
+            </w:r>
+          </w:p>
+        </w:tc>
+      </w:tr>
+      <w:tr>
+        <w:tc>
+          <w:tcPr>
+            <w:tcW w:w="561" w:type="dxa"/>
+          </w:tcPr>
+          <w:p>
+            <w:pPr>
+              <w:rPr>
+                <w:rFonts w:ascii="Calibri" w:hAnsi="Calibri" w:cs="Calibri"/>
+              </w:rPr>
+            </w:pPr>
+            <w:r>
+              <w:rPr>
+                <w:rFonts w:ascii="Calibri" w:hAnsi="Calibri" w:cs="Calibri"/>
+              </w:rPr>
+              <w:t xml:space="preserve">3</w:t>
+            </w:r>
+          </w:p>
+        </w:tc>
+        <w:tc>
+          <w:tcPr>
+            <w:tcW w:w="3798" w:type="dxa"/>
+          </w:tcPr>
+          <w:p>
+            <w:pPr>
+              <w:rPr>
+                <w:rFonts w:ascii="Calibri" w:hAnsi="Calibri" w:cs="Calibri"/>
+              </w:rPr>
+            </w:pPr>
+            <w:r>
+              <w:rPr>
+                <w:rFonts w:ascii="Calibri" w:hAnsi="Calibri" w:cs="Calibri"/>
+              </w:rPr>
+              <w:t xml:space="preserve">Podstawowy, okres 3-miesięczny – tydzień na przełomie miesięcy</w:t>
+            </w:r>
+          </w:p>
+        </w:tc>
+        <w:tc>
+          <w:tcPr>
+            <w:tcW w:w="3527" w:type="dxa"/>
+          </w:tcPr>
+          <w:p>
+            <w:pPr>
+              <w:rPr>
+                <w:rFonts w:ascii="Calibri" w:hAnsi="Calibri" w:cs="Calibri"/>
+              </w:rPr>
+            </w:pPr>
+            <w:r>
+              <w:rPr>
+                <w:rFonts w:ascii="Calibri" w:hAnsi="Calibri" w:cs="Calibri"/>
+              </w:rPr>
+              <w:t xml:space="preserve">Orzeczenie PFRON – znaczny; zgoda niezaznaczona.</w:t>
+            </w:r>
+          </w:p>
+          <w:p>
+            <w:pPr>
+              <w:rPr>
+                <w:rFonts w:ascii="Calibri" w:hAnsi="Calibri" w:cs="Calibri"/>
+              </w:rPr>
+            </w:pPr>
+            <w:r>
+              <w:rPr>
+                <w:rFonts w:ascii="Calibri" w:hAnsi="Calibri" w:cs="Calibri"/>
+              </w:rPr>
+              <w:t xml:space="preserve">Kalendarz podstawowy z okresem 3-miesięcznym wrzesień–listopad (początek 1.09 – wtorek).</w:t>
+            </w:r>
+          </w:p>
+          <w:p>
+            <w:pPr>
+              <w:rPr>
+                <w:rFonts w:ascii="Calibri" w:hAnsi="Calibri" w:cs="Calibri"/>
+              </w:rPr>
+            </w:pPr>
+            <w:r>
+              <w:rPr>
+                <w:rFonts w:ascii="Calibri" w:hAnsi="Calibri" w:cs="Calibri"/>
+              </w:rPr>
+              <w:t xml:space="preserve">Tydzień 29.09–5.10.2026 (wt–pn): 5 × 7:00 + sobota 3.10 1:00 = 36:00</w:t>
+            </w:r>
+          </w:p>
+        </w:tc>
+        <w:tc>
+          <w:tcPr>
+            <w:tcW w:w="1761" w:type="dxa"/>
+          </w:tcPr>
+          <w:p>
+            <w:pPr>
+              <w:rPr>
+                <w:rFonts w:ascii="Calibri" w:hAnsi="Calibri" w:cs="Calibri"/>
+              </w:rPr>
+            </w:pPr>
+            <w:r>
+              <w:rPr>
+                <w:rFonts w:ascii="Calibri" w:hAnsi="Calibri" w:cs="Calibri"/>
+              </w:rPr>
+              <w:t xml:space="preserve">Błąd – tydzień 29.09–5.10 (tygodnie nie zaczynają się od nowa 1.10)</w:t>
+            </w:r>
+          </w:p>
+        </w:tc>
+      </w:tr>
+      <w:tr>
+        <w:tc>
+          <w:tcPr>
+            <w:tcW w:w="561" w:type="dxa"/>
+          </w:tcPr>
+          <w:p>
+            <w:pPr>
+              <w:rPr>
+                <w:rFonts w:ascii="Calibri" w:hAnsi="Calibri" w:cs="Calibri"/>
+              </w:rPr>
+            </w:pPr>
+            <w:r>
+              <w:rPr>
+                <w:rFonts w:ascii="Calibri" w:hAnsi="Calibri" w:cs="Calibri"/>
+              </w:rPr>
+              <w:t xml:space="preserve">4</w:t>
+            </w:r>
+          </w:p>
+        </w:tc>
+        <w:tc>
+          <w:tcPr>
+            <w:tcW w:w="3798" w:type="dxa"/>
+          </w:tcPr>
+          <w:p>
+            <w:pPr>
+              <w:rPr>
+                <w:rFonts w:ascii="Calibri" w:hAnsi="Calibri" w:cs="Calibri"/>
+              </w:rPr>
+            </w:pPr>
+            <w:r>
+              <w:rPr>
+                <w:rFonts w:ascii="Calibri" w:hAnsi="Calibri" w:cs="Calibri"/>
+              </w:rPr>
+              <w:t xml:space="preserve">Tydzień od czwartku, nie od poniedziałku</w:t>
+            </w:r>
+          </w:p>
+        </w:tc>
+        <w:tc>
+          <w:tcPr>
+            <w:tcW w:w="3527" w:type="dxa"/>
+          </w:tcPr>
+          <w:p>
+            <w:pPr>
+              <w:rPr>
+                <w:rFonts w:ascii="Calibri" w:hAnsi="Calibri" w:cs="Calibri"/>
+              </w:rPr>
+            </w:pPr>
+            <w:r>
+              <w:rPr>
+                <w:rFonts w:ascii="Calibri" w:hAnsi="Calibri" w:cs="Calibri"/>
+              </w:rPr>
+              <w:t xml:space="preserve">Orzeczenie ZUS – odpowiada stopniowi umiarkowanemu.</w:t>
+            </w:r>
+          </w:p>
+          <w:p>
+            <w:pPr>
+              <w:rPr>
+                <w:rFonts w:ascii="Calibri" w:hAnsi="Calibri" w:cs="Calibri"/>
+              </w:rPr>
+            </w:pPr>
+            <w:r>
+              <w:rPr>
+                <w:rFonts w:ascii="Calibri" w:hAnsi="Calibri" w:cs="Calibri"/>
+              </w:rPr>
+              <w:t xml:space="preserve">Kalendarz: Podstawowy system_1_8:15_N (norma 7:00, okres rozliczeniowy 1 miesiąc).</w:t>
+            </w:r>
+          </w:p>
+          <w:p>
+            <w:pPr>
+              <w:rPr>
+                <w:rFonts w:ascii="Calibri" w:hAnsi="Calibri" w:cs="Calibri"/>
+              </w:rPr>
+            </w:pPr>
+            <w:r>
+              <w:rPr>
+                <w:rFonts w:ascii="Calibri" w:hAnsi="Calibri" w:cs="Calibri"/>
+              </w:rPr>
+              <w:t xml:space="preserve">Sobota 17.10 7:00, poniedziałek 19.10 wolny: tydzień 15–21.10 (czw–śr) = 35:00, a od poniedziałku do niedzieli 12–18.10 = 42:00</w:t>
+            </w:r>
+          </w:p>
+        </w:tc>
+        <w:tc>
+          <w:tcPr>
+            <w:tcW w:w="1761" w:type="dxa"/>
+          </w:tcPr>
+          <w:p>
+            <w:pPr>
+              <w:rPr>
+                <w:rFonts w:ascii="Calibri" w:hAnsi="Calibri" w:cs="Calibri"/>
+              </w:rPr>
+            </w:pPr>
+            <w:r>
+              <w:rPr>
+                <w:rFonts w:ascii="Calibri" w:hAnsi="Calibri" w:cs="Calibri"/>
+              </w:rPr>
+              <w:t xml:space="preserve">Brak błędu</w:t>
+            </w:r>
+          </w:p>
+        </w:tc>
+      </w:tr>
+      <w:tr>
+        <w:tc>
+          <w:tcPr>
+            <w:tcW w:w="561" w:type="dxa"/>
+          </w:tcPr>
+          <w:p>
+            <w:pPr>
+              <w:rPr>
+                <w:rFonts w:ascii="Calibri" w:hAnsi="Calibri" w:cs="Calibri"/>
+              </w:rPr>
+            </w:pPr>
+            <w:r>
+              <w:rPr>
+                <w:rFonts w:ascii="Calibri" w:hAnsi="Calibri" w:cs="Calibri"/>
+              </w:rPr>
+              <w:t xml:space="preserve">5</w:t>
+            </w:r>
+          </w:p>
+        </w:tc>
+        <w:tc>
+          <w:tcPr>
+            <w:tcW w:w="3798" w:type="dxa"/>
+          </w:tcPr>
+          <w:p>
+            <w:pPr>
+              <w:rPr>
+                <w:rFonts w:ascii="Calibri" w:hAnsi="Calibri" w:cs="Calibri"/>
+              </w:rPr>
+            </w:pPr>
+            <w:r>
+              <w:rPr>
+                <w:rFonts w:ascii="Calibri" w:hAnsi="Calibri" w:cs="Calibri"/>
+              </w:rPr>
+              <w:t xml:space="preserve">Równoważny, 35h – tydzień 42h, okres w wymiarze</w:t>
+            </w:r>
+          </w:p>
+        </w:tc>
+        <w:tc>
+          <w:tcPr>
+            <w:tcW w:w="3527" w:type="dxa"/>
+          </w:tcPr>
+          <w:p>
+            <w:pPr>
+              <w:rPr>
+                <w:rFonts w:ascii="Calibri" w:hAnsi="Calibri" w:cs="Calibri"/>
+              </w:rPr>
+            </w:pPr>
+            <w:r>
+              <w:rPr>
+                <w:rFonts w:ascii="Calibri" w:hAnsi="Calibri" w:cs="Calibri"/>
+              </w:rPr>
+              <w:t xml:space="preserve">Orzeczenie PFRON – umiarkowany; zgoda niezaznaczona.</w:t>
+            </w:r>
+          </w:p>
+          <w:p>
+            <w:pPr>
+              <w:rPr>
+                <w:rFonts w:ascii="Calibri" w:hAnsi="Calibri" w:cs="Calibri"/>
+              </w:rPr>
+            </w:pPr>
+            <w:r>
+              <w:rPr>
+                <w:rFonts w:ascii="Calibri" w:hAnsi="Calibri" w:cs="Calibri"/>
+              </w:rPr>
+              <w:t xml:space="preserve">Kalendarz: Równoważny system_3_8:15_N (wrzesień–listopad).</w:t>
+            </w:r>
+          </w:p>
+          <w:p>
+            <w:pPr>
+              <w:rPr>
+                <w:rFonts w:ascii="Calibri" w:hAnsi="Calibri" w:cs="Calibri"/>
+              </w:rPr>
+            </w:pPr>
+            <w:r>
+              <w:rPr>
+                <w:rFonts w:ascii="Calibri" w:hAnsi="Calibri" w:cs="Calibri"/>
+              </w:rPr>
+              <w:t xml:space="preserve">Tydzień 1–7.09 = 42:00, okres razem 447:00 (wymiar 448:00)</w:t>
+            </w:r>
+          </w:p>
+        </w:tc>
+        <w:tc>
+          <w:tcPr>
+            <w:tcW w:w="1761" w:type="dxa"/>
+          </w:tcPr>
+          <w:p>
+            <w:pPr>
+              <w:rPr>
+                <w:rFonts w:ascii="Calibri" w:hAnsi="Calibri" w:cs="Calibri"/>
+              </w:rPr>
+            </w:pPr>
+            <w:r>
+              <w:rPr>
+                <w:rFonts w:ascii="Calibri" w:hAnsi="Calibri" w:cs="Calibri"/>
+              </w:rPr>
+              <w:t xml:space="preserve">Brak błędu tego weryfikatora</w:t>
+            </w:r>
+          </w:p>
+        </w:tc>
+      </w:tr>
+      <w:tr>
+        <w:tc>
+          <w:tcPr>
+            <w:tcW w:w="561" w:type="dxa"/>
+          </w:tcPr>
+          <w:p>
+            <w:pPr>
+              <w:rPr>
+                <w:rFonts w:ascii="Calibri" w:hAnsi="Calibri" w:cs="Calibri"/>
+              </w:rPr>
+            </w:pPr>
+            <w:r>
+              <w:rPr>
+                <w:rFonts w:ascii="Calibri" w:hAnsi="Calibri" w:cs="Calibri"/>
+              </w:rPr>
+              <w:t xml:space="preserve">6</w:t>
+            </w:r>
+          </w:p>
+        </w:tc>
+        <w:tc>
+          <w:tcPr>
+            <w:tcW w:w="3798" w:type="dxa"/>
+          </w:tcPr>
+          <w:p>
+            <w:pPr>
+              <w:rPr>
+                <w:rFonts w:ascii="Calibri" w:hAnsi="Calibri" w:cs="Calibri"/>
+              </w:rPr>
+            </w:pPr>
+            <w:r>
+              <w:rPr>
+                <w:rFonts w:ascii="Calibri" w:hAnsi="Calibri" w:cs="Calibri"/>
+              </w:rPr>
+              <w:t xml:space="preserve">Równoważny, 35h – okres ponad wymiar</w:t>
+            </w:r>
+          </w:p>
+        </w:tc>
+        <w:tc>
+          <w:tcPr>
+            <w:tcW w:w="3527" w:type="dxa"/>
+          </w:tcPr>
+          <w:p>
+            <w:pPr>
+              <w:rPr>
+                <w:rFonts w:ascii="Calibri" w:hAnsi="Calibri" w:cs="Calibri"/>
+              </w:rPr>
+            </w:pPr>
+            <w:r>
+              <w:rPr>
+                <w:rFonts w:ascii="Calibri" w:hAnsi="Calibri" w:cs="Calibri"/>
+              </w:rPr>
+              <w:t xml:space="preserve">Jak w pkt 5, okres razem 449:00</w:t>
+            </w:r>
+          </w:p>
+        </w:tc>
+        <w:tc>
+          <w:tcPr>
+            <w:tcW w:w="1761" w:type="dxa"/>
+          </w:tcPr>
+          <w:p>
+            <w:pPr>
+              <w:rPr>
+                <w:rFonts w:ascii="Calibri" w:hAnsi="Calibri" w:cs="Calibri"/>
+              </w:rPr>
+            </w:pPr>
+            <w:r>
+              <w:rPr>
+                <w:rFonts w:ascii="Calibri" w:hAnsi="Calibri" w:cs="Calibri"/>
+              </w:rPr>
+              <w:t xml:space="preserve">Błąd – przekroczony wymiar 448:00 o 1:00</w:t>
+            </w:r>
+          </w:p>
+        </w:tc>
+      </w:tr>
+      <w:tr>
+        <w:tc>
+          <w:tcPr>
+            <w:tcW w:w="561" w:type="dxa"/>
+          </w:tcPr>
+          <w:p>
+            <w:pPr>
+              <w:rPr>
+                <w:rFonts w:ascii="Calibri" w:hAnsi="Calibri" w:cs="Calibri"/>
+              </w:rPr>
+            </w:pPr>
+            <w:r>
+              <w:rPr>
+                <w:rFonts w:ascii="Calibri" w:hAnsi="Calibri" w:cs="Calibri"/>
+              </w:rPr>
+              <w:t xml:space="preserve">7</w:t>
+            </w:r>
+          </w:p>
+        </w:tc>
+        <w:tc>
+          <w:tcPr>
+            <w:tcW w:w="3798" w:type="dxa"/>
+          </w:tcPr>
+          <w:p>
+            <w:pPr>
+              <w:rPr>
+                <w:rFonts w:ascii="Calibri" w:hAnsi="Calibri" w:cs="Calibri"/>
+              </w:rPr>
+            </w:pPr>
+            <w:r>
+              <w:rPr>
+                <w:rFonts w:ascii="Calibri" w:hAnsi="Calibri" w:cs="Calibri"/>
+              </w:rPr>
+              <w:t xml:space="preserve">Święto w dniu roboczym</w:t>
+            </w:r>
+          </w:p>
+        </w:tc>
+        <w:tc>
+          <w:tcPr>
+            <w:tcW w:w="3527" w:type="dxa"/>
+          </w:tcPr>
+          <w:p>
+            <w:pPr>
+              <w:rPr>
+                <w:rFonts w:ascii="Calibri" w:hAnsi="Calibri" w:cs="Calibri"/>
+              </w:rPr>
+            </w:pPr>
+            <w:r>
+              <w:rPr>
+                <w:rFonts w:ascii="Calibri" w:hAnsi="Calibri" w:cs="Calibri"/>
+              </w:rPr>
+              <w:t xml:space="preserve">Jak w pkt 5. Okres wrzesień–listopad 2026 = 13 pełnych tygodni, 11.11.2026 (środa) – święto</w:t>
+            </w:r>
+          </w:p>
+        </w:tc>
+        <w:tc>
+          <w:tcPr>
+            <w:tcW w:w="1761" w:type="dxa"/>
+          </w:tcPr>
+          <w:p>
+            <w:pPr>
+              <w:rPr>
+                <w:rFonts w:ascii="Calibri" w:hAnsi="Calibri" w:cs="Calibri"/>
+              </w:rPr>
+            </w:pPr>
+            <w:r>
+              <w:rPr>
+                <w:rFonts w:ascii="Calibri" w:hAnsi="Calibri" w:cs="Calibri"/>
+              </w:rPr>
+              <w:t xml:space="preserve">Wymiar 13 × 35:00 − 7:00 = 448:00</w:t>
+            </w:r>
+          </w:p>
+        </w:tc>
+      </w:tr>
+      <w:tr>
+        <w:tc>
+          <w:tcPr>
+            <w:tcW w:w="561" w:type="dxa"/>
+          </w:tcPr>
+          <w:p>
+            <w:pPr>
+              <w:rPr>
+                <w:rFonts w:ascii="Calibri" w:hAnsi="Calibri" w:cs="Calibri"/>
+              </w:rPr>
+            </w:pPr>
+            <w:r>
+              <w:rPr>
+                <w:rFonts w:ascii="Calibri" w:hAnsi="Calibri" w:cs="Calibri"/>
+              </w:rPr>
+              <w:t xml:space="preserve">8</w:t>
+            </w:r>
+          </w:p>
+        </w:tc>
+        <w:tc>
+          <w:tcPr>
+            <w:tcW w:w="3798" w:type="dxa"/>
+          </w:tcPr>
+          <w:p>
+            <w:pPr>
+              <w:rPr>
+                <w:rFonts w:ascii="Calibri" w:hAnsi="Calibri" w:cs="Calibri"/>
+              </w:rPr>
+            </w:pPr>
+            <w:r>
+              <w:rPr>
+                <w:rFonts w:ascii="Calibri" w:hAnsi="Calibri" w:cs="Calibri"/>
+              </w:rPr>
+              <w:t xml:space="preserve">Stopień lekki – norma 40h</w:t>
+            </w:r>
+          </w:p>
+        </w:tc>
+        <w:tc>
+          <w:tcPr>
+            <w:tcW w:w="3527" w:type="dxa"/>
+          </w:tcPr>
+          <w:p>
+            <w:pPr>
+              <w:rPr>
+                <w:rFonts w:ascii="Calibri" w:hAnsi="Calibri" w:cs="Calibri"/>
+              </w:rPr>
+            </w:pPr>
+            <w:r>
+              <w:rPr>
+                <w:rFonts w:ascii="Calibri" w:hAnsi="Calibri" w:cs="Calibri"/>
+              </w:rPr>
+              <w:t xml:space="preserve">Orzeczenie PFRON – lekki.</w:t>
+            </w:r>
+          </w:p>
+          <w:p>
+            <w:pPr>
+              <w:rPr>
+                <w:rFonts w:ascii="Calibri" w:hAnsi="Calibri" w:cs="Calibri"/>
+              </w:rPr>
+            </w:pPr>
+            <w:r>
+              <w:rPr>
+                <w:rFonts w:ascii="Calibri" w:hAnsi="Calibri" w:cs="Calibri"/>
+              </w:rPr>
+              <w:t xml:space="preserve">Kalendarz: Podstawowy system_1_8:16_N.</w:t>
+            </w:r>
+          </w:p>
+          <w:p>
+            <w:pPr>
+              <w:rPr>
+                <w:rFonts w:ascii="Calibri" w:hAnsi="Calibri" w:cs="Calibri"/>
+              </w:rPr>
+            </w:pPr>
+            <w:r>
+              <w:rPr>
+                <w:rFonts w:ascii="Calibri" w:hAnsi="Calibri" w:cs="Calibri"/>
+              </w:rPr>
+              <w:t xml:space="preserve">Tydzień 8–14.10.2026: 5 × 8:00 + sobota 1:00 = 41:00</w:t>
+            </w:r>
+          </w:p>
+        </w:tc>
+        <w:tc>
+          <w:tcPr>
+            <w:tcW w:w="1761" w:type="dxa"/>
+          </w:tcPr>
+          <w:p>
+            <w:pPr>
+              <w:rPr>
+                <w:rFonts w:ascii="Calibri" w:hAnsi="Calibri" w:cs="Calibri"/>
+              </w:rPr>
+            </w:pPr>
+            <w:r>
+              <w:rPr>
+                <w:rFonts w:ascii="Calibri" w:hAnsi="Calibri" w:cs="Calibri"/>
+              </w:rPr>
+              <w:t xml:space="preserve">Błąd – tydzień 8–14.10 (norma 40:00, zaplanowano 41:00)</w:t>
+            </w:r>
+          </w:p>
+        </w:tc>
+      </w:tr>
+      <w:tr>
+        <w:tc>
+          <w:tcPr>
+            <w:tcW w:w="561" w:type="dxa"/>
+          </w:tcPr>
+          <w:p>
+            <w:pPr>
+              <w:rPr>
+                <w:rFonts w:ascii="Calibri" w:hAnsi="Calibri" w:cs="Calibri"/>
+              </w:rPr>
+            </w:pPr>
+            <w:r>
+              <w:rPr>
+                <w:rFonts w:ascii="Calibri" w:hAnsi="Calibri" w:cs="Calibri"/>
+              </w:rPr>
+              <w:t xml:space="preserve">9</w:t>
+            </w:r>
+          </w:p>
+        </w:tc>
+        <w:tc>
+          <w:tcPr>
+            <w:tcW w:w="3798" w:type="dxa"/>
+          </w:tcPr>
+          <w:p>
+            <w:pPr>
+              <w:rPr>
+                <w:rFonts w:ascii="Calibri" w:hAnsi="Calibri" w:cs="Calibri"/>
+              </w:rPr>
+            </w:pPr>
+            <w:r>
+              <w:rPr>
+                <w:rFonts w:ascii="Calibri" w:hAnsi="Calibri" w:cs="Calibri"/>
+              </w:rPr>
+              <w:t xml:space="preserve">Zgoda na pracę 8h – norma 40h, równoważny</w:t>
+            </w:r>
+          </w:p>
+        </w:tc>
+        <w:tc>
+          <w:tcPr>
+            <w:tcW w:w="3527" w:type="dxa"/>
+          </w:tcPr>
+          <w:p>
+            <w:pPr>
+              <w:rPr>
+                <w:rFonts w:ascii="Calibri" w:hAnsi="Calibri" w:cs="Calibri"/>
+              </w:rPr>
+            </w:pPr>
+            <w:r>
+              <w:rPr>
+                <w:rFonts w:ascii="Calibri" w:hAnsi="Calibri" w:cs="Calibri"/>
+              </w:rPr>
+              <w:t xml:space="preserve">Orzeczenie PFRON – umiarkowany; „Zgoda na pracę 8h” zaznaczona.</w:t>
+            </w:r>
+          </w:p>
+          <w:p>
+            <w:pPr>
+              <w:rPr>
+                <w:rFonts w:ascii="Calibri" w:hAnsi="Calibri" w:cs="Calibri"/>
+              </w:rPr>
+            </w:pPr>
+            <w:r>
+              <w:rPr>
+                <w:rFonts w:ascii="Calibri" w:hAnsi="Calibri" w:cs="Calibri"/>
+              </w:rPr>
+              <w:t xml:space="preserve">Kalendarz: Równoważny system_1_8:16_N.</w:t>
+            </w:r>
+          </w:p>
+          <w:p>
+            <w:pPr>
+              <w:rPr>
+                <w:rFonts w:ascii="Calibri" w:hAnsi="Calibri" w:cs="Calibri"/>
+              </w:rPr>
+            </w:pPr>
+            <w:r>
+              <w:rPr>
+                <w:rFonts w:ascii="Calibri" w:hAnsi="Calibri" w:cs="Calibri"/>
+              </w:rPr>
+              <w:t xml:space="preserve">Plan październik 2026: 177:00 (2.10 – 9:00)</w:t>
+            </w:r>
+          </w:p>
+        </w:tc>
+        <w:tc>
+          <w:tcPr>
+            <w:tcW w:w="1761" w:type="dxa"/>
+          </w:tcPr>
+          <w:p>
+            <w:pPr>
+              <w:rPr>
+                <w:rFonts w:ascii="Calibri" w:hAnsi="Calibri" w:cs="Calibri"/>
+              </w:rPr>
+            </w:pPr>
+            <w:r>
+              <w:rPr>
+                <w:rFonts w:ascii="Calibri" w:hAnsi="Calibri" w:cs="Calibri"/>
+              </w:rPr>
+              <w:t xml:space="preserve">Błąd – przekroczony wymiar 176:00 o 1:00; dodatkowo ostrzeżenie „A1_Doba niepełnosprawnych (równoważny)”</w:t>
+            </w:r>
+          </w:p>
+        </w:tc>
+      </w:tr>
+      <w:tr>
+        <w:tc>
+          <w:tcPr>
+            <w:tcW w:w="561" w:type="dxa"/>
+          </w:tcPr>
+          <w:p>
+            <w:pPr>
+              <w:rPr>
+                <w:rFonts w:ascii="Calibri" w:hAnsi="Calibri" w:cs="Calibri"/>
+              </w:rPr>
+            </w:pPr>
+            <w:r>
+              <w:rPr>
+                <w:rFonts w:ascii="Calibri" w:hAnsi="Calibri" w:cs="Calibri"/>
+              </w:rPr>
+              <w:t xml:space="preserve">10</w:t>
+            </w:r>
+          </w:p>
+        </w:tc>
+        <w:tc>
+          <w:tcPr>
+            <w:tcW w:w="3798" w:type="dxa"/>
+          </w:tcPr>
+          <w:p>
+            <w:pPr>
+              <w:rPr>
+                <w:rFonts w:ascii="Calibri" w:hAnsi="Calibri" w:cs="Calibri"/>
+              </w:rPr>
+            </w:pPr>
+            <w:r>
+              <w:rPr>
+                <w:rFonts w:ascii="Calibri" w:hAnsi="Calibri" w:cs="Calibri"/>
+              </w:rPr>
+              <w:t xml:space="preserve">Bez orzeczenia</w:t>
+            </w:r>
+          </w:p>
+        </w:tc>
+        <w:tc>
+          <w:tcPr>
+            <w:tcW w:w="3527" w:type="dxa"/>
+          </w:tcPr>
+          <w:p>
+            <w:pPr>
+              <w:rPr>
+                <w:rFonts w:ascii="Calibri" w:hAnsi="Calibri" w:cs="Calibri"/>
+              </w:rPr>
+            </w:pPr>
+            <w:r>
+              <w:rPr>
+                <w:rFonts w:ascii="Calibri" w:hAnsi="Calibri" w:cs="Calibri"/>
+              </w:rPr>
+              <w:t xml:space="preserve">Brak orzeczeń.</w:t>
+            </w:r>
+          </w:p>
+          <w:p>
+            <w:pPr>
+              <w:rPr>
+                <w:rFonts w:ascii="Calibri" w:hAnsi="Calibri" w:cs="Calibri"/>
+              </w:rPr>
+            </w:pPr>
+            <w:r>
+              <w:rPr>
+                <w:rFonts w:ascii="Calibri" w:hAnsi="Calibri" w:cs="Calibri"/>
+              </w:rPr>
+              <w:t xml:space="preserve">Kalendarz: Podstawowy system_1_8:16_N.</w:t>
+            </w:r>
+          </w:p>
+          <w:p>
+            <w:pPr>
+              <w:rPr>
+                <w:rFonts w:ascii="Calibri" w:hAnsi="Calibri" w:cs="Calibri"/>
+              </w:rPr>
+            </w:pPr>
+            <w:r>
+              <w:rPr>
+                <w:rFonts w:ascii="Calibri" w:hAnsi="Calibri" w:cs="Calibri"/>
+              </w:rPr>
+              <w:t xml:space="preserve">Tydzień 8–14.10.2026: 48:00</w:t>
+            </w:r>
+          </w:p>
+        </w:tc>
+        <w:tc>
+          <w:tcPr>
+            <w:tcW w:w="1761" w:type="dxa"/>
+          </w:tcPr>
+          <w:p>
+            <w:pPr>
+              <w:rPr>
+                <w:rFonts w:ascii="Calibri" w:hAnsi="Calibri" w:cs="Calibri"/>
+              </w:rPr>
+            </w:pPr>
+            <w:r>
+              <w:rPr>
+                <w:rFonts w:ascii="Calibri" w:hAnsi="Calibri" w:cs="Calibri"/>
+              </w:rPr>
+              <w:t xml:space="preserve">Brak błędu tego weryfikatora</w:t>
+            </w:r>
+          </w:p>
+        </w:tc>
+      </w:tr>
+      <w:tr>
+        <w:tc>
+          <w:tcPr>
+            <w:tcW w:w="561" w:type="dxa"/>
+          </w:tcPr>
+          <w:p>
+            <w:pPr>
+              <w:rPr>
+                <w:rFonts w:ascii="Calibri" w:hAnsi="Calibri" w:cs="Calibri"/>
+              </w:rPr>
+            </w:pPr>
+            <w:r>
+              <w:rPr>
+                <w:rFonts w:ascii="Calibri" w:hAnsi="Calibri" w:cs="Calibri"/>
+              </w:rPr>
+              <w:t xml:space="preserve">11</w:t>
+            </w:r>
+          </w:p>
+        </w:tc>
+        <w:tc>
+          <w:tcPr>
+            <w:tcW w:w="3798" w:type="dxa"/>
+          </w:tcPr>
+          <w:p>
+            <w:pPr>
+              <w:rPr>
+                <w:rFonts w:ascii="Calibri" w:hAnsi="Calibri" w:cs="Calibri"/>
+              </w:rPr>
+            </w:pPr>
+            <w:r>
+              <w:rPr>
+                <w:rFonts w:ascii="Calibri" w:hAnsi="Calibri" w:cs="Calibri"/>
+              </w:rPr>
+              <w:t xml:space="preserve">Zmiana orzeczenia w okresie – po zmianie</w:t>
+            </w:r>
+          </w:p>
+        </w:tc>
+        <w:tc>
+          <w:tcPr>
+            <w:tcW w:w="3527" w:type="dxa"/>
+          </w:tcPr>
+          <w:p>
+            <w:pPr>
+              <w:rPr>
+                <w:rFonts w:ascii="Calibri" w:hAnsi="Calibri" w:cs="Calibri"/>
+              </w:rPr>
+            </w:pPr>
+            <w:r>
+              <w:rPr>
+                <w:rFonts w:ascii="Calibri" w:hAnsi="Calibri" w:cs="Calibri"/>
+              </w:rPr>
+              <w:t xml:space="preserve">Orzeczenia PFRON: umiarkowany do 15.11.2026, lekki od 16.11.2026.</w:t>
+            </w:r>
+          </w:p>
+          <w:p>
+            <w:pPr>
+              <w:rPr>
+                <w:rFonts w:ascii="Calibri" w:hAnsi="Calibri" w:cs="Calibri"/>
+              </w:rPr>
+            </w:pPr>
+            <w:r>
+              <w:rPr>
+                <w:rFonts w:ascii="Calibri" w:hAnsi="Calibri" w:cs="Calibri"/>
+              </w:rPr>
+              <w:t xml:space="preserve">Kalendarz: Podstawowy system_1_8:15_N (norma 7:00, okres rozliczeniowy 1 miesiąc).</w:t>
+            </w:r>
+          </w:p>
+          <w:p>
+            <w:pPr>
+              <w:rPr>
+                <w:rFonts w:ascii="Calibri" w:hAnsi="Calibri" w:cs="Calibri"/>
+              </w:rPr>
+            </w:pPr>
+            <w:r>
+              <w:rPr>
+                <w:rFonts w:ascii="Calibri" w:hAnsi="Calibri" w:cs="Calibri"/>
+              </w:rPr>
+              <w:t xml:space="preserve">Tydzień 15–21.11: 40:00 (16–20.11 po 8:00), okres listopad 151:00 = wymiar</w:t>
+            </w:r>
+          </w:p>
+        </w:tc>
+        <w:tc>
+          <w:tcPr>
+            <w:tcW w:w="1761" w:type="dxa"/>
+          </w:tcPr>
+          <w:p>
+            <w:pPr>
+              <w:rPr>
+                <w:rFonts w:ascii="Calibri" w:hAnsi="Calibri" w:cs="Calibri"/>
+              </w:rPr>
+            </w:pPr>
+            <w:r>
+              <w:rPr>
+                <w:rFonts w:ascii="Calibri" w:hAnsi="Calibri" w:cs="Calibri"/>
+              </w:rPr>
+              <w:t xml:space="preserve">Brak błędu tego weryfikatora (od 16.11 norma 40h)</w:t>
+            </w:r>
+          </w:p>
+        </w:tc>
+      </w:tr>
+      <w:tr>
+        <w:tc>
+          <w:tcPr>
+            <w:tcW w:w="561" w:type="dxa"/>
+          </w:tcPr>
+          <w:p>
+            <w:pPr>
+              <w:rPr>
+                <w:rFonts w:ascii="Calibri" w:hAnsi="Calibri" w:cs="Calibri"/>
+              </w:rPr>
+            </w:pPr>
+            <w:r>
+              <w:rPr>
+                <w:rFonts w:ascii="Calibri" w:hAnsi="Calibri" w:cs="Calibri"/>
+              </w:rPr>
+              <w:t xml:space="preserve">12</w:t>
+            </w:r>
+          </w:p>
+        </w:tc>
+        <w:tc>
+          <w:tcPr>
+            <w:tcW w:w="3798" w:type="dxa"/>
+          </w:tcPr>
+          <w:p>
+            <w:pPr>
+              <w:rPr>
+                <w:rFonts w:ascii="Calibri" w:hAnsi="Calibri" w:cs="Calibri"/>
+              </w:rPr>
+            </w:pPr>
+            <w:r>
+              <w:rPr>
+                <w:rFonts w:ascii="Calibri" w:hAnsi="Calibri" w:cs="Calibri"/>
+              </w:rPr>
+              <w:t xml:space="preserve">Zmiana orzeczenia w okresie – przed zmianą</w:t>
+            </w:r>
+          </w:p>
+        </w:tc>
+        <w:tc>
+          <w:tcPr>
+            <w:tcW w:w="3527" w:type="dxa"/>
+          </w:tcPr>
+          <w:p>
+            <w:pPr>
+              <w:rPr>
+                <w:rFonts w:ascii="Calibri" w:hAnsi="Calibri" w:cs="Calibri"/>
+              </w:rPr>
+            </w:pPr>
+            <w:r>
+              <w:rPr>
+                <w:rFonts w:ascii="Calibri" w:hAnsi="Calibri" w:cs="Calibri"/>
+              </w:rPr>
+              <w:t xml:space="preserve">Jak w pkt 11.</w:t>
+            </w:r>
+          </w:p>
+          <w:p>
+            <w:pPr>
+              <w:rPr>
+                <w:rFonts w:ascii="Calibri" w:hAnsi="Calibri" w:cs="Calibri"/>
+              </w:rPr>
+            </w:pPr>
+            <w:r>
+              <w:rPr>
+                <w:rFonts w:ascii="Calibri" w:hAnsi="Calibri" w:cs="Calibri"/>
+              </w:rPr>
+              <w:t xml:space="preserve">Tydzień 1–7.11: 36:00</w:t>
+            </w:r>
+          </w:p>
+        </w:tc>
+        <w:tc>
+          <w:tcPr>
+            <w:tcW w:w="1761" w:type="dxa"/>
+          </w:tcPr>
+          <w:p>
+            <w:pPr>
+              <w:rPr>
+                <w:rFonts w:ascii="Calibri" w:hAnsi="Calibri" w:cs="Calibri"/>
+              </w:rPr>
+            </w:pPr>
+            <w:r>
+              <w:rPr>
+                <w:rFonts w:ascii="Calibri" w:hAnsi="Calibri" w:cs="Calibri"/>
+              </w:rPr>
+              <w:t xml:space="preserve">Błąd – tydzień 1–7.11 (norma 35:00)</w:t>
+            </w:r>
+          </w:p>
+        </w:tc>
+      </w:tr>
+    </w:tbl>
+    <w:p>
+      <w:pPr>
+        <w:rPr>
+          <w:rFonts w:ascii="Calibri" w:hAnsi="Calibri" w:cs="Calibri"/>
+        </w:rPr>
+      </w:pPr>
+    </w:p>
+    <w:p>
+      <w:pPr>
+        <w:rPr>
+          <w:rFonts w:ascii="Calibri" w:hAnsi="Calibri" w:cs="Calibri"/>
+        </w:rPr>
+      </w:pPr>
+    </w:p>
+    <w:p>
+      <w:pPr>
+        <w:pStyle w:val="Nagwek1"/>
+        <w:jc w:val="center"/>
+        <w:rPr>
+          <w:rFonts w:ascii="Calibri" w:hAnsi="Calibri" w:cs="Calibri"/>
+        </w:rPr>
+      </w:pPr>
+      <w:bookmarkStart w:id="11" w:name="_Toc242434901"/>
+      <w:r>
+        <w:rPr>
+          <w:rFonts w:ascii="Calibri" w:hAnsi="Calibri" w:cs="Calibri"/>
+        </w:rPr>
+        <w:t xml:space="preserve">Weryfikator A1_Doba niepełnosprawnych (równoważny)</w:t>
+      </w:r>
+      <w:bookmarkEnd w:id="11"/>
+    </w:p>
+    <w:p>
+      <w:pPr>
+        <w:rPr>
+          <w:rFonts w:ascii="Calibri" w:hAnsi="Calibri" w:cs="Calibri"/>
+        </w:rPr>
+      </w:pPr>
+    </w:p>
+    <w:p>
+      <w:pPr>
+        <w:jc w:val="both"/>
+        <w:rPr>
+          <w:rFonts w:ascii="Calibri" w:hAnsi="Calibri" w:cs="Calibri"/>
+        </w:rPr>
+      </w:pPr>
+      <w:r>
+        <w:rPr>
+          <w:rFonts w:ascii="Calibri" w:hAnsi="Calibri" w:cs="Calibri"/>
+        </w:rPr>
+        <w:t xml:space="preserve">Weryfikator ostrzega, gdy pracownikowi z niepełnosprawnością, który ma na etacie kalendarz z równoważnym czasem pracy, zaplanowano dzień dłuższy niż jego norma dobowa (7:00 albo 8:00 – jak w weryfikatorze „A1_Norma tygodniowa niepełnosprawnych”). Przedłużanie doby osobie z niepełnosprawnością jest prawnie wątpliwe, dlatego zapis jest możliwy, a decyzję podejmuje przełożony.</w:t>
+      </w:r>
+    </w:p>
+    <w:p>
+      <w:pPr>
+        <w:jc w:val="both"/>
+        <w:rPr>
+          <w:rFonts w:ascii="Calibri" w:hAnsi="Calibri" w:cs="Calibri"/>
+        </w:rPr>
+      </w:pPr>
+      <w:r>
+        <w:rPr>
+          <w:rFonts w:ascii="Calibri" w:hAnsi="Calibri" w:cs="Calibri"/>
+        </w:rPr>
+        <w:t xml:space="preserve">Przy stopniu umiarkowanym lub znacznym bez zgody na pracę 8h dzień dłuższy niż 7:00 blokuje dodatkowo weryfikator „A1_Brak zgody na pracę 8h”.</w:t>
+      </w:r>
+    </w:p>
+    <w:p>
+      <w:pPr>
+        <w:rPr>
+          <w:rFonts w:ascii="Calibri" w:hAnsi="Calibri" w:cs="Calibri"/>
+        </w:rPr>
+      </w:pPr>
+    </w:p>
+    <w:p>
+      <w:pPr>
+        <w:jc w:val="both"/>
+        <w:rPr>
+          <w:rFonts w:ascii="Calibri" w:hAnsi="Calibri" w:cs="Calibri"/>
+        </w:rPr>
+      </w:pPr>
+      <w:r>
+        <w:rPr>
+          <w:rFonts w:ascii="Calibri" w:hAnsi="Calibri" w:cs="Calibri"/>
+        </w:rPr>
+        <w:t xml:space="preserve">Weryfikator uruchamia się w momencie zmian dokonywanych na:</w:t>
+      </w:r>
+    </w:p>
+    <w:p>
+      <w:pPr>
+        <w:jc w:val="both"/>
+        <w:rPr>
+          <w:rFonts w:ascii="Calibri" w:hAnsi="Calibri" w:cs="Calibri"/>
+        </w:rPr>
+      </w:pPr>
+      <w:r>
+        <w:rPr>
+          <w:rFonts w:ascii="Calibri" w:hAnsi="Calibri" w:cs="Calibri"/>
+        </w:rPr>
+        <w:t xml:space="preserve">- Kalendarz/Norma czasu pracy w wersji okienkowej</w:t>
+      </w:r>
+    </w:p>
+    <w:p>
+      <w:pPr>
+        <w:jc w:val="both"/>
+        <w:rPr>
+          <w:rFonts w:ascii="Calibri" w:hAnsi="Calibri" w:cs="Calibri"/>
+        </w:rPr>
+      </w:pPr>
+      <w:r>
+        <w:rPr>
+          <w:rFonts w:ascii="Calibri" w:hAnsi="Calibri" w:cs="Calibri"/>
+        </w:rPr>
+        <w:t xml:space="preserve">- Kalendarz/Norma czasu pracy w pulpicie Kierownika</w:t>
+      </w:r>
+    </w:p>
+    <w:p>
+      <w:pPr>
+        <w:jc w:val="both"/>
+        <w:rPr>
+          <w:rFonts w:ascii="Calibri" w:hAnsi="Calibri" w:cs="Calibri"/>
+        </w:rPr>
+      </w:pPr>
+      <w:r>
+        <w:rPr>
+          <w:rFonts w:ascii="Calibri" w:hAnsi="Calibri" w:cs="Calibri"/>
+        </w:rPr>
+        <w:t xml:space="preserve">- na Zestawieniu czasu pracy w pulpicie Kierownika</w:t>
+      </w:r>
+    </w:p>
+    <w:p>
+      <w:pPr>
+        <w:rPr>
+          <w:rFonts w:ascii="Calibri" w:hAnsi="Calibri" w:cs="Calibri"/>
+        </w:rPr>
+      </w:pPr>
+    </w:p>
+    <w:p>
+      <w:pPr>
+        <w:pStyle w:val="Akapitzlist"/>
+        <w:numPr>
+          <w:ilvl w:val="0"/>
+          <w:numId w:val="16"/>
+        </w:numPr>
+        <w:ind w:left="360"/>
+        <w:rPr>
+          <w:rFonts w:ascii="Calibri" w:hAnsi="Calibri" w:cs="Calibri"/>
+          <w:sz w:val="28"/>
+          <w:szCs w:val="28"/>
+        </w:rPr>
+      </w:pPr>
+      <w:r>
+        <w:rPr>
+          <w:rFonts w:ascii="Calibri" w:hAnsi="Calibri" w:cs="Calibri"/>
+          <w:sz w:val="28"/>
+          <w:szCs w:val="28"/>
+        </w:rPr>
+        <w:t xml:space="preserve">Konfiguracja</w:t>
+      </w:r>
+    </w:p>
+    <w:p>
+      <w:pPr>
+        <w:jc w:val="both"/>
+        <w:rPr>
+          <w:rFonts w:ascii="Calibri" w:hAnsi="Calibri" w:cs="Calibri"/>
+        </w:rPr>
+      </w:pPr>
+      <w:r>
+        <w:rPr>
+          <w:rFonts w:ascii="Calibri" w:hAnsi="Calibri" w:cs="Calibri"/>
+        </w:rPr>
+        <w:t xml:space="preserve">Algorytm weryfikatora zapisany jest w konfiguracji systemu Narzędzia/Opcje/Systemowe/Dodatkowy kod do kompilacji – plik o nazwie A1WeryfikatoryKalendarza. Wywołanie algorytmu odbywa się w Definicji weryfikatorów kalendarza „A1_Doba niepełnosprawnych (równoważny)” (rodzaj: Dzień planu).</w:t>
+      </w:r>
+    </w:p>
+    <w:p>
+      <w:pPr>
+        <w:jc w:val="both"/>
+        <w:rPr>
+          <w:rFonts w:ascii="Calibri" w:hAnsi="Calibri" w:cs="Calibri"/>
+        </w:rPr>
+      </w:pPr>
+      <w:r>
+        <w:rPr>
+          <w:rFonts w:ascii="Calibri" w:hAnsi="Calibri" w:cs="Calibri"/>
+        </w:rPr>
+        <w:t xml:space="preserve">Weryfikator można włączyć na dowolnej definicji Kalendarza w zakładce Weryfikatory. Na bazie testowej podpięty jako Ostrzeżenie do kalendarzy „3 miesięczny”, „Podstawowy system_1_8:16” oraz do kalendarzy klienta (w tym wersji z dopiskiem _N dla osób z niepełnosprawnością).</w:t>
+      </w:r>
+    </w:p>
+    <w:p>
+      <w:pPr>
+        <w:jc w:val="both"/>
+        <w:rPr>
+          <w:rFonts w:ascii="Calibri" w:hAnsi="Calibri" w:cs="Calibri"/>
+        </w:rPr>
+      </w:pPr>
+      <w:r>
+        <w:rPr>
+          <w:rFonts w:ascii="Calibri" w:hAnsi="Calibri" w:cs="Calibri"/>
+        </w:rPr>
+        <w:t xml:space="preserve">Komunikat:</w:t>
+      </w:r>
+    </w:p>
+    <w:p>
+      <w:pPr>
+        <w:jc w:val="both"/>
+        <w:rPr>
+          <w:rFonts w:ascii="Calibri" w:hAnsi="Calibri" w:cs="Calibri"/>
+        </w:rPr>
+      </w:pPr>
+      <w:r>
+        <w:rPr>
+          <w:rFonts w:ascii="Calibri" w:hAnsi="Calibri" w:cs="Calibri"/>
+        </w:rPr>
+        <w:t xml:space="preserve">Dla dnia (data) zaplanowano czas (plan) dłuższy niż norma dobowa (norma) osoby z niepełnosprawnością w równoważnym systemie czasu pracy - (pracownik)</w:t>
+      </w:r>
+    </w:p>
+    <w:p>
+      <w:pPr>
+        <w:rPr>
+          <w:rFonts w:ascii="Calibri" w:hAnsi="Calibri" w:cs="Calibri"/>
+        </w:rPr>
+      </w:pPr>
+    </w:p>
+    <w:p>
+      <w:pPr>
+        <w:pStyle w:val="Akapitzlist"/>
+        <w:numPr>
+          <w:ilvl w:val="0"/>
+          <w:numId w:val="16"/>
+        </w:numPr>
+        <w:ind w:left="360"/>
+        <w:rPr>
+          <w:rFonts w:ascii="Calibri" w:hAnsi="Calibri" w:cs="Calibri"/>
+          <w:sz w:val="28"/>
+          <w:szCs w:val="28"/>
+        </w:rPr>
+      </w:pPr>
+      <w:r>
+        <w:rPr>
+          <w:rFonts w:ascii="Calibri" w:hAnsi="Calibri" w:cs="Calibri"/>
+          <w:sz w:val="28"/>
+          <w:szCs w:val="28"/>
+        </w:rPr>
+        <w:t xml:space="preserve">Scenariusze testowe</w:t>
+      </w:r>
+    </w:p>
+    <w:tbl>
+      <w:tblPr>
+        <w:tblStyle w:val="Tabela-Siatka"/>
+        <w:tblW w:w="9647" w:type="dxa"/>
+        <w:tblLook w:val="04A0" w:firstRow="1" w:lastRow="0" w:firstColumn="1" w:lastColumn="0" w:noHBand="0" w:noVBand="1"/>
+      </w:tblPr>
+      <w:tblGrid>
+        <w:gridCol w:w="561"/>
+        <w:gridCol w:w="3798"/>
+        <w:gridCol w:w="3527"/>
+        <w:gridCol w:w="1761"/>
+      </w:tblGrid>
+      <w:tr>
+        <w:tc>
+          <w:tcPr>
+            <w:tcW w:w="561" w:type="dxa"/>
+          </w:tcPr>
+          <w:p>
+            <w:pPr>
+              <w:rPr>
+                <w:rFonts w:ascii="Calibri" w:hAnsi="Calibri" w:cs="Calibri"/>
+              </w:rPr>
+            </w:pPr>
+            <w:proofErr w:type="spellStart"/>
+            <w:r>
+              <w:rPr>
+                <w:rFonts w:ascii="Calibri" w:hAnsi="Calibri" w:cs="Calibri"/>
+              </w:rPr>
+              <w:t>Lp</w:t>
+            </w:r>
+            <w:proofErr w:type="spellEnd"/>
+          </w:p>
+        </w:tc>
+        <w:tc>
+          <w:tcPr>
+            <w:tcW w:w="3798" w:type="dxa"/>
+          </w:tcPr>
+          <w:p>
+            <w:pPr>
+              <w:rPr>
+                <w:rFonts w:ascii="Calibri" w:hAnsi="Calibri" w:cs="Calibri"/>
+              </w:rPr>
+            </w:pPr>
+            <w:r>
+              <w:rPr>
+                <w:rFonts w:ascii="Calibri" w:hAnsi="Calibri" w:cs="Calibri"/>
+              </w:rPr>
+              <w:t>Scenariusz</w:t>
+            </w:r>
+          </w:p>
+        </w:tc>
+        <w:tc>
+          <w:tcPr>
+            <w:tcW w:w="3527" w:type="dxa"/>
+          </w:tcPr>
+          <w:p>
+            <w:pPr>
+              <w:rPr>
+                <w:rFonts w:ascii="Calibri" w:hAnsi="Calibri" w:cs="Calibri"/>
+              </w:rPr>
+            </w:pPr>
+            <w:r>
+              <w:rPr>
+                <w:rFonts w:ascii="Calibri" w:hAnsi="Calibri" w:cs="Calibri"/>
+              </w:rPr>
+              <w:t>Dane wejściowe</w:t>
+            </w:r>
+          </w:p>
+        </w:tc>
+        <w:tc>
+          <w:tcPr>
+            <w:tcW w:w="1761" w:type="dxa"/>
+          </w:tcPr>
+          <w:p>
+            <w:pPr>
+              <w:rPr>
+                <w:rFonts w:ascii="Calibri" w:hAnsi="Calibri" w:cs="Calibri"/>
+              </w:rPr>
+            </w:pPr>
+            <w:r>
+              <w:rPr>
+                <w:rFonts w:ascii="Calibri" w:hAnsi="Calibri" w:cs="Calibri"/>
+              </w:rPr>
+              <w:t>Oczekiwany wynik</w:t>
+            </w:r>
+          </w:p>
+        </w:tc>
+      </w:tr>
+      <w:tr>
+        <w:tc>
+          <w:tcPr>
+            <w:tcW w:w="561" w:type="dxa"/>
+          </w:tcPr>
+          <w:p>
+            <w:pPr>
+              <w:rPr>
+                <w:rFonts w:ascii="Calibri" w:hAnsi="Calibri" w:cs="Calibri"/>
+              </w:rPr>
+            </w:pPr>
+            <w:r>
+              <w:rPr>
+                <w:rFonts w:ascii="Calibri" w:hAnsi="Calibri" w:cs="Calibri"/>
+              </w:rPr>
+              <w:t xml:space="preserve">1</w:t>
+            </w:r>
+          </w:p>
+        </w:tc>
+        <w:tc>
+          <w:tcPr>
+            <w:tcW w:w="3798" w:type="dxa"/>
+          </w:tcPr>
+          <w:p>
+            <w:pPr>
+              <w:rPr>
+                <w:rFonts w:ascii="Calibri" w:hAnsi="Calibri" w:cs="Calibri"/>
+              </w:rPr>
+            </w:pPr>
+            <w:r>
+              <w:rPr>
+                <w:rFonts w:ascii="Calibri" w:hAnsi="Calibri" w:cs="Calibri"/>
+              </w:rPr>
+              <w:t xml:space="preserve">Równoważny, zgoda na pracę 8h, dzień 9:00</w:t>
+            </w:r>
+          </w:p>
+        </w:tc>
+        <w:tc>
+          <w:tcPr>
+            <w:tcW w:w="3527" w:type="dxa"/>
+          </w:tcPr>
+          <w:p>
+            <w:pPr>
+              <w:rPr>
+                <w:rFonts w:ascii="Calibri" w:hAnsi="Calibri" w:cs="Calibri"/>
+              </w:rPr>
+            </w:pPr>
+            <w:r>
+              <w:rPr>
+                <w:rFonts w:ascii="Calibri" w:hAnsi="Calibri" w:cs="Calibri"/>
+              </w:rPr>
+              <w:t xml:space="preserve">Orzeczenie PFRON – umiarkowany; „Zgoda na pracę 8h” zaznaczona.</w:t>
+            </w:r>
+          </w:p>
+          <w:p>
+            <w:pPr>
+              <w:rPr>
+                <w:rFonts w:ascii="Calibri" w:hAnsi="Calibri" w:cs="Calibri"/>
+              </w:rPr>
+            </w:pPr>
+            <w:r>
+              <w:rPr>
+                <w:rFonts w:ascii="Calibri" w:hAnsi="Calibri" w:cs="Calibri"/>
+              </w:rPr>
+              <w:t xml:space="preserve">Kalendarz: Równoważny system_1_8:16_N.</w:t>
+            </w:r>
+          </w:p>
+          <w:p>
+            <w:pPr>
+              <w:rPr>
+                <w:rFonts w:ascii="Calibri" w:hAnsi="Calibri" w:cs="Calibri"/>
+              </w:rPr>
+            </w:pPr>
+            <w:r>
+              <w:rPr>
+                <w:rFonts w:ascii="Calibri" w:hAnsi="Calibri" w:cs="Calibri"/>
+              </w:rPr>
+              <w:t xml:space="preserve">Plan 02.10.2026: 9:00</w:t>
+            </w:r>
+          </w:p>
+        </w:tc>
+        <w:tc>
+          <w:tcPr>
+            <w:tcW w:w="1761" w:type="dxa"/>
+          </w:tcPr>
+          <w:p>
+            <w:pPr>
+              <w:rPr>
+                <w:rFonts w:ascii="Calibri" w:hAnsi="Calibri" w:cs="Calibri"/>
+              </w:rPr>
+            </w:pPr>
+            <w:r>
+              <w:rPr>
+                <w:rFonts w:ascii="Calibri" w:hAnsi="Calibri" w:cs="Calibri"/>
+              </w:rPr>
+              <w:t xml:space="preserve">Ostrzeżenie – zapis możliwy (norma dobowa 8:00)</w:t>
             </w:r>
           </w:p>
         </w:tc>
@@ -12991,6 +15049,18 @@
     </w:lvlOverride>
   </w:num>
   <w:num w:numId="14" w16cid:durableId="1419009480">
+    <w:abstractNumId w:val="3"/>
+    <w:lvlOverride w:ilvl="0">
+      <w:startOverride w:val="1"/>
+    </w:lvlOverride>
+  </w:num>
+  <w:num w:numId="15" w16cid:durableId="624797297">
+    <w:abstractNumId w:val="3"/>
+    <w:lvlOverride w:ilvl="0">
+      <w:startOverride w:val="1"/>
+    </w:lvlOverride>
+  </w:num>
+  <w:num w:numId="16" w16cid:durableId="1410220145">
     <w:abstractNumId w:val="3"/>
     <w:lvlOverride w:ilvl="0">
       <w:startOverride w:val="1"/>

</xml_diff>

<commit_message>
Weryfikatory niepelnosprawnych: zgodnosc z enova 2512.10.12 klienta - stopien z zapisu historii (A1StopienNiepelnosprawnosciNaDzien: StopienNiepelnosp/PFRON, OkresExt) zamiast Pracownik.StopienNiepelnosprawnosciNaDzien z 2610; kompilacja 2512.10.12 0/0, Al 2610 0 bledow; docx/xlsx: zrodlo stopnia
Co-Authored-By: Claude Opus 5.5 <noreply@anthropic.com>
Claude-Session: https://claude.ai/code/session_016Sk1XN31K2XRRWhL9D8Qkd
</commit_message>
<xml_diff>
--- a/Weryfikatory czasu pracy/Instrukcja_Weryfikatory.docx
+++ b/Weryfikatory czasu pracy/Instrukcja_Weryfikatory.docx
@@ -8370,7 +8370,7 @@
         <w:rPr>
           <w:rFonts w:ascii="Calibri" w:hAnsi="Calibri" w:cs="Calibri"/>
         </w:rPr>
-        <w:t xml:space="preserve">Stopień niepełnosprawności ustalany jest dla każdego dnia osobno – z orzeczenia o niepełnosprawności (PFRON) albo o niezdolności do pracy (ZUS) obowiązującego w tym dniu; gdy obowiązują oba, brany jest wyższy stopień. Zgoda czytana jest z etatu w zapisie historii obowiązującym w danym dniu. Pracownicy ze stopniem lekkim i bez orzeczenia nie są sprawdzani.</w:t>
+        <w:t xml:space="preserve">Stopień niepełnosprawności ustalany jest dla każdego dnia osobno – z danych pracownika obowiązujących w tym dniu: stopnia niepełnosprawności z danych ubezpieczeniowych albo stopnia z danych PFRON, w okresie ich ważności; gdy wypełnione są oba, brany jest wyższy stopień. Zgoda czytana jest z etatu w zapisie historii obowiązującym w danym dniu. Pracownicy ze stopniem lekkim i bez orzeczenia nie są sprawdzani.</w:t>
       </w:r>
     </w:p>
     <w:p>
@@ -9679,7 +9679,7 @@
         <w:rPr>
           <w:rFonts w:ascii="Calibri" w:hAnsi="Calibri" w:cs="Calibri"/>
         </w:rPr>
-        <w:t xml:space="preserve">Weryfikator dotyczy każdego stopnia niepełnosprawności (lekkiego, umiarkowanego i znacznego) – pole zgody jest dostępne na etacie przy każdym orzeczeniu. Stopień niepełnosprawności ustalany jest dla każdego dnia osobno – z orzeczenia o niepełnosprawności (PFRON) albo o niezdolności do pracy (ZUS) obowiązującego w tym dniu; gdy obowiązują oba, brany jest wyższy stopień. Zgoda czytana jest z etatu w zapisie historii obowiązującym w danym dniu.</w:t>
+        <w:t xml:space="preserve">Weryfikator dotyczy każdego stopnia niepełnosprawności (lekkiego, umiarkowanego i znacznego) – pole zgody jest dostępne na etacie przy każdym orzeczeniu. Stopień niepełnosprawności ustalany jest dla każdego dnia osobno – z danych pracownika obowiązujących w tym dniu: stopnia niepełnosprawności z danych ubezpieczeniowych albo stopnia z danych PFRON, w okresie ich ważności; gdy wypełnione są oba, brany jest wyższy stopień. Zgoda czytana jest z etatu w zapisie historii obowiązującym w danym dniu.</w:t>
       </w:r>
     </w:p>
     <w:p>
@@ -10688,7 +10688,7 @@
         <w:rPr>
           <w:rFonts w:ascii="Calibri" w:hAnsi="Calibri" w:cs="Calibri"/>
         </w:rPr>
-        <w:t xml:space="preserve">Stopień, zgoda i pora nocna ustalane są tak samo jak w weryfikatorze „A1_Brak zgody na pracę w nocy (plan)”: każdy stopień niepełnosprawności, orzeczenie PFRON albo ZUS obowiązujące w dniu, pora nocna z kalendarza etatu. Sprawdzane są strefy wliczane do czasu pracy (np. „Praca w normie”, „Praca poza normą”) oraz strefa „Praca w godzinach nocnych”.</w:t>
+        <w:t xml:space="preserve">Stopień, zgoda i pora nocna ustalane są tak samo jak w weryfikatorze „A1_Brak zgody na pracę w nocy (plan)”: każdy stopień niepełnosprawności, stopień z danych ubezpieczeniowych albo PFRON obowiązujących w dniu, pora nocna z kalendarza etatu. Sprawdzane są strefy wliczane do czasu pracy (np. „Praca w normie”, „Praca poza normą”) oraz strefa „Praca w godzinach nocnych”.</w:t>
       </w:r>
     </w:p>
     <w:p>
@@ -11378,7 +11378,7 @@
         <w:rPr>
           <w:rFonts w:ascii="Calibri" w:hAnsi="Calibri" w:cs="Calibri"/>
         </w:rPr>
-        <w:t xml:space="preserve">Weryfikator dotyczy każdego stopnia niepełnosprawności. Stopień niepełnosprawności ustalany jest dla każdego dnia osobno – z orzeczenia o niepełnosprawności (PFRON) albo o niezdolności do pracy (ZUS) obowiązującego w tym dniu; gdy obowiązują oba, brany jest wyższy stopień. Zgoda czytana jest z etatu w zapisie historii obowiązującym w danym dniu.</w:t>
+        <w:t xml:space="preserve">Weryfikator dotyczy każdego stopnia niepełnosprawności. Stopień niepełnosprawności ustalany jest dla każdego dnia osobno – z danych pracownika obowiązujących w tym dniu: stopnia niepełnosprawności z danych ubezpieczeniowych albo stopnia z danych PFRON, w okresie ich ważności; gdy wypełnione są oba, brany jest wyższy stopień. Zgoda czytana jest z etatu w zapisie historii obowiązującym w danym dniu.</w:t>
       </w:r>
     </w:p>
     <w:p>
@@ -12355,7 +12355,7 @@
         <w:rPr>
           <w:rFonts w:ascii="Calibri" w:hAnsi="Calibri" w:cs="Calibri"/>
         </w:rPr>
-        <w:t xml:space="preserve">Stopień niepełnosprawności ustalany jest dla każdego dnia osobno – z orzeczenia o niepełnosprawności (PFRON) albo o niezdolności do pracy (ZUS) obowiązującego w tym dniu; gdy obowiązują oba, brany jest wyższy stopień. Zgoda czytana jest z etatu w zapisie historii obowiązującym w danym dniu. Pracownicy bez orzeczenia nie są sprawdzani.</w:t>
+        <w:t xml:space="preserve">Stopień niepełnosprawności ustalany jest dla każdego dnia osobno – z danych pracownika obowiązujących w tym dniu: stopnia niepełnosprawności z danych ubezpieczeniowych albo stopnia z danych PFRON, w okresie ich ważności; gdy wypełnione są oba, brany jest wyższy stopień. Zgoda czytana jest z etatu w zapisie historii obowiązującym w danym dniu. Pracownicy bez orzeczenia nie są sprawdzani.</w:t>
       </w:r>
     </w:p>
     <w:p>

</xml_diff>